<commit_message>
Rewrite FDE résumé for real-world projects; add PNG preview
- Job target line in English; internship bullets restructured as
  background / responsibilities / delivery for the FDE role
- Replace synthetic-data demos with real-scenario projects: a Guangxi
  offline store launch (no name, budget or figures), Converge (official
  TikTok TechJam task and evaluator) and WealthGuard (official filings)
- Ship PDF, Word and a PNG preview

Co-Authored-By: Claude Opus 5.5 <noreply@anthropic.com>
Claude-Session: https://claude.ai/code/session_01Wy6QccTAXhM16qGGvDf8g9
</commit_message>
<xml_diff>
--- a/resume/fde/邹志华_FDE简历.docx
+++ b/resume/fde/邹志华_FDE简历.docx
@@ -79,7 +79,7 @@
           <w:sz w:val="19"/>
           <w:szCs w:val="19"/>
         </w:rPr>
-        <w:t xml:space="preserve">求职意向：前线部署工程师（FDE）</w:t>
+        <w:t xml:space="preserve">Job Target: Forward Deployed Engineer (FDE)</w:t>
       </w:r>
       <w:r>
         <w:rPr>
@@ -105,7 +105,7 @@
           <w:sz w:val="19"/>
           <w:szCs w:val="19"/>
         </w:rPr>
-        <w:t xml:space="preserve">AI 解决方案与交付</w:t>
+        <w:t xml:space="preserve">AI Solutions &amp; Delivery</w:t>
       </w:r>
     </w:p>
     <w:p>
@@ -323,7 +323,7 @@
         </w:rPr>
         <w:t xml:space="preserve"> </w:t>
       </w:r>
-      <w:hyperlink w:history="1" r:id="rIdxsv6eiykcc3r90sx6lrhv">
+      <w:hyperlink w:history="1" r:id="rId5xpfx1uyjbdjg3ufiw6if">
         <w:r>
           <w:rPr>
             <w:rFonts w:ascii="Times New Roman" w:cs="Times New Roman" w:eastAsia="Microsoft YaHei" w:hAnsi="Times New Roman"/>
@@ -349,33 +349,7 @@
           <w:sz w:val="19"/>
           <w:szCs w:val="19"/>
         </w:rPr>
-        <w:t xml:space="preserve">（开源项目附可运行代码、测试与评测脚本 </w:t>
-      </w:r>
-      <w:r>
-        <w:rPr>
-          <w:rFonts w:ascii="Times New Roman" w:cs="Times New Roman" w:eastAsia="Times New Roman" w:hAnsi="Times New Roman"/>
-          <w:b w:val="false"/>
-          <w:bCs w:val="false"/>
-          <w:i w:val="false"/>
-          <w:iCs w:val="false"/>
-          <w:color w:val="151515"/>
-          <w:sz w:val="19"/>
-          <w:szCs w:val="19"/>
-        </w:rPr>
-        <w:t xml:space="preserve">·</w:t>
-      </w:r>
-      <w:r>
-        <w:rPr>
-          <w:rFonts w:ascii="Times New Roman" w:cs="Times New Roman" w:eastAsia="Microsoft YaHei" w:hAnsi="Times New Roman"/>
-          <w:b w:val="false"/>
-          <w:bCs w:val="false"/>
-          <w:i w:val="false"/>
-          <w:iCs w:val="false"/>
-          <w:color w:val="151515"/>
-          <w:sz w:val="19"/>
-          <w:szCs w:val="19"/>
-        </w:rPr>
-        <w:t xml:space="preserve"> 产品报告与产品目录见 /evidence）</w:t>
+        <w:t xml:space="preserve">（项目代码、评测结果与产品报告见仓库及 /evidence）</w:t>
       </w:r>
     </w:p>
     <w:p>
@@ -1142,7 +1116,7 @@
           <w:sz w:val="20"/>
           <w:szCs w:val="20"/>
         </w:rPr>
-        <w:t xml:space="preserve">复杂业务规则落地</w:t>
+        <w:t xml:space="preserve">跨境业务规则落地</w:t>
       </w:r>
       <w:r>
         <w:rPr>
@@ -1168,7 +1142,7 @@
           <w:sz w:val="20"/>
           <w:szCs w:val="20"/>
         </w:rPr>
-        <w:t xml:space="preserve">三方访谈 </w:t>
+        <w:t xml:space="preserve">业务访谈 </w:t>
       </w:r>
       <w:r>
         <w:rPr>
@@ -1194,7 +1168,7 @@
           <w:sz w:val="20"/>
           <w:szCs w:val="20"/>
         </w:rPr>
-        <w:t xml:space="preserve"> 规则拆解 </w:t>
+        <w:t xml:space="preserve"> 需求拆解 </w:t>
       </w:r>
       <w:r>
         <w:rPr>
@@ -1246,7 +1220,7 @@
           <w:sz w:val="20"/>
           <w:szCs w:val="20"/>
         </w:rPr>
-        <w:t xml:space="preserve"> Bad Case 回流</w:t>
+        <w:t xml:space="preserve"> Bad Case 闭环</w:t>
       </w:r>
     </w:p>
     <w:p>
@@ -1269,20 +1243,20 @@
           <w:sz w:val="19"/>
           <w:szCs w:val="19"/>
         </w:rPr>
-        <w:t xml:space="preserve">痛点：</w:t>
-      </w:r>
-      <w:r>
-        <w:rPr>
-          <w:rFonts w:ascii="Times New Roman" w:cs="Times New Roman" w:eastAsia="Microsoft YaHei" w:hAnsi="Times New Roman"/>
-          <w:b w:val="false"/>
-          <w:bCs w:val="false"/>
-          <w:i w:val="false"/>
-          <w:iCs w:val="false"/>
-          <w:color w:val="151515"/>
-          <w:sz w:val="19"/>
-          <w:szCs w:val="19"/>
-        </w:rPr>
-        <w:t xml:space="preserve">跨境业务规则复杂、异常处置无统一流程、各市场数据口径不一，导致需求反复、验收拖延。</w:t>
+        <w:t xml:space="preserve">背景与目标：</w:t>
+      </w:r>
+      <w:r>
+        <w:rPr>
+          <w:rFonts w:ascii="Times New Roman" w:cs="Times New Roman" w:eastAsia="Microsoft YaHei" w:hAnsi="Times New Roman"/>
+          <w:b w:val="false"/>
+          <w:bCs w:val="false"/>
+          <w:i w:val="false"/>
+          <w:iCs w:val="false"/>
+          <w:color w:val="151515"/>
+          <w:sz w:val="19"/>
+          <w:szCs w:val="19"/>
+        </w:rPr>
+        <w:t xml:space="preserve">跨境规则复杂、异常处置无统一流程、各市场口径不一，需求反复；目标是把专家经验变成可验收的规则。</w:t>
       </w:r>
     </w:p>
     <w:p>
@@ -1305,46 +1279,46 @@
           <w:sz w:val="19"/>
           <w:szCs w:val="19"/>
         </w:rPr>
-        <w:t xml:space="preserve">我做了什么：</w:t>
-      </w:r>
-      <w:r>
-        <w:rPr>
-          <w:rFonts w:ascii="Times New Roman" w:cs="Times New Roman" w:eastAsia="Microsoft YaHei" w:hAnsi="Times New Roman"/>
-          <w:b w:val="false"/>
-          <w:bCs w:val="false"/>
-          <w:i w:val="false"/>
-          <w:iCs w:val="false"/>
-          <w:color w:val="151515"/>
-          <w:sz w:val="19"/>
-          <w:szCs w:val="19"/>
-        </w:rPr>
-        <w:t xml:space="preserve">访谈业务、合规与研发，把专家经验拆成</w:t>
-      </w:r>
-      <w:r>
-        <w:rPr>
-          <w:rFonts w:ascii="Times New Roman" w:cs="Times New Roman" w:eastAsia="Microsoft YaHei" w:hAnsi="Times New Roman"/>
-          <w:b/>
-          <w:bCs/>
-          <w:i w:val="false"/>
-          <w:iCs w:val="false"/>
-          <w:color w:val="151515"/>
-          <w:sz w:val="19"/>
-          <w:szCs w:val="19"/>
-        </w:rPr>
-        <w:t xml:space="preserve">合约逻辑、API、对账、分账、异常处置 5 类可开发需求</w:t>
-      </w:r>
-      <w:r>
-        <w:rPr>
-          <w:rFonts w:ascii="Times New Roman" w:cs="Times New Roman" w:eastAsia="Microsoft YaHei" w:hAnsi="Times New Roman"/>
-          <w:b w:val="false"/>
-          <w:bCs w:val="false"/>
-          <w:i w:val="false"/>
-          <w:iCs w:val="false"/>
-          <w:color w:val="151515"/>
-          <w:sz w:val="19"/>
-          <w:szCs w:val="19"/>
-        </w:rPr>
-        <w:t xml:space="preserve">，写清流程、规则边界与验收口径；参与评审与联调。</w:t>
+        <w:t xml:space="preserve">我的职责：</w:t>
+      </w:r>
+      <w:r>
+        <w:rPr>
+          <w:rFonts w:ascii="Times New Roman" w:cs="Times New Roman" w:eastAsia="Microsoft YaHei" w:hAnsi="Times New Roman"/>
+          <w:b w:val="false"/>
+          <w:bCs w:val="false"/>
+          <w:i w:val="false"/>
+          <w:iCs w:val="false"/>
+          <w:color w:val="151515"/>
+          <w:sz w:val="19"/>
+          <w:szCs w:val="19"/>
+        </w:rPr>
+        <w:t xml:space="preserve">访谈业务、合规、研发三方，把规则拆成</w:t>
+      </w:r>
+      <w:r>
+        <w:rPr>
+          <w:rFonts w:ascii="Times New Roman" w:cs="Times New Roman" w:eastAsia="Microsoft YaHei" w:hAnsi="Times New Roman"/>
+          <w:b/>
+          <w:bCs/>
+          <w:i w:val="false"/>
+          <w:iCs w:val="false"/>
+          <w:color w:val="151515"/>
+          <w:sz w:val="19"/>
+          <w:szCs w:val="19"/>
+        </w:rPr>
+        <w:t xml:space="preserve">合约逻辑、API、对账、分账、异常处置 5 类需求</w:t>
+      </w:r>
+      <w:r>
+        <w:rPr>
+          <w:rFonts w:ascii="Times New Roman" w:cs="Times New Roman" w:eastAsia="Microsoft YaHei" w:hAnsi="Times New Roman"/>
+          <w:b w:val="false"/>
+          <w:bCs w:val="false"/>
+          <w:i w:val="false"/>
+          <w:iCs w:val="false"/>
+          <w:color w:val="151515"/>
+          <w:sz w:val="19"/>
+          <w:szCs w:val="19"/>
+        </w:rPr>
+        <w:t xml:space="preserve">，写清流程、规则边界与验收口径，跟进评审与联调。</w:t>
       </w:r>
     </w:p>
     <w:p>
@@ -1367,7 +1341,7 @@
           <w:sz w:val="19"/>
           <w:szCs w:val="19"/>
         </w:rPr>
-        <w:t xml:space="preserve">迭代与结果：</w:t>
+        <w:t xml:space="preserve">交付与结果：</w:t>
       </w:r>
       <w:r>
         <w:rPr>
@@ -1406,7 +1380,7 @@
           <w:sz w:val="19"/>
           <w:szCs w:val="19"/>
         </w:rPr>
-        <w:t xml:space="preserve">，按根因回流需求，推动跨市场数据口径统一；按用户价值、合规风险与开发成本评估 AI 风控方案，给出自研/外采与分阶段落地建议。</w:t>
+        <w:t xml:space="preserve">，按根因回流需求、统一跨市场数据口径；按用户价值、合规风险与开发成本评估 AI 风控方案，给出自研/外采与分阶段落地建议。</w:t>
       </w:r>
     </w:p>
     <w:p>
@@ -1592,7 +1566,7 @@
           <w:sz w:val="20"/>
           <w:szCs w:val="20"/>
         </w:rPr>
-        <w:t xml:space="preserve">AI 应用落地可行性研判</w:t>
+        <w:t xml:space="preserve">AI 应用落地评估</w:t>
       </w:r>
       <w:r>
         <w:rPr>
@@ -1618,7 +1592,7 @@
           <w:sz w:val="20"/>
           <w:szCs w:val="20"/>
         </w:rPr>
-        <w:t xml:space="preserve">场景痛点 </w:t>
+        <w:t xml:space="preserve">客户场景拆解 </w:t>
       </w:r>
       <w:r>
         <w:rPr>
@@ -1631,7 +1605,7 @@
           <w:sz w:val="20"/>
           <w:szCs w:val="20"/>
         </w:rPr>
-        <w:t xml:space="preserve">×</w:t>
+        <w:t xml:space="preserve">→</w:t>
       </w:r>
       <w:r>
         <w:rPr>
@@ -1644,7 +1618,7 @@
           <w:sz w:val="20"/>
           <w:szCs w:val="20"/>
         </w:rPr>
-        <w:t xml:space="preserve"> AI 增量 </w:t>
+        <w:t xml:space="preserve"> 交付与定价验证 </w:t>
       </w:r>
       <w:r>
         <w:rPr>
@@ -1657,7 +1631,7 @@
           <w:sz w:val="20"/>
           <w:szCs w:val="20"/>
         </w:rPr>
-        <w:t xml:space="preserve">×</w:t>
+        <w:t xml:space="preserve">→</w:t>
       </w:r>
       <w:r>
         <w:rPr>
@@ -1670,7 +1644,7 @@
           <w:sz w:val="20"/>
           <w:szCs w:val="20"/>
         </w:rPr>
-        <w:t xml:space="preserve"> 交付与定价</w:t>
+        <w:t xml:space="preserve"> 证据核验流程</w:t>
       </w:r>
     </w:p>
     <w:p>
@@ -1693,150 +1667,20 @@
           <w:sz w:val="19"/>
           <w:szCs w:val="19"/>
         </w:rPr>
-        <w:t xml:space="preserve">我做了什么：</w:t>
-      </w:r>
-      <w:r>
-        <w:rPr>
-          <w:rFonts w:ascii="Times New Roman" w:cs="Times New Roman" w:eastAsia="Microsoft YaHei" w:hAnsi="Times New Roman"/>
-          <w:b w:val="false"/>
-          <w:bCs w:val="false"/>
-          <w:i w:val="false"/>
-          <w:iCs w:val="false"/>
-          <w:color w:val="151515"/>
-          <w:sz w:val="19"/>
-          <w:szCs w:val="19"/>
-        </w:rPr>
-        <w:t xml:space="preserve">用</w:t>
-      </w:r>
-      <w:r>
-        <w:rPr>
-          <w:rFonts w:ascii="Times New Roman" w:cs="Times New Roman" w:eastAsia="Times New Roman" w:hAnsi="Times New Roman"/>
-          <w:b w:val="false"/>
-          <w:bCs w:val="false"/>
-          <w:i w:val="false"/>
-          <w:iCs w:val="false"/>
-          <w:color w:val="151515"/>
-          <w:sz w:val="19"/>
-          <w:szCs w:val="19"/>
-        </w:rPr>
-        <w:t xml:space="preserve">“</w:t>
-      </w:r>
-      <w:r>
-        <w:rPr>
-          <w:rFonts w:ascii="Times New Roman" w:cs="Times New Roman" w:eastAsia="Microsoft YaHei" w:hAnsi="Times New Roman"/>
-          <w:b w:val="false"/>
-          <w:bCs w:val="false"/>
-          <w:i w:val="false"/>
-          <w:iCs w:val="false"/>
-          <w:color w:val="151515"/>
-          <w:sz w:val="19"/>
-          <w:szCs w:val="19"/>
-        </w:rPr>
-        <w:t xml:space="preserve">现有解法 </w:t>
-      </w:r>
-      <w:r>
-        <w:rPr>
-          <w:rFonts w:ascii="Times New Roman" w:cs="Times New Roman" w:eastAsia="Times New Roman" w:hAnsi="Times New Roman"/>
-          <w:b w:val="false"/>
-          <w:bCs w:val="false"/>
-          <w:i w:val="false"/>
-          <w:iCs w:val="false"/>
-          <w:color w:val="151515"/>
-          <w:sz w:val="19"/>
-          <w:szCs w:val="19"/>
-        </w:rPr>
-        <w:t xml:space="preserve">—</w:t>
-      </w:r>
-      <w:r>
-        <w:rPr>
-          <w:rFonts w:ascii="Times New Roman" w:cs="Times New Roman" w:eastAsia="Microsoft YaHei" w:hAnsi="Times New Roman"/>
-          <w:b w:val="false"/>
-          <w:bCs w:val="false"/>
-          <w:i w:val="false"/>
-          <w:iCs w:val="false"/>
-          <w:color w:val="151515"/>
-          <w:sz w:val="19"/>
-          <w:szCs w:val="19"/>
-        </w:rPr>
-        <w:t xml:space="preserve"> AI 增量 </w:t>
-      </w:r>
-      <w:r>
-        <w:rPr>
-          <w:rFonts w:ascii="Times New Roman" w:cs="Times New Roman" w:eastAsia="Times New Roman" w:hAnsi="Times New Roman"/>
-          <w:b w:val="false"/>
-          <w:bCs w:val="false"/>
-          <w:i w:val="false"/>
-          <w:iCs w:val="false"/>
-          <w:color w:val="151515"/>
-          <w:sz w:val="19"/>
-          <w:szCs w:val="19"/>
-        </w:rPr>
-        <w:t xml:space="preserve">—</w:t>
-      </w:r>
-      <w:r>
-        <w:rPr>
-          <w:rFonts w:ascii="Times New Roman" w:cs="Times New Roman" w:eastAsia="Microsoft YaHei" w:hAnsi="Times New Roman"/>
-          <w:b w:val="false"/>
-          <w:bCs w:val="false"/>
-          <w:i w:val="false"/>
-          <w:iCs w:val="false"/>
-          <w:color w:val="151515"/>
-          <w:sz w:val="19"/>
-          <w:szCs w:val="19"/>
-        </w:rPr>
-        <w:t xml:space="preserve"> 可定价性</w:t>
-      </w:r>
-      <w:r>
-        <w:rPr>
-          <w:rFonts w:ascii="Times New Roman" w:cs="Times New Roman" w:eastAsia="Times New Roman" w:hAnsi="Times New Roman"/>
-          <w:b w:val="false"/>
-          <w:bCs w:val="false"/>
-          <w:i w:val="false"/>
-          <w:iCs w:val="false"/>
-          <w:color w:val="151515"/>
-          <w:sz w:val="19"/>
-          <w:szCs w:val="19"/>
-        </w:rPr>
-        <w:t xml:space="preserve">”</w:t>
-      </w:r>
-      <w:r>
-        <w:rPr>
-          <w:rFonts w:ascii="Times New Roman" w:cs="Times New Roman" w:eastAsia="Microsoft YaHei" w:hAnsi="Times New Roman"/>
-          <w:b w:val="false"/>
-          <w:bCs w:val="false"/>
-          <w:i w:val="false"/>
-          <w:iCs w:val="false"/>
-          <w:color w:val="151515"/>
-          <w:sz w:val="19"/>
-          <w:szCs w:val="19"/>
-        </w:rPr>
-        <w:t xml:space="preserve">拆解 AI 应用赛道，</w:t>
-      </w:r>
-      <w:r>
-        <w:rPr>
-          <w:rFonts w:ascii="Times New Roman" w:cs="Times New Roman" w:eastAsia="Microsoft YaHei" w:hAnsi="Times New Roman"/>
-          <w:b/>
-          <w:bCs/>
-          <w:i w:val="false"/>
-          <w:iCs w:val="false"/>
-          <w:color w:val="151515"/>
-          <w:sz w:val="19"/>
-          <w:szCs w:val="19"/>
-        </w:rPr>
-        <w:t xml:space="preserve">每周更新 AI 赛道地图</w:t>
-      </w:r>
-      <w:r>
-        <w:rPr>
-          <w:rFonts w:ascii="Times New Roman" w:cs="Times New Roman" w:eastAsia="Microsoft YaHei" w:hAnsi="Times New Roman"/>
-          <w:b w:val="false"/>
-          <w:bCs w:val="false"/>
-          <w:i w:val="false"/>
-          <w:iCs w:val="false"/>
-          <w:color w:val="151515"/>
-          <w:sz w:val="19"/>
-          <w:szCs w:val="19"/>
-        </w:rPr>
-        <w:t xml:space="preserve">；围绕功能边界、交付方式与定价建竞品矩阵，用客户结构与续费信号交叉验证，区分客户真正买单的 AI 能力和套壳功能。</w:t>
+        <w:t xml:space="preserve">背景与目标：</w:t>
+      </w:r>
+      <w:r>
+        <w:rPr>
+          <w:rFonts w:ascii="Times New Roman" w:cs="Times New Roman" w:eastAsia="Microsoft YaHei" w:hAnsi="Times New Roman"/>
+          <w:b w:val="false"/>
+          <w:bCs w:val="false"/>
+          <w:i w:val="false"/>
+          <w:iCs w:val="false"/>
+          <w:color w:val="151515"/>
+          <w:sz w:val="19"/>
+          <w:szCs w:val="19"/>
+        </w:rPr>
+        <w:t xml:space="preserve">AI 应用公司同质化严重，难判断哪些能在客户侧落地并持续付费；目标是找出可交付、可定价的 AI 增量。</w:t>
       </w:r>
     </w:p>
     <w:p>
@@ -1859,7 +1703,173 @@
           <w:sz w:val="19"/>
           <w:szCs w:val="19"/>
         </w:rPr>
-        <w:t xml:space="preserve">方法产品化：</w:t>
+        <w:t xml:space="preserve">我的职责：</w:t>
+      </w:r>
+      <w:r>
+        <w:rPr>
+          <w:rFonts w:ascii="Times New Roman" w:cs="Times New Roman" w:eastAsia="Microsoft YaHei" w:hAnsi="Times New Roman"/>
+          <w:b w:val="false"/>
+          <w:bCs w:val="false"/>
+          <w:i w:val="false"/>
+          <w:iCs w:val="false"/>
+          <w:color w:val="151515"/>
+          <w:sz w:val="19"/>
+          <w:szCs w:val="19"/>
+        </w:rPr>
+        <w:t xml:space="preserve">用</w:t>
+      </w:r>
+      <w:r>
+        <w:rPr>
+          <w:rFonts w:ascii="Times New Roman" w:cs="Times New Roman" w:eastAsia="Times New Roman" w:hAnsi="Times New Roman"/>
+          <w:b w:val="false"/>
+          <w:bCs w:val="false"/>
+          <w:i w:val="false"/>
+          <w:iCs w:val="false"/>
+          <w:color w:val="151515"/>
+          <w:sz w:val="19"/>
+          <w:szCs w:val="19"/>
+        </w:rPr>
+        <w:t xml:space="preserve">“</w:t>
+      </w:r>
+      <w:r>
+        <w:rPr>
+          <w:rFonts w:ascii="Times New Roman" w:cs="Times New Roman" w:eastAsia="Microsoft YaHei" w:hAnsi="Times New Roman"/>
+          <w:b w:val="false"/>
+          <w:bCs w:val="false"/>
+          <w:i w:val="false"/>
+          <w:iCs w:val="false"/>
+          <w:color w:val="151515"/>
+          <w:sz w:val="19"/>
+          <w:szCs w:val="19"/>
+        </w:rPr>
+        <w:t xml:space="preserve">现有解法 </w:t>
+      </w:r>
+      <w:r>
+        <w:rPr>
+          <w:rFonts w:ascii="Times New Roman" w:cs="Times New Roman" w:eastAsia="Times New Roman" w:hAnsi="Times New Roman"/>
+          <w:b w:val="false"/>
+          <w:bCs w:val="false"/>
+          <w:i w:val="false"/>
+          <w:iCs w:val="false"/>
+          <w:color w:val="151515"/>
+          <w:sz w:val="19"/>
+          <w:szCs w:val="19"/>
+        </w:rPr>
+        <w:t xml:space="preserve">—</w:t>
+      </w:r>
+      <w:r>
+        <w:rPr>
+          <w:rFonts w:ascii="Times New Roman" w:cs="Times New Roman" w:eastAsia="Microsoft YaHei" w:hAnsi="Times New Roman"/>
+          <w:b w:val="false"/>
+          <w:bCs w:val="false"/>
+          <w:i w:val="false"/>
+          <w:iCs w:val="false"/>
+          <w:color w:val="151515"/>
+          <w:sz w:val="19"/>
+          <w:szCs w:val="19"/>
+        </w:rPr>
+        <w:t xml:space="preserve"> AI 增量 </w:t>
+      </w:r>
+      <w:r>
+        <w:rPr>
+          <w:rFonts w:ascii="Times New Roman" w:cs="Times New Roman" w:eastAsia="Times New Roman" w:hAnsi="Times New Roman"/>
+          <w:b w:val="false"/>
+          <w:bCs w:val="false"/>
+          <w:i w:val="false"/>
+          <w:iCs w:val="false"/>
+          <w:color w:val="151515"/>
+          <w:sz w:val="19"/>
+          <w:szCs w:val="19"/>
+        </w:rPr>
+        <w:t xml:space="preserve">—</w:t>
+      </w:r>
+      <w:r>
+        <w:rPr>
+          <w:rFonts w:ascii="Times New Roman" w:cs="Times New Roman" w:eastAsia="Microsoft YaHei" w:hAnsi="Times New Roman"/>
+          <w:b w:val="false"/>
+          <w:bCs w:val="false"/>
+          <w:i w:val="false"/>
+          <w:iCs w:val="false"/>
+          <w:color w:val="151515"/>
+          <w:sz w:val="19"/>
+          <w:szCs w:val="19"/>
+        </w:rPr>
+        <w:t xml:space="preserve"> 可定价性</w:t>
+      </w:r>
+      <w:r>
+        <w:rPr>
+          <w:rFonts w:ascii="Times New Roman" w:cs="Times New Roman" w:eastAsia="Times New Roman" w:hAnsi="Times New Roman"/>
+          <w:b w:val="false"/>
+          <w:bCs w:val="false"/>
+          <w:i w:val="false"/>
+          <w:iCs w:val="false"/>
+          <w:color w:val="151515"/>
+          <w:sz w:val="19"/>
+          <w:szCs w:val="19"/>
+        </w:rPr>
+        <w:t xml:space="preserve">”</w:t>
+      </w:r>
+      <w:r>
+        <w:rPr>
+          <w:rFonts w:ascii="Times New Roman" w:cs="Times New Roman" w:eastAsia="Microsoft YaHei" w:hAnsi="Times New Roman"/>
+          <w:b w:val="false"/>
+          <w:bCs w:val="false"/>
+          <w:i w:val="false"/>
+          <w:iCs w:val="false"/>
+          <w:color w:val="151515"/>
+          <w:sz w:val="19"/>
+          <w:szCs w:val="19"/>
+        </w:rPr>
+        <w:t xml:space="preserve">拆解客户场景，</w:t>
+      </w:r>
+      <w:r>
+        <w:rPr>
+          <w:rFonts w:ascii="Times New Roman" w:cs="Times New Roman" w:eastAsia="Microsoft YaHei" w:hAnsi="Times New Roman"/>
+          <w:b/>
+          <w:bCs/>
+          <w:i w:val="false"/>
+          <w:iCs w:val="false"/>
+          <w:color w:val="151515"/>
+          <w:sz w:val="19"/>
+          <w:szCs w:val="19"/>
+        </w:rPr>
+        <w:t xml:space="preserve">每周更新 AI 赛道地图</w:t>
+      </w:r>
+      <w:r>
+        <w:rPr>
+          <w:rFonts w:ascii="Times New Roman" w:cs="Times New Roman" w:eastAsia="Microsoft YaHei" w:hAnsi="Times New Roman"/>
+          <w:b w:val="false"/>
+          <w:bCs w:val="false"/>
+          <w:i w:val="false"/>
+          <w:iCs w:val="false"/>
+          <w:color w:val="151515"/>
+          <w:sz w:val="19"/>
+          <w:szCs w:val="19"/>
+        </w:rPr>
+        <w:t xml:space="preserve">；围绕功能边界、交付方式与定价建竞品矩阵，用客户结构与续费信号交叉验证。</w:t>
+      </w:r>
+    </w:p>
+    <w:p>
+      <w:pPr>
+        <w:pStyle w:val="ListParagraph"/>
+        <w:numPr>
+          <w:ilvl w:val="0"/>
+          <w:numId w:val="2"/>
+        </w:numPr>
+        <w:spacing w:line="240" w:lineRule="exact"/>
+      </w:pPr>
+      <w:r>
+        <w:rPr>
+          <w:rFonts w:ascii="Times New Roman" w:cs="Times New Roman" w:eastAsia="Microsoft YaHei" w:hAnsi="Times New Roman"/>
+          <w:b/>
+          <w:bCs/>
+          <w:i w:val="false"/>
+          <w:iCs w:val="false"/>
+          <w:color w:val="151515"/>
+          <w:sz w:val="19"/>
+          <w:szCs w:val="19"/>
+        </w:rPr>
+        <w:t xml:space="preserve">交付与结果：</w:t>
       </w:r>
       <w:r>
         <w:rPr>
@@ -1937,7 +1947,7 @@
           <w:sz w:val="19"/>
           <w:szCs w:val="19"/>
         </w:rPr>
-        <w:t xml:space="preserve">：计算与判定交给确定性代码，越界拒答压低幻觉。</w:t>
+        <w:t xml:space="preserve">，计算交给确定性代码、越界拒答压低幻觉。</w:t>
       </w:r>
     </w:p>
     <w:p>
@@ -2224,20 +2234,20 @@
           <w:sz w:val="19"/>
           <w:szCs w:val="19"/>
         </w:rPr>
-        <w:t xml:space="preserve">我做了什么：</w:t>
-      </w:r>
-      <w:r>
-        <w:rPr>
-          <w:rFonts w:ascii="Times New Roman" w:cs="Times New Roman" w:eastAsia="Microsoft YaHei" w:hAnsi="Times New Roman"/>
-          <w:b w:val="false"/>
-          <w:bCs w:val="false"/>
-          <w:i w:val="false"/>
-          <w:iCs w:val="false"/>
-          <w:color w:val="151515"/>
-          <w:sz w:val="19"/>
-          <w:szCs w:val="19"/>
-        </w:rPr>
-        <w:t xml:space="preserve">触达约 </w:t>
+        <w:t xml:space="preserve">我的职责：</w:t>
+      </w:r>
+      <w:r>
+        <w:rPr>
+          <w:rFonts w:ascii="Times New Roman" w:cs="Times New Roman" w:eastAsia="Microsoft YaHei" w:hAnsi="Times New Roman"/>
+          <w:b w:val="false"/>
+          <w:bCs w:val="false"/>
+          <w:i w:val="false"/>
+          <w:iCs w:val="false"/>
+          <w:color w:val="151515"/>
+          <w:sz w:val="19"/>
+          <w:szCs w:val="19"/>
+        </w:rPr>
+        <w:t xml:space="preserve">访谈约 </w:t>
       </w:r>
       <w:r>
         <w:rPr>
@@ -2263,33 +2273,7 @@
           <w:sz w:val="19"/>
           <w:szCs w:val="19"/>
         </w:rPr>
-        <w:t xml:space="preserve">，按场景真实性、付费强度、AI 必要性、数据壁垒与团队能力两层筛选，</w:t>
-      </w:r>
-      <w:r>
-        <w:rPr>
-          <w:rFonts w:ascii="Times New Roman" w:cs="Times New Roman" w:eastAsia="Microsoft YaHei" w:hAnsi="Times New Roman"/>
-          <w:b/>
-          <w:bCs/>
-          <w:i w:val="false"/>
-          <w:iCs w:val="false"/>
-          <w:color w:val="151515"/>
-          <w:sz w:val="19"/>
-          <w:szCs w:val="19"/>
-        </w:rPr>
-        <w:t xml:space="preserve">推荐 20 个团队</w:t>
-      </w:r>
-      <w:r>
-        <w:rPr>
-          <w:rFonts w:ascii="Times New Roman" w:cs="Times New Roman" w:eastAsia="Microsoft YaHei" w:hAnsi="Times New Roman"/>
-          <w:b w:val="false"/>
-          <w:bCs w:val="false"/>
-          <w:i w:val="false"/>
-          <w:iCs w:val="false"/>
-          <w:color w:val="151515"/>
-          <w:sz w:val="19"/>
-          <w:szCs w:val="19"/>
-        </w:rPr>
-        <w:t xml:space="preserve">；每项判断回链访谈原话，可复盘。</w:t>
+        <w:t xml:space="preserve">，按场景真实性、付费强度、AI 必要性、数据壁垒与团队能力两层筛选，判断回链访谈原话。</w:t>
       </w:r>
     </w:p>
     <w:p>
@@ -2312,20 +2296,33 @@
           <w:sz w:val="19"/>
           <w:szCs w:val="19"/>
         </w:rPr>
-        <w:t xml:space="preserve">方法沉淀：</w:t>
-      </w:r>
-      <w:r>
-        <w:rPr>
-          <w:rFonts w:ascii="Times New Roman" w:cs="Times New Roman" w:eastAsia="Microsoft YaHei" w:hAnsi="Times New Roman"/>
-          <w:b w:val="false"/>
-          <w:bCs w:val="false"/>
-          <w:i w:val="false"/>
-          <w:iCs w:val="false"/>
-          <w:color w:val="151515"/>
-          <w:sz w:val="19"/>
-          <w:szCs w:val="19"/>
-        </w:rPr>
-        <w:t xml:space="preserve">用 LLM 从访谈转写抽取证据、结构化打分，系统只建议、人工拍板；后续沉淀为开源工具 Scout Screener。</w:t>
+        <w:t xml:space="preserve">交付与结果：</w:t>
+      </w:r>
+      <w:r>
+        <w:rPr>
+          <w:rFonts w:ascii="Times New Roman" w:cs="Times New Roman" w:eastAsia="Microsoft YaHei" w:hAnsi="Times New Roman"/>
+          <w:b/>
+          <w:bCs/>
+          <w:i w:val="false"/>
+          <w:iCs w:val="false"/>
+          <w:color w:val="151515"/>
+          <w:sz w:val="19"/>
+          <w:szCs w:val="19"/>
+        </w:rPr>
+        <w:t xml:space="preserve">推荐 20 个团队</w:t>
+      </w:r>
+      <w:r>
+        <w:rPr>
+          <w:rFonts w:ascii="Times New Roman" w:cs="Times New Roman" w:eastAsia="Microsoft YaHei" w:hAnsi="Times New Roman"/>
+          <w:b w:val="false"/>
+          <w:bCs w:val="false"/>
+          <w:i w:val="false"/>
+          <w:iCs w:val="false"/>
+          <w:color w:val="151515"/>
+          <w:sz w:val="19"/>
+          <w:szCs w:val="19"/>
+        </w:rPr>
+        <w:t xml:space="preserve">；用 LLM 抽取访谈证据、结构化打分，系统只建议、人工拍板，后沉淀为工具 Scout Screener。</w:t>
       </w:r>
     </w:p>
     <w:p>
@@ -2612,7 +2609,7 @@
           <w:sz w:val="19"/>
           <w:szCs w:val="19"/>
         </w:rPr>
-        <w:t xml:space="preserve">我做了什么：</w:t>
+        <w:t xml:space="preserve">我的职责：</w:t>
       </w:r>
       <w:r>
         <w:rPr>
@@ -2787,7 +2784,7 @@
           <w:sz w:val="29"/>
           <w:szCs w:val="29"/>
         </w:rPr>
-        <w:t xml:space="preserve">AI Startup &amp; 开源项目</w:t>
+        <w:t xml:space="preserve">AI Startup &amp; 真实场景项目</w:t>
       </w:r>
     </w:p>
     <w:p>
@@ -2944,7 +2941,7 @@
         </w:rPr>
         <w:t xml:space="preserve">	</w:t>
       </w:r>
-      <w:hyperlink w:history="1" r:id="rIdgand95kxfgenblucsae8a">
+      <w:hyperlink w:history="1" r:id="rId-guixz9rb2aoxpysrsw1l">
         <w:r>
           <w:rPr>
             <w:rFonts w:ascii="Times New Roman" w:cs="Times New Roman" w:eastAsia="Microsoft YaHei" w:hAnsi="Times New Roman"/>
@@ -2985,7 +2982,7 @@
           <w:t xml:space="preserve">   </w:t>
         </w:r>
       </w:hyperlink>
-      <w:hyperlink w:history="1" r:id="rIdqehc3jwtlsqr9lhivhvx_">
+      <w:hyperlink w:history="1" r:id="rIddeptje4apptea32s4nszv">
         <w:r>
           <w:rPr>
             <w:rFonts w:ascii="Times New Roman" w:cs="Times New Roman" w:eastAsia="Microsoft YaHei" w:hAnsi="Times New Roman"/>
@@ -3185,7 +3182,7 @@
           <w:sz w:val="20"/>
           <w:szCs w:val="20"/>
         </w:rPr>
-        <w:t xml:space="preserve"> AI 干预迭代</w:t>
+        <w:t xml:space="preserve"> 迭代</w:t>
       </w:r>
     </w:p>
     <w:p>
@@ -3208,20 +3205,20 @@
           <w:sz w:val="19"/>
           <w:szCs w:val="19"/>
         </w:rPr>
-        <w:t xml:space="preserve">痛点与方案：</w:t>
-      </w:r>
-      <w:r>
-        <w:rPr>
-          <w:rFonts w:ascii="Times New Roman" w:cs="Times New Roman" w:eastAsia="Microsoft YaHei" w:hAnsi="Times New Roman"/>
-          <w:b w:val="false"/>
-          <w:bCs w:val="false"/>
-          <w:i w:val="false"/>
-          <w:iCs w:val="false"/>
-          <w:color w:val="151515"/>
-          <w:sz w:val="19"/>
-          <w:szCs w:val="19"/>
-        </w:rPr>
-        <w:t xml:space="preserve">企业安全团队反馈演练模板过时、培训枯燥、缺员工脆弱度指标；带 5 人团队设计</w:t>
+        <w:t xml:space="preserve">背景与方案：</w:t>
+      </w:r>
+      <w:r>
+        <w:rPr>
+          <w:rFonts w:ascii="Times New Roman" w:cs="Times New Roman" w:eastAsia="Microsoft YaHei" w:hAnsi="Times New Roman"/>
+          <w:b w:val="false"/>
+          <w:bCs w:val="false"/>
+          <w:i w:val="false"/>
+          <w:iCs w:val="false"/>
+          <w:color w:val="151515"/>
+          <w:sz w:val="19"/>
+          <w:szCs w:val="19"/>
+        </w:rPr>
+        <w:t xml:space="preserve">安全团队反馈演练模板过时、缺脆弱度指标；带 5 人团队设计 Freemium 与</w:t>
       </w:r>
       <w:r>
         <w:rPr>
@@ -3247,7 +3244,85 @@
           <w:sz w:val="19"/>
           <w:szCs w:val="19"/>
         </w:rPr>
-        <w:t xml:space="preserve">个人免费 + 企业订阅</w:t>
+        <w:t xml:space="preserve">打开</w:t>
+      </w:r>
+      <w:r>
+        <w:rPr>
+          <w:rFonts w:ascii="Times New Roman" w:cs="Times New Roman" w:eastAsia="Times New Roman" w:hAnsi="Times New Roman"/>
+          <w:b w:val="false"/>
+          <w:bCs w:val="false"/>
+          <w:i w:val="false"/>
+          <w:iCs w:val="false"/>
+          <w:color w:val="151515"/>
+          <w:sz w:val="19"/>
+          <w:szCs w:val="19"/>
+        </w:rPr>
+        <w:t xml:space="preserve">→</w:t>
+      </w:r>
+      <w:r>
+        <w:rPr>
+          <w:rFonts w:ascii="Times New Roman" w:cs="Times New Roman" w:eastAsia="Microsoft YaHei" w:hAnsi="Times New Roman"/>
+          <w:b w:val="false"/>
+          <w:bCs w:val="false"/>
+          <w:i w:val="false"/>
+          <w:iCs w:val="false"/>
+          <w:color w:val="151515"/>
+          <w:sz w:val="19"/>
+          <w:szCs w:val="19"/>
+        </w:rPr>
+        <w:t xml:space="preserve">点击</w:t>
+      </w:r>
+      <w:r>
+        <w:rPr>
+          <w:rFonts w:ascii="Times New Roman" w:cs="Times New Roman" w:eastAsia="Times New Roman" w:hAnsi="Times New Roman"/>
+          <w:b w:val="false"/>
+          <w:bCs w:val="false"/>
+          <w:i w:val="false"/>
+          <w:iCs w:val="false"/>
+          <w:color w:val="151515"/>
+          <w:sz w:val="19"/>
+          <w:szCs w:val="19"/>
+        </w:rPr>
+        <w:t xml:space="preserve">→</w:t>
+      </w:r>
+      <w:r>
+        <w:rPr>
+          <w:rFonts w:ascii="Times New Roman" w:cs="Times New Roman" w:eastAsia="Microsoft YaHei" w:hAnsi="Times New Roman"/>
+          <w:b w:val="false"/>
+          <w:bCs w:val="false"/>
+          <w:i w:val="false"/>
+          <w:iCs w:val="false"/>
+          <w:color w:val="151515"/>
+          <w:sz w:val="19"/>
+          <w:szCs w:val="19"/>
+        </w:rPr>
+        <w:t xml:space="preserve">提交凭证</w:t>
+      </w:r>
+      <w:r>
+        <w:rPr>
+          <w:rFonts w:ascii="Times New Roman" w:cs="Times New Roman" w:eastAsia="Times New Roman" w:hAnsi="Times New Roman"/>
+          <w:b w:val="false"/>
+          <w:bCs w:val="false"/>
+          <w:i w:val="false"/>
+          <w:iCs w:val="false"/>
+          <w:color w:val="151515"/>
+          <w:sz w:val="19"/>
+          <w:szCs w:val="19"/>
+        </w:rPr>
+        <w:t xml:space="preserve">→</w:t>
+      </w:r>
+      <w:r>
+        <w:rPr>
+          <w:rFonts w:ascii="Times New Roman" w:cs="Times New Roman" w:eastAsia="Microsoft YaHei" w:hAnsi="Times New Roman"/>
+          <w:b w:val="false"/>
+          <w:bCs w:val="false"/>
+          <w:i w:val="false"/>
+          <w:iCs w:val="false"/>
+          <w:color w:val="151515"/>
+          <w:sz w:val="19"/>
+          <w:szCs w:val="19"/>
+        </w:rPr>
+        <w:t xml:space="preserve">上报</w:t>
       </w:r>
       <w:r>
         <w:rPr>
@@ -3273,137 +3348,7 @@
           <w:sz w:val="19"/>
           <w:szCs w:val="19"/>
         </w:rPr>
-        <w:t xml:space="preserve">方案，把效果拆成</w:t>
-      </w:r>
-      <w:r>
-        <w:rPr>
-          <w:rFonts w:ascii="Times New Roman" w:cs="Times New Roman" w:eastAsia="Times New Roman" w:hAnsi="Times New Roman"/>
-          <w:b w:val="false"/>
-          <w:bCs w:val="false"/>
-          <w:i w:val="false"/>
-          <w:iCs w:val="false"/>
-          <w:color w:val="151515"/>
-          <w:sz w:val="19"/>
-          <w:szCs w:val="19"/>
-        </w:rPr>
-        <w:t xml:space="preserve">“</w:t>
-      </w:r>
-      <w:r>
-        <w:rPr>
-          <w:rFonts w:ascii="Times New Roman" w:cs="Times New Roman" w:eastAsia="Microsoft YaHei" w:hAnsi="Times New Roman"/>
-          <w:b w:val="false"/>
-          <w:bCs w:val="false"/>
-          <w:i w:val="false"/>
-          <w:iCs w:val="false"/>
-          <w:color w:val="151515"/>
-          <w:sz w:val="19"/>
-          <w:szCs w:val="19"/>
-        </w:rPr>
-        <w:t xml:space="preserve">打开 </w:t>
-      </w:r>
-      <w:r>
-        <w:rPr>
-          <w:rFonts w:ascii="Times New Roman" w:cs="Times New Roman" w:eastAsia="Times New Roman" w:hAnsi="Times New Roman"/>
-          <w:b w:val="false"/>
-          <w:bCs w:val="false"/>
-          <w:i w:val="false"/>
-          <w:iCs w:val="false"/>
-          <w:color w:val="151515"/>
-          <w:sz w:val="19"/>
-          <w:szCs w:val="19"/>
-        </w:rPr>
-        <w:t xml:space="preserve">→</w:t>
-      </w:r>
-      <w:r>
-        <w:rPr>
-          <w:rFonts w:ascii="Times New Roman" w:cs="Times New Roman" w:eastAsia="Microsoft YaHei" w:hAnsi="Times New Roman"/>
-          <w:b w:val="false"/>
-          <w:bCs w:val="false"/>
-          <w:i w:val="false"/>
-          <w:iCs w:val="false"/>
-          <w:color w:val="151515"/>
-          <w:sz w:val="19"/>
-          <w:szCs w:val="19"/>
-        </w:rPr>
-        <w:t xml:space="preserve"> 点击 </w:t>
-      </w:r>
-      <w:r>
-        <w:rPr>
-          <w:rFonts w:ascii="Times New Roman" w:cs="Times New Roman" w:eastAsia="Times New Roman" w:hAnsi="Times New Roman"/>
-          <w:b w:val="false"/>
-          <w:bCs w:val="false"/>
-          <w:i w:val="false"/>
-          <w:iCs w:val="false"/>
-          <w:color w:val="151515"/>
-          <w:sz w:val="19"/>
-          <w:szCs w:val="19"/>
-        </w:rPr>
-        <w:t xml:space="preserve">→</w:t>
-      </w:r>
-      <w:r>
-        <w:rPr>
-          <w:rFonts w:ascii="Times New Roman" w:cs="Times New Roman" w:eastAsia="Microsoft YaHei" w:hAnsi="Times New Roman"/>
-          <w:b w:val="false"/>
-          <w:bCs w:val="false"/>
-          <w:i w:val="false"/>
-          <w:iCs w:val="false"/>
-          <w:color w:val="151515"/>
-          <w:sz w:val="19"/>
-          <w:szCs w:val="19"/>
-        </w:rPr>
-        <w:t xml:space="preserve"> 提交凭证 </w:t>
-      </w:r>
-      <w:r>
-        <w:rPr>
-          <w:rFonts w:ascii="Times New Roman" w:cs="Times New Roman" w:eastAsia="Times New Roman" w:hAnsi="Times New Roman"/>
-          <w:b w:val="false"/>
-          <w:bCs w:val="false"/>
-          <w:i w:val="false"/>
-          <w:iCs w:val="false"/>
-          <w:color w:val="151515"/>
-          <w:sz w:val="19"/>
-          <w:szCs w:val="19"/>
-        </w:rPr>
-        <w:t xml:space="preserve">→</w:t>
-      </w:r>
-      <w:r>
-        <w:rPr>
-          <w:rFonts w:ascii="Times New Roman" w:cs="Times New Roman" w:eastAsia="Microsoft YaHei" w:hAnsi="Times New Roman"/>
-          <w:b w:val="false"/>
-          <w:bCs w:val="false"/>
-          <w:i w:val="false"/>
-          <w:iCs w:val="false"/>
-          <w:color w:val="151515"/>
-          <w:sz w:val="19"/>
-          <w:szCs w:val="19"/>
-        </w:rPr>
-        <w:t xml:space="preserve"> 上报</w:t>
-      </w:r>
-      <w:r>
-        <w:rPr>
-          <w:rFonts w:ascii="Times New Roman" w:cs="Times New Roman" w:eastAsia="Times New Roman" w:hAnsi="Times New Roman"/>
-          <w:b w:val="false"/>
-          <w:bCs w:val="false"/>
-          <w:i w:val="false"/>
-          <w:iCs w:val="false"/>
-          <w:color w:val="151515"/>
-          <w:sz w:val="19"/>
-          <w:szCs w:val="19"/>
-        </w:rPr>
-        <w:t xml:space="preserve">”</w:t>
-      </w:r>
-      <w:r>
-        <w:rPr>
-          <w:rFonts w:ascii="Times New Roman" w:cs="Times New Roman" w:eastAsia="Microsoft YaHei" w:hAnsi="Times New Roman"/>
-          <w:b w:val="false"/>
-          <w:bCs w:val="false"/>
-          <w:i w:val="false"/>
-          <w:iCs w:val="false"/>
-          <w:color w:val="151515"/>
-          <w:sz w:val="19"/>
-          <w:szCs w:val="19"/>
-        </w:rPr>
-        <w:t xml:space="preserve">漏斗指标。</w:t>
+        <w:t xml:space="preserve">漏斗。</w:t>
       </w:r>
     </w:p>
     <w:p>
@@ -3592,7 +3537,7 @@
           <w:sz w:val="19"/>
           <w:szCs w:val="19"/>
         </w:rPr>
-        <w:t xml:space="preserve">（15 位个人 + 8 位企业 IT/安全负责人），满意度 4.2/5、4.5/5，</w:t>
+        <w:t xml:space="preserve">（含 8 位企业安全负责人），满意度 4.2/5、4.5/5，</w:t>
       </w:r>
       <w:r>
         <w:rPr>
@@ -3644,199 +3589,7 @@
           <w:sz w:val="19"/>
           <w:szCs w:val="19"/>
         </w:rPr>
-        <w:t xml:space="preserve">；把反馈收敛成批量导入、自助模板等 6 项迭代路线；获 NUS STePS 荣誉提名。</w:t>
-      </w:r>
-    </w:p>
-    <w:p>
-      <w:pPr>
-        <w:pStyle w:val="ListParagraph"/>
-        <w:numPr>
-          <w:ilvl w:val="0"/>
-          <w:numId w:val="2"/>
-        </w:numPr>
-        <w:spacing w:line="240" w:lineRule="exact"/>
-      </w:pPr>
-      <w:r>
-        <w:rPr>
-          <w:rFonts w:ascii="Times New Roman" w:cs="Times New Roman" w:eastAsia="Microsoft YaHei" w:hAnsi="Times New Roman"/>
-          <w:b/>
-          <w:bCs/>
-          <w:i w:val="false"/>
-          <w:iCs w:val="false"/>
-          <w:color w:val="151515"/>
-          <w:sz w:val="19"/>
-          <w:szCs w:val="19"/>
-        </w:rPr>
-        <w:t xml:space="preserve">AI 迭代：</w:t>
-      </w:r>
-      <w:r>
-        <w:rPr>
-          <w:rFonts w:ascii="Times New Roman" w:cs="Times New Roman" w:eastAsia="Microsoft YaHei" w:hAnsi="Times New Roman"/>
-          <w:b w:val="false"/>
-          <w:bCs w:val="false"/>
-          <w:i w:val="false"/>
-          <w:iCs w:val="false"/>
-          <w:color w:val="151515"/>
-          <w:sz w:val="19"/>
-          <w:szCs w:val="19"/>
-        </w:rPr>
-        <w:t xml:space="preserve">把干预前移到付款前，</w:t>
-      </w:r>
-      <w:r>
-        <w:rPr>
-          <w:rFonts w:ascii="Times New Roman" w:cs="Times New Roman" w:eastAsia="Times New Roman" w:hAnsi="Times New Roman"/>
-          <w:b w:val="false"/>
-          <w:bCs w:val="false"/>
-          <w:i w:val="false"/>
-          <w:iCs w:val="false"/>
-          <w:color w:val="151515"/>
-          <w:sz w:val="19"/>
-          <w:szCs w:val="19"/>
-        </w:rPr>
-        <w:t xml:space="preserve">“</w:t>
-      </w:r>
-      <w:r>
-        <w:rPr>
-          <w:rFonts w:ascii="Times New Roman" w:cs="Times New Roman" w:eastAsia="Microsoft YaHei" w:hAnsi="Times New Roman"/>
-          <w:b w:val="false"/>
-          <w:bCs w:val="false"/>
-          <w:i w:val="false"/>
-          <w:iCs w:val="false"/>
-          <w:color w:val="151515"/>
-          <w:sz w:val="19"/>
-          <w:szCs w:val="19"/>
-        </w:rPr>
-        <w:t xml:space="preserve">规则判定 </w:t>
-      </w:r>
-      <w:r>
-        <w:rPr>
-          <w:rFonts w:ascii="Times New Roman" w:cs="Times New Roman" w:eastAsia="Times New Roman" w:hAnsi="Times New Roman"/>
-          <w:b w:val="false"/>
-          <w:bCs w:val="false"/>
-          <w:i w:val="false"/>
-          <w:iCs w:val="false"/>
-          <w:color w:val="151515"/>
-          <w:sz w:val="19"/>
-          <w:szCs w:val="19"/>
-        </w:rPr>
-        <w:t xml:space="preserve">—</w:t>
-      </w:r>
-      <w:r>
-        <w:rPr>
-          <w:rFonts w:ascii="Times New Roman" w:cs="Times New Roman" w:eastAsia="Microsoft YaHei" w:hAnsi="Times New Roman"/>
-          <w:b w:val="false"/>
-          <w:bCs w:val="false"/>
-          <w:i w:val="false"/>
-          <w:iCs w:val="false"/>
-          <w:color w:val="151515"/>
-          <w:sz w:val="19"/>
-          <w:szCs w:val="19"/>
-        </w:rPr>
-        <w:t xml:space="preserve"> 模型解释 </w:t>
-      </w:r>
-      <w:r>
-        <w:rPr>
-          <w:rFonts w:ascii="Times New Roman" w:cs="Times New Roman" w:eastAsia="Times New Roman" w:hAnsi="Times New Roman"/>
-          <w:b w:val="false"/>
-          <w:bCs w:val="false"/>
-          <w:i w:val="false"/>
-          <w:iCs w:val="false"/>
-          <w:color w:val="151515"/>
-          <w:sz w:val="19"/>
-          <w:szCs w:val="19"/>
-        </w:rPr>
-        <w:t xml:space="preserve">—</w:t>
-      </w:r>
-      <w:r>
-        <w:rPr>
-          <w:rFonts w:ascii="Times New Roman" w:cs="Times New Roman" w:eastAsia="Microsoft YaHei" w:hAnsi="Times New Roman"/>
-          <w:b w:val="false"/>
-          <w:bCs w:val="false"/>
-          <w:i w:val="false"/>
-          <w:iCs w:val="false"/>
-          <w:color w:val="151515"/>
-          <w:sz w:val="19"/>
-          <w:szCs w:val="19"/>
-        </w:rPr>
-        <w:t xml:space="preserve"> 人工复核</w:t>
-      </w:r>
-      <w:r>
-        <w:rPr>
-          <w:rFonts w:ascii="Times New Roman" w:cs="Times New Roman" w:eastAsia="Times New Roman" w:hAnsi="Times New Roman"/>
-          <w:b w:val="false"/>
-          <w:bCs w:val="false"/>
-          <w:i w:val="false"/>
-          <w:iCs w:val="false"/>
-          <w:color w:val="151515"/>
-          <w:sz w:val="19"/>
-          <w:szCs w:val="19"/>
-        </w:rPr>
-        <w:t xml:space="preserve">”</w:t>
-      </w:r>
-      <w:r>
-        <w:rPr>
-          <w:rFonts w:ascii="Times New Roman" w:cs="Times New Roman" w:eastAsia="Microsoft YaHei" w:hAnsi="Times New Roman"/>
-          <w:b w:val="false"/>
-          <w:bCs w:val="false"/>
-          <w:i w:val="false"/>
-          <w:iCs w:val="false"/>
-          <w:color w:val="151515"/>
-          <w:sz w:val="19"/>
-          <w:szCs w:val="19"/>
-        </w:rPr>
-        <w:t xml:space="preserve">分层干预，AI 只解释不降级；161 例合成回归集干预准确率 </w:t>
-      </w:r>
-      <w:r>
-        <w:rPr>
-          <w:rFonts w:ascii="Times New Roman" w:cs="Times New Roman" w:eastAsia="Microsoft YaHei" w:hAnsi="Times New Roman"/>
-          <w:b/>
-          <w:bCs/>
-          <w:i w:val="false"/>
-          <w:iCs w:val="false"/>
-          <w:color w:val="151515"/>
-          <w:sz w:val="19"/>
-          <w:szCs w:val="19"/>
-        </w:rPr>
-        <w:t xml:space="preserve">97.5%</w:t>
-      </w:r>
-      <w:r>
-        <w:rPr>
-          <w:rFonts w:ascii="Times New Roman" w:cs="Times New Roman" w:eastAsia="Microsoft YaHei" w:hAnsi="Times New Roman"/>
-          <w:b w:val="false"/>
-          <w:bCs w:val="false"/>
-          <w:i w:val="false"/>
-          <w:iCs w:val="false"/>
-          <w:color w:val="151515"/>
-          <w:sz w:val="19"/>
-          <w:szCs w:val="19"/>
-        </w:rPr>
-        <w:t xml:space="preserve">（无规则 LLM 29.2%），过度干预 </w:t>
-      </w:r>
-      <w:r>
-        <w:rPr>
-          <w:rFonts w:ascii="Times New Roman" w:cs="Times New Roman" w:eastAsia="Microsoft YaHei" w:hAnsi="Times New Roman"/>
-          <w:b/>
-          <w:bCs/>
-          <w:i w:val="false"/>
-          <w:iCs w:val="false"/>
-          <w:color w:val="151515"/>
-          <w:sz w:val="19"/>
-          <w:szCs w:val="19"/>
-        </w:rPr>
-        <w:t xml:space="preserve">0%</w:t>
-      </w:r>
-      <w:r>
-        <w:rPr>
-          <w:rFonts w:ascii="Times New Roman" w:cs="Times New Roman" w:eastAsia="Microsoft YaHei" w:hAnsi="Times New Roman"/>
-          <w:b w:val="false"/>
-          <w:bCs w:val="false"/>
-          <w:i w:val="false"/>
-          <w:iCs w:val="false"/>
-          <w:color w:val="151515"/>
-          <w:sz w:val="19"/>
-          <w:szCs w:val="19"/>
-        </w:rPr>
-        <w:t xml:space="preserve">。</w:t>
+        <w:t xml:space="preserve">，反馈收敛为 6 项迭代；获 STePS 提名。</w:t>
       </w:r>
     </w:p>
     <w:p>
@@ -3851,7 +3604,7 @@
       <w:r>
         <w:drawing>
           <wp:inline distT="0" distB="0" distL="0" distR="0">
-            <wp:extent cx="152400" cy="133350"/>
+            <wp:extent cx="152400" cy="152400"/>
             <wp:effectExtent t="0" r="0" b="0" l="0"/>
             <wp:docPr id="1" name="" descr="" title=""/>
             <wp:cNvGraphicFramePr>
@@ -3876,6 +3629,524 @@
                   <pic:spPr bwMode="auto">
                     <a:xfrm>
                       <a:off x="0" y="0"/>
+                      <a:ext cx="152400" cy="152400"/>
+                    </a:xfrm>
+                    <a:prstGeom prst="rect">
+                      <a:avLst/>
+                    </a:prstGeom>
+                  </pic:spPr>
+                </pic:pic>
+              </a:graphicData>
+            </a:graphic>
+          </wp:inline>
+        </w:drawing>
+      </w:r>
+      <w:r>
+        <w:rPr>
+          <w:sz w:val="20"/>
+          <w:szCs w:val="20"/>
+        </w:rPr>
+        <w:t xml:space="preserve">  </w:t>
+      </w:r>
+      <w:r>
+        <w:rPr>
+          <w:rFonts w:ascii="Times New Roman" w:cs="Times New Roman" w:eastAsia="Microsoft YaHei" w:hAnsi="Times New Roman"/>
+          <w:b/>
+          <w:bCs/>
+          <w:i w:val="false"/>
+          <w:iCs w:val="false"/>
+          <w:color w:val="151515"/>
+          <w:sz w:val="20"/>
+          <w:szCs w:val="20"/>
+        </w:rPr>
+        <w:t xml:space="preserve">Chaoshan Deli Chain (Guangxi) </w:t>
+      </w:r>
+      <w:r>
+        <w:rPr>
+          <w:rFonts w:ascii="Times New Roman" w:cs="Times New Roman" w:eastAsia="Times New Roman" w:hAnsi="Times New Roman"/>
+          <w:b/>
+          <w:bCs/>
+          <w:i w:val="false"/>
+          <w:iCs w:val="false"/>
+          <w:color w:val="151515"/>
+          <w:sz w:val="20"/>
+          <w:szCs w:val="20"/>
+        </w:rPr>
+        <w:t xml:space="preserve">·</w:t>
+      </w:r>
+      <w:r>
+        <w:rPr>
+          <w:rFonts w:ascii="Times New Roman" w:cs="Times New Roman" w:eastAsia="Microsoft YaHei" w:hAnsi="Times New Roman"/>
+          <w:b/>
+          <w:bCs/>
+          <w:i w:val="false"/>
+          <w:iCs w:val="false"/>
+          <w:color w:val="151515"/>
+          <w:sz w:val="20"/>
+          <w:szCs w:val="20"/>
+        </w:rPr>
+        <w:t xml:space="preserve"> 线下门店 0</w:t>
+      </w:r>
+      <w:r>
+        <w:rPr>
+          <w:rFonts w:ascii="Times New Roman" w:cs="Times New Roman" w:eastAsia="Times New Roman" w:hAnsi="Times New Roman"/>
+          <w:b/>
+          <w:bCs/>
+          <w:i w:val="false"/>
+          <w:iCs w:val="false"/>
+          <w:color w:val="151515"/>
+          <w:sz w:val="20"/>
+          <w:szCs w:val="20"/>
+        </w:rPr>
+        <w:t xml:space="preserve">→</w:t>
+      </w:r>
+      <w:r>
+        <w:rPr>
+          <w:rFonts w:ascii="Times New Roman" w:cs="Times New Roman" w:eastAsia="Microsoft YaHei" w:hAnsi="Times New Roman"/>
+          <w:b/>
+          <w:bCs/>
+          <w:i w:val="false"/>
+          <w:iCs w:val="false"/>
+          <w:color w:val="151515"/>
+          <w:sz w:val="20"/>
+          <w:szCs w:val="20"/>
+        </w:rPr>
+        <w:t xml:space="preserve">1 落地</w:t>
+      </w:r>
+      <w:r>
+        <w:rPr>
+          <w:rFonts w:ascii="Times New Roman" w:cs="Times New Roman" w:eastAsia="Microsoft YaHei" w:hAnsi="Times New Roman"/>
+          <w:b w:val="false"/>
+          <w:bCs w:val="false"/>
+          <w:i w:val="false"/>
+          <w:iCs w:val="false"/>
+          <w:color w:val="151515"/>
+          <w:sz w:val="20"/>
+          <w:szCs w:val="20"/>
+        </w:rPr>
+        <w:t xml:space="preserve">  </w:t>
+      </w:r>
+      <w:r>
+        <w:rPr>
+          <w:rFonts w:ascii="Times New Roman" w:cs="Times New Roman" w:eastAsia="Times New Roman" w:hAnsi="Times New Roman"/>
+          <w:b w:val="false"/>
+          <w:bCs w:val="false"/>
+          <w:i w:val="false"/>
+          <w:iCs w:val="false"/>
+          <w:color w:val="151515"/>
+          <w:sz w:val="20"/>
+          <w:szCs w:val="20"/>
+        </w:rPr>
+        <w:t xml:space="preserve">·</w:t>
+      </w:r>
+      <w:r>
+        <w:rPr>
+          <w:rFonts w:ascii="Times New Roman" w:cs="Times New Roman" w:eastAsia="Microsoft YaHei" w:hAnsi="Times New Roman"/>
+          <w:b w:val="false"/>
+          <w:bCs w:val="false"/>
+          <w:i w:val="false"/>
+          <w:iCs w:val="false"/>
+          <w:color w:val="151515"/>
+          <w:sz w:val="20"/>
+          <w:szCs w:val="20"/>
+        </w:rPr>
+        <w:t xml:space="preserve">  </w:t>
+      </w:r>
+      <w:r>
+        <w:rPr>
+          <w:rFonts w:ascii="Times New Roman" w:cs="Times New Roman" w:eastAsia="Microsoft YaHei" w:hAnsi="Times New Roman"/>
+          <w:b/>
+          <w:bCs/>
+          <w:i w:val="false"/>
+          <w:iCs w:val="false"/>
+          <w:color w:val="151515"/>
+          <w:sz w:val="20"/>
+          <w:szCs w:val="20"/>
+        </w:rPr>
+        <w:t xml:space="preserve">Project Lead</w:t>
+      </w:r>
+      <w:r>
+        <w:rPr>
+          <w:sz w:val="20"/>
+          <w:szCs w:val="20"/>
+        </w:rPr>
+        <w:t xml:space="preserve">	</w:t>
+      </w:r>
+      <w:r>
+        <w:rPr>
+          <w:rFonts w:ascii="Times New Roman" w:cs="Times New Roman" w:eastAsia="Microsoft YaHei" w:hAnsi="Times New Roman"/>
+          <w:b/>
+          <w:bCs/>
+          <w:i w:val="false"/>
+          <w:iCs w:val="false"/>
+          <w:color w:val="151515"/>
+          <w:sz w:val="19"/>
+          <w:szCs w:val="19"/>
+        </w:rPr>
+        <w:t xml:space="preserve">2026 </w:t>
+      </w:r>
+      <w:r>
+        <w:rPr>
+          <w:rFonts w:ascii="Times New Roman" w:cs="Times New Roman" w:eastAsia="Times New Roman" w:hAnsi="Times New Roman"/>
+          <w:b/>
+          <w:bCs/>
+          <w:i w:val="false"/>
+          <w:iCs w:val="false"/>
+          <w:color w:val="151515"/>
+          <w:sz w:val="19"/>
+          <w:szCs w:val="19"/>
+        </w:rPr>
+        <w:t xml:space="preserve">–</w:t>
+      </w:r>
+      <w:r>
+        <w:rPr>
+          <w:rFonts w:ascii="Times New Roman" w:cs="Times New Roman" w:eastAsia="Microsoft YaHei" w:hAnsi="Times New Roman"/>
+          <w:b/>
+          <w:bCs/>
+          <w:i w:val="false"/>
+          <w:iCs w:val="false"/>
+          <w:color w:val="151515"/>
+          <w:sz w:val="19"/>
+          <w:szCs w:val="19"/>
+        </w:rPr>
+        <w:t xml:space="preserve"> 至今</w:t>
+      </w:r>
+    </w:p>
+    <w:p>
+      <w:pPr>
+        <w:spacing w:before="20" w:line="252" w:lineRule="exact"/>
+      </w:pPr>
+      <w:r>
+        <w:rPr>
+          <w:rFonts w:ascii="Times New Roman" w:cs="Times New Roman" w:eastAsia="Microsoft YaHei" w:hAnsi="Times New Roman"/>
+          <w:b/>
+          <w:bCs/>
+          <w:i w:val="false"/>
+          <w:iCs w:val="false"/>
+          <w:color w:val="244B9B"/>
+          <w:sz w:val="20"/>
+          <w:szCs w:val="20"/>
+        </w:rPr>
+        <w:t xml:space="preserve">社区直营小店落地</w:t>
+      </w:r>
+      <w:r>
+        <w:rPr>
+          <w:rFonts w:ascii="Times New Roman" w:cs="Times New Roman" w:eastAsia="Microsoft YaHei" w:hAnsi="Times New Roman"/>
+          <w:b/>
+          <w:bCs/>
+          <w:i w:val="false"/>
+          <w:iCs w:val="false"/>
+          <w:color w:val="244B9B"/>
+          <w:sz w:val="20"/>
+          <w:szCs w:val="20"/>
+        </w:rPr>
+        <w:t xml:space="preserve">  |  </w:t>
+      </w:r>
+      <w:r>
+        <w:rPr>
+          <w:rFonts w:ascii="Times New Roman" w:cs="Times New Roman" w:eastAsia="Microsoft YaHei" w:hAnsi="Times New Roman"/>
+          <w:b/>
+          <w:bCs/>
+          <w:i w:val="false"/>
+          <w:iCs w:val="false"/>
+          <w:color w:val="244B9B"/>
+          <w:sz w:val="20"/>
+          <w:szCs w:val="20"/>
+        </w:rPr>
+        <w:t xml:space="preserve">远程勘测 </w:t>
+      </w:r>
+      <w:r>
+        <w:rPr>
+          <w:rFonts w:ascii="Times New Roman" w:cs="Times New Roman" w:eastAsia="Times New Roman" w:hAnsi="Times New Roman"/>
+          <w:b/>
+          <w:bCs/>
+          <w:i w:val="false"/>
+          <w:iCs w:val="false"/>
+          <w:color w:val="244B9B"/>
+          <w:sz w:val="20"/>
+          <w:szCs w:val="20"/>
+        </w:rPr>
+        <w:t xml:space="preserve">→</w:t>
+      </w:r>
+      <w:r>
+        <w:rPr>
+          <w:rFonts w:ascii="Times New Roman" w:cs="Times New Roman" w:eastAsia="Microsoft YaHei" w:hAnsi="Times New Roman"/>
+          <w:b/>
+          <w:bCs/>
+          <w:i w:val="false"/>
+          <w:iCs w:val="false"/>
+          <w:color w:val="244B9B"/>
+          <w:sz w:val="20"/>
+          <w:szCs w:val="20"/>
+        </w:rPr>
+        <w:t xml:space="preserve"> 方案设计 </w:t>
+      </w:r>
+      <w:r>
+        <w:rPr>
+          <w:rFonts w:ascii="Times New Roman" w:cs="Times New Roman" w:eastAsia="Times New Roman" w:hAnsi="Times New Roman"/>
+          <w:b/>
+          <w:bCs/>
+          <w:i w:val="false"/>
+          <w:iCs w:val="false"/>
+          <w:color w:val="244B9B"/>
+          <w:sz w:val="20"/>
+          <w:szCs w:val="20"/>
+        </w:rPr>
+        <w:t xml:space="preserve">→</w:t>
+      </w:r>
+      <w:r>
+        <w:rPr>
+          <w:rFonts w:ascii="Times New Roman" w:cs="Times New Roman" w:eastAsia="Microsoft YaHei" w:hAnsi="Times New Roman"/>
+          <w:b/>
+          <w:bCs/>
+          <w:i w:val="false"/>
+          <w:iCs w:val="false"/>
+          <w:color w:val="244B9B"/>
+          <w:sz w:val="20"/>
+          <w:szCs w:val="20"/>
+        </w:rPr>
+        <w:t xml:space="preserve"> 采购施工 </w:t>
+      </w:r>
+      <w:r>
+        <w:rPr>
+          <w:rFonts w:ascii="Times New Roman" w:cs="Times New Roman" w:eastAsia="Times New Roman" w:hAnsi="Times New Roman"/>
+          <w:b/>
+          <w:bCs/>
+          <w:i w:val="false"/>
+          <w:iCs w:val="false"/>
+          <w:color w:val="244B9B"/>
+          <w:sz w:val="20"/>
+          <w:szCs w:val="20"/>
+        </w:rPr>
+        <w:t xml:space="preserve">→</w:t>
+      </w:r>
+      <w:r>
+        <w:rPr>
+          <w:rFonts w:ascii="Times New Roman" w:cs="Times New Roman" w:eastAsia="Microsoft YaHei" w:hAnsi="Times New Roman"/>
+          <w:b/>
+          <w:bCs/>
+          <w:i w:val="false"/>
+          <w:iCs w:val="false"/>
+          <w:color w:val="244B9B"/>
+          <w:sz w:val="20"/>
+          <w:szCs w:val="20"/>
+        </w:rPr>
+        <w:t xml:space="preserve"> 试营业数据复盘</w:t>
+      </w:r>
+    </w:p>
+    <w:p>
+      <w:pPr>
+        <w:pStyle w:val="ListParagraph"/>
+        <w:numPr>
+          <w:ilvl w:val="0"/>
+          <w:numId w:val="2"/>
+        </w:numPr>
+        <w:spacing w:line="240" w:lineRule="exact"/>
+      </w:pPr>
+      <w:r>
+        <w:rPr>
+          <w:rFonts w:ascii="Times New Roman" w:cs="Times New Roman" w:eastAsia="Microsoft YaHei" w:hAnsi="Times New Roman"/>
+          <w:b/>
+          <w:bCs/>
+          <w:i w:val="false"/>
+          <w:iCs w:val="false"/>
+          <w:color w:val="151515"/>
+          <w:sz w:val="19"/>
+          <w:szCs w:val="19"/>
+        </w:rPr>
+        <w:t xml:space="preserve">现场诊断与方案：</w:t>
+      </w:r>
+      <w:r>
+        <w:rPr>
+          <w:rFonts w:ascii="Times New Roman" w:cs="Times New Roman" w:eastAsia="Microsoft YaHei" w:hAnsi="Times New Roman"/>
+          <w:b w:val="false"/>
+          <w:bCs w:val="false"/>
+          <w:i w:val="false"/>
+          <w:iCs w:val="false"/>
+          <w:color w:val="151515"/>
+          <w:sz w:val="19"/>
+          <w:szCs w:val="19"/>
+        </w:rPr>
+        <w:t xml:space="preserve">远程看现场视频、复尺定动线；开工前设许可、排风、电力、给排水 </w:t>
+      </w:r>
+      <w:r>
+        <w:rPr>
+          <w:rFonts w:ascii="Times New Roman" w:cs="Times New Roman" w:eastAsia="Microsoft YaHei" w:hAnsi="Times New Roman"/>
+          <w:b/>
+          <w:bCs/>
+          <w:i w:val="false"/>
+          <w:iCs w:val="false"/>
+          <w:color w:val="151515"/>
+          <w:sz w:val="19"/>
+          <w:szCs w:val="19"/>
+        </w:rPr>
+        <w:t xml:space="preserve">4 道核验门槛</w:t>
+      </w:r>
+      <w:r>
+        <w:rPr>
+          <w:rFonts w:ascii="Times New Roman" w:cs="Times New Roman" w:eastAsia="Microsoft YaHei" w:hAnsi="Times New Roman"/>
+          <w:b w:val="false"/>
+          <w:bCs w:val="false"/>
+          <w:i w:val="false"/>
+          <w:iCs w:val="false"/>
+          <w:color w:val="151515"/>
+          <w:sz w:val="19"/>
+          <w:szCs w:val="19"/>
+        </w:rPr>
+        <w:t xml:space="preserve">，导视按反馈迭代 </w:t>
+      </w:r>
+      <w:r>
+        <w:rPr>
+          <w:rFonts w:ascii="Times New Roman" w:cs="Times New Roman" w:eastAsia="Microsoft YaHei" w:hAnsi="Times New Roman"/>
+          <w:b/>
+          <w:bCs/>
+          <w:i w:val="false"/>
+          <w:iCs w:val="false"/>
+          <w:color w:val="151515"/>
+          <w:sz w:val="19"/>
+          <w:szCs w:val="19"/>
+        </w:rPr>
+        <w:t xml:space="preserve">6 版</w:t>
+      </w:r>
+      <w:r>
+        <w:rPr>
+          <w:rFonts w:ascii="Times New Roman" w:cs="Times New Roman" w:eastAsia="Microsoft YaHei" w:hAnsi="Times New Roman"/>
+          <w:b w:val="false"/>
+          <w:bCs w:val="false"/>
+          <w:i w:val="false"/>
+          <w:iCs w:val="false"/>
+          <w:color w:val="151515"/>
+          <w:sz w:val="19"/>
+          <w:szCs w:val="19"/>
+        </w:rPr>
+        <w:t xml:space="preserve">。</w:t>
+      </w:r>
+    </w:p>
+    <w:p>
+      <w:pPr>
+        <w:pStyle w:val="ListParagraph"/>
+        <w:numPr>
+          <w:ilvl w:val="0"/>
+          <w:numId w:val="2"/>
+        </w:numPr>
+        <w:spacing w:line="240" w:lineRule="exact"/>
+      </w:pPr>
+      <w:r>
+        <w:rPr>
+          <w:rFonts w:ascii="Times New Roman" w:cs="Times New Roman" w:eastAsia="Microsoft YaHei" w:hAnsi="Times New Roman"/>
+          <w:b/>
+          <w:bCs/>
+          <w:i w:val="false"/>
+          <w:iCs w:val="false"/>
+          <w:color w:val="151515"/>
+          <w:sz w:val="19"/>
+          <w:szCs w:val="19"/>
+        </w:rPr>
+        <w:t xml:space="preserve">落地与运营：</w:t>
+      </w:r>
+      <w:r>
+        <w:rPr>
+          <w:rFonts w:ascii="Times New Roman" w:cs="Times New Roman" w:eastAsia="Microsoft YaHei" w:hAnsi="Times New Roman"/>
+          <w:b w:val="false"/>
+          <w:bCs w:val="false"/>
+          <w:i w:val="false"/>
+          <w:iCs w:val="false"/>
+          <w:color w:val="151515"/>
+          <w:sz w:val="19"/>
+          <w:szCs w:val="19"/>
+        </w:rPr>
+        <w:t xml:space="preserve">制定三家同规格比价与施工</w:t>
+      </w:r>
+      <w:r>
+        <w:rPr>
+          <w:rFonts w:ascii="Times New Roman" w:cs="Times New Roman" w:eastAsia="Times New Roman" w:hAnsi="Times New Roman"/>
+          <w:b w:val="false"/>
+          <w:bCs w:val="false"/>
+          <w:i w:val="false"/>
+          <w:iCs w:val="false"/>
+          <w:color w:val="151515"/>
+          <w:sz w:val="19"/>
+          <w:szCs w:val="19"/>
+        </w:rPr>
+        <w:t xml:space="preserve">—</w:t>
+      </w:r>
+      <w:r>
+        <w:rPr>
+          <w:rFonts w:ascii="Times New Roman" w:cs="Times New Roman" w:eastAsia="Microsoft YaHei" w:hAnsi="Times New Roman"/>
+          <w:b w:val="false"/>
+          <w:bCs w:val="false"/>
+          <w:i w:val="false"/>
+          <w:iCs w:val="false"/>
+          <w:color w:val="151515"/>
+          <w:sz w:val="19"/>
+          <w:szCs w:val="19"/>
+        </w:rPr>
+        <w:t xml:space="preserve">联调</w:t>
+      </w:r>
+      <w:r>
+        <w:rPr>
+          <w:rFonts w:ascii="Times New Roman" w:cs="Times New Roman" w:eastAsia="Times New Roman" w:hAnsi="Times New Roman"/>
+          <w:b w:val="false"/>
+          <w:bCs w:val="false"/>
+          <w:i w:val="false"/>
+          <w:iCs w:val="false"/>
+          <w:color w:val="151515"/>
+          <w:sz w:val="19"/>
+          <w:szCs w:val="19"/>
+        </w:rPr>
+        <w:t xml:space="preserve">—</w:t>
+      </w:r>
+      <w:r>
+        <w:rPr>
+          <w:rFonts w:ascii="Times New Roman" w:cs="Times New Roman" w:eastAsia="Microsoft YaHei" w:hAnsi="Times New Roman"/>
+          <w:b w:val="false"/>
+          <w:bCs w:val="false"/>
+          <w:i w:val="false"/>
+          <w:iCs w:val="false"/>
+          <w:color w:val="151515"/>
+          <w:sz w:val="19"/>
+          <w:szCs w:val="19"/>
+        </w:rPr>
+        <w:t xml:space="preserve">热态测试计划；设计门店日报口径（SKU 销量、成本、报损、现金差异）。</w:t>
+      </w:r>
+    </w:p>
+    <w:p>
+      <w:pPr>
+        <w:shd w:fill="F2F3F5" w:color="auto" w:val="clear"/>
+        <w:tabs>
+          <w:tab w:val="right" w:pos="10652"/>
+        </w:tabs>
+        <w:spacing w:after="10" w:before="50" w:line="320" w:lineRule="exact"/>
+        <w:ind w:left="60" w:right="60"/>
+      </w:pPr>
+      <w:r>
+        <w:drawing>
+          <wp:inline distT="0" distB="0" distL="0" distR="0">
+            <wp:extent cx="152400" cy="133350"/>
+            <wp:effectExtent t="0" r="0" b="0" l="0"/>
+            <wp:docPr id="1" name="" descr="" title=""/>
+            <wp:cNvGraphicFramePr>
+              <a:graphicFrameLocks xmlns:a="http://schemas.openxmlformats.org/drawingml/2006/main" noChangeAspect="1"/>
+            </wp:cNvGraphicFramePr>
+            <a:graphic xmlns:a="http://schemas.openxmlformats.org/drawingml/2006/main">
+              <a:graphicData uri="http://schemas.openxmlformats.org/drawingml/2006/picture">
+                <pic:pic xmlns:pic="http://schemas.openxmlformats.org/drawingml/2006/picture">
+                  <pic:nvPicPr>
+                    <pic:cNvPr id="0" name="" descr=""/>
+                    <pic:cNvPicPr>
+                      <a:picLocks noChangeAspect="1" noChangeArrowheads="1"/>
+                    </pic:cNvPicPr>
+                  </pic:nvPicPr>
+                  <pic:blipFill>
+                    <a:blip r:embed="rId21" cstate="none"/>
+                    <a:srcRect/>
+                    <a:stretch>
+                      <a:fillRect/>
+                    </a:stretch>
+                  </pic:blipFill>
+                  <pic:spPr bwMode="auto">
+                    <a:xfrm>
+                      <a:off x="0" y="0"/>
                       <a:ext cx="152400" cy="133350"/>
                     </a:xfrm>
                     <a:prstGeom prst="rect">
@@ -3993,7 +4264,7 @@
         </w:rPr>
         <w:t xml:space="preserve">	</w:t>
       </w:r>
-      <w:hyperlink w:history="1" r:id="rIdisoy9avdfly2yy6z_oiar">
+      <w:hyperlink w:history="1" r:id="rIddetkn4lvdgofzi8dxetbv">
         <w:r>
           <w:rPr>
             <w:rFonts w:ascii="Times New Roman" w:cs="Times New Roman" w:eastAsia="Microsoft YaHei" w:hAnsi="Times New Roman"/>
@@ -4372,7 +4643,7 @@
           <w:sz w:val="20"/>
           <w:szCs w:val="20"/>
         </w:rPr>
-        <w:t xml:space="preserve">Open-Source AI Solutions </w:t>
+        <w:t xml:space="preserve">Real-World AI Projects </w:t>
       </w:r>
       <w:r>
         <w:rPr>
@@ -4462,54 +4733,15 @@
       <w:r>
         <w:rPr>
           <w:rFonts w:ascii="Times New Roman" w:cs="Times New Roman" w:eastAsia="Microsoft YaHei" w:hAnsi="Times New Roman"/>
-          <w:b w:val="false"/>
-          <w:bCs w:val="false"/>
-          <w:i w:val="false"/>
-          <w:iCs w:val="false"/>
-          <w:color w:val="151515"/>
-          <w:sz w:val="19"/>
-          <w:szCs w:val="19"/>
-        </w:rPr>
-        <w:t xml:space="preserve">数据均为合成 </w:t>
-      </w:r>
-      <w:r>
-        <w:rPr>
-          <w:rFonts w:ascii="Times New Roman" w:cs="Times New Roman" w:eastAsia="Times New Roman" w:hAnsi="Times New Roman"/>
-          <w:b w:val="false"/>
-          <w:bCs w:val="false"/>
-          <w:i w:val="false"/>
-          <w:iCs w:val="false"/>
-          <w:color w:val="151515"/>
-          <w:sz w:val="19"/>
-          <w:szCs w:val="19"/>
-        </w:rPr>
-        <w:t xml:space="preserve">·</w:t>
-      </w:r>
-      <w:r>
-        <w:rPr>
-          <w:rFonts w:ascii="Times New Roman" w:cs="Times New Roman" w:eastAsia="Microsoft YaHei" w:hAnsi="Times New Roman"/>
-          <w:b w:val="false"/>
-          <w:bCs w:val="false"/>
-          <w:i w:val="false"/>
-          <w:iCs w:val="false"/>
-          <w:color w:val="151515"/>
-          <w:sz w:val="19"/>
-          <w:szCs w:val="19"/>
-        </w:rPr>
-        <w:t xml:space="preserve"> 可复现</w:t>
-      </w:r>
-      <w:r>
-        <w:rPr>
-          <w:rFonts w:ascii="Times New Roman" w:cs="Times New Roman" w:eastAsia="Microsoft YaHei" w:hAnsi="Times New Roman"/>
-          <w:b/>
-          <w:bCs/>
-          <w:i w:val="false"/>
-          <w:iCs w:val="false"/>
-          <w:color w:val="151515"/>
-          <w:sz w:val="19"/>
-          <w:szCs w:val="19"/>
-        </w:rPr>
-        <w:t xml:space="preserve"> 2025 </w:t>
+          <w:b/>
+          <w:bCs/>
+          <w:i w:val="false"/>
+          <w:iCs w:val="false"/>
+          <w:color w:val="151515"/>
+          <w:sz w:val="19"/>
+          <w:szCs w:val="19"/>
+        </w:rPr>
+        <w:t xml:space="preserve">2025 </w:t>
       </w:r>
       <w:r>
         <w:rPr>
@@ -4547,7 +4779,7 @@
         </w:numPr>
         <w:spacing w:line="240" w:lineRule="exact"/>
       </w:pPr>
-      <w:hyperlink w:history="1" r:id="rId0ucthcn0f5bdgzfbqxncz">
+      <w:hyperlink w:history="1" r:id="rId_ui2hly7dkensprg1j9bd">
         <w:r>
           <w:rPr>
             <w:rFonts w:ascii="Times New Roman" w:cs="Times New Roman" w:eastAsia="Microsoft YaHei" w:hAnsi="Times New Roman"/>
@@ -4559,7 +4791,7 @@
             <w:sz w:val="19"/>
             <w:szCs w:val="19"/>
           </w:rPr>
-          <w:t xml:space="preserve">PropTech Agent Reliability Lab</w:t>
+          <w:t xml:space="preserve">Converge</w:t>
         </w:r>
       </w:hyperlink>
       <w:r>
@@ -4573,189 +4805,33 @@
           <w:sz w:val="19"/>
           <w:szCs w:val="19"/>
         </w:rPr>
-        <w:t xml:space="preserve">：模拟客户报障，按</w:t>
-      </w:r>
-      <w:r>
-        <w:rPr>
-          <w:rFonts w:ascii="Times New Roman" w:cs="Times New Roman" w:eastAsia="Times New Roman" w:hAnsi="Times New Roman"/>
-          <w:b w:val="false"/>
-          <w:bCs w:val="false"/>
-          <w:i w:val="false"/>
-          <w:iCs w:val="false"/>
-          <w:color w:val="151515"/>
-          <w:sz w:val="19"/>
-          <w:szCs w:val="19"/>
-        </w:rPr>
-        <w:t xml:space="preserve">“</w:t>
-      </w:r>
-      <w:r>
-        <w:rPr>
-          <w:rFonts w:ascii="Times New Roman" w:cs="Times New Roman" w:eastAsia="Microsoft YaHei" w:hAnsi="Times New Roman"/>
-          <w:b w:val="false"/>
-          <w:bCs w:val="false"/>
-          <w:i w:val="false"/>
-          <w:iCs w:val="false"/>
-          <w:color w:val="151515"/>
-          <w:sz w:val="19"/>
-          <w:szCs w:val="19"/>
-        </w:rPr>
-        <w:t xml:space="preserve">核实事实 </w:t>
-      </w:r>
-      <w:r>
-        <w:rPr>
-          <w:rFonts w:ascii="Times New Roman" w:cs="Times New Roman" w:eastAsia="Times New Roman" w:hAnsi="Times New Roman"/>
-          <w:b w:val="false"/>
-          <w:bCs w:val="false"/>
-          <w:i w:val="false"/>
-          <w:iCs w:val="false"/>
-          <w:color w:val="151515"/>
-          <w:sz w:val="19"/>
-          <w:szCs w:val="19"/>
-        </w:rPr>
-        <w:t xml:space="preserve">→</w:t>
-      </w:r>
-      <w:r>
-        <w:rPr>
-          <w:rFonts w:ascii="Times New Roman" w:cs="Times New Roman" w:eastAsia="Microsoft YaHei" w:hAnsi="Times New Roman"/>
-          <w:b w:val="false"/>
-          <w:bCs w:val="false"/>
-          <w:i w:val="false"/>
-          <w:iCs w:val="false"/>
-          <w:color w:val="151515"/>
-          <w:sz w:val="19"/>
-          <w:szCs w:val="19"/>
-        </w:rPr>
-        <w:t xml:space="preserve"> 查 trace </w:t>
-      </w:r>
-      <w:r>
-        <w:rPr>
-          <w:rFonts w:ascii="Times New Roman" w:cs="Times New Roman" w:eastAsia="Times New Roman" w:hAnsi="Times New Roman"/>
-          <w:b w:val="false"/>
-          <w:bCs w:val="false"/>
-          <w:i w:val="false"/>
-          <w:iCs w:val="false"/>
-          <w:color w:val="151515"/>
-          <w:sz w:val="19"/>
-          <w:szCs w:val="19"/>
-        </w:rPr>
-        <w:t xml:space="preserve">→</w:t>
-      </w:r>
-      <w:r>
-        <w:rPr>
-          <w:rFonts w:ascii="Times New Roman" w:cs="Times New Roman" w:eastAsia="Microsoft YaHei" w:hAnsi="Times New Roman"/>
-          <w:b w:val="false"/>
-          <w:bCs w:val="false"/>
-          <w:i w:val="false"/>
-          <w:iCs w:val="false"/>
-          <w:color w:val="151515"/>
-          <w:sz w:val="19"/>
-          <w:szCs w:val="19"/>
-        </w:rPr>
-        <w:t xml:space="preserve"> 最小实验 </w:t>
-      </w:r>
-      <w:r>
-        <w:rPr>
-          <w:rFonts w:ascii="Times New Roman" w:cs="Times New Roman" w:eastAsia="Times New Roman" w:hAnsi="Times New Roman"/>
-          <w:b w:val="false"/>
-          <w:bCs w:val="false"/>
-          <w:i w:val="false"/>
-          <w:iCs w:val="false"/>
-          <w:color w:val="151515"/>
-          <w:sz w:val="19"/>
-          <w:szCs w:val="19"/>
-        </w:rPr>
-        <w:t xml:space="preserve">→</w:t>
-      </w:r>
-      <w:r>
-        <w:rPr>
-          <w:rFonts w:ascii="Times New Roman" w:cs="Times New Roman" w:eastAsia="Microsoft YaHei" w:hAnsi="Times New Roman"/>
-          <w:b w:val="false"/>
-          <w:bCs w:val="false"/>
-          <w:i w:val="false"/>
-          <w:iCs w:val="false"/>
-          <w:color w:val="151515"/>
-          <w:sz w:val="19"/>
-          <w:szCs w:val="19"/>
-        </w:rPr>
-        <w:t xml:space="preserve"> 定根因 </w:t>
-      </w:r>
-      <w:r>
-        <w:rPr>
-          <w:rFonts w:ascii="Times New Roman" w:cs="Times New Roman" w:eastAsia="Times New Roman" w:hAnsi="Times New Roman"/>
-          <w:b w:val="false"/>
-          <w:bCs w:val="false"/>
-          <w:i w:val="false"/>
-          <w:iCs w:val="false"/>
-          <w:color w:val="151515"/>
-          <w:sz w:val="19"/>
-          <w:szCs w:val="19"/>
-        </w:rPr>
-        <w:t xml:space="preserve">→</w:t>
-      </w:r>
-      <w:r>
-        <w:rPr>
-          <w:rFonts w:ascii="Times New Roman" w:cs="Times New Roman" w:eastAsia="Microsoft YaHei" w:hAnsi="Times New Roman"/>
-          <w:b w:val="false"/>
-          <w:bCs w:val="false"/>
-          <w:i w:val="false"/>
-          <w:iCs w:val="false"/>
-          <w:color w:val="151515"/>
-          <w:sz w:val="19"/>
-          <w:szCs w:val="19"/>
-        </w:rPr>
-        <w:t xml:space="preserve"> 加回归 </w:t>
-      </w:r>
-      <w:r>
-        <w:rPr>
-          <w:rFonts w:ascii="Times New Roman" w:cs="Times New Roman" w:eastAsia="Times New Roman" w:hAnsi="Times New Roman"/>
-          <w:b w:val="false"/>
-          <w:bCs w:val="false"/>
-          <w:i w:val="false"/>
-          <w:iCs w:val="false"/>
-          <w:color w:val="151515"/>
-          <w:sz w:val="19"/>
-          <w:szCs w:val="19"/>
-        </w:rPr>
-        <w:t xml:space="preserve">→</w:t>
-      </w:r>
-      <w:r>
-        <w:rPr>
-          <w:rFonts w:ascii="Times New Roman" w:cs="Times New Roman" w:eastAsia="Microsoft YaHei" w:hAnsi="Times New Roman"/>
-          <w:b w:val="false"/>
-          <w:bCs w:val="false"/>
-          <w:i w:val="false"/>
-          <w:iCs w:val="false"/>
-          <w:color w:val="151515"/>
-          <w:sz w:val="19"/>
-          <w:szCs w:val="19"/>
-        </w:rPr>
-        <w:t xml:space="preserve"> 向客户解释</w:t>
-      </w:r>
-      <w:r>
-        <w:rPr>
-          <w:rFonts w:ascii="Times New Roman" w:cs="Times New Roman" w:eastAsia="Times New Roman" w:hAnsi="Times New Roman"/>
-          <w:b w:val="false"/>
-          <w:bCs w:val="false"/>
-          <w:i w:val="false"/>
-          <w:iCs w:val="false"/>
-          <w:color w:val="151515"/>
-          <w:sz w:val="19"/>
-          <w:szCs w:val="19"/>
-        </w:rPr>
-        <w:t xml:space="preserve">”</w:t>
-      </w:r>
-      <w:r>
-        <w:rPr>
-          <w:rFonts w:ascii="Times New Roman" w:cs="Times New Roman" w:eastAsia="Microsoft YaHei" w:hAnsi="Times New Roman"/>
-          <w:b w:val="false"/>
-          <w:bCs w:val="false"/>
-          <w:i w:val="false"/>
-          <w:iCs w:val="false"/>
-          <w:color w:val="151515"/>
-          <w:sz w:val="19"/>
-          <w:szCs w:val="19"/>
-        </w:rPr>
-        <w:t xml:space="preserve">排障。</w:t>
+        <w:t xml:space="preserve">：TikTok TechJam 赛题，对 5 万件真实商品做对话导购，平均 1.96 轮命中，官方评分 </w:t>
+      </w:r>
+      <w:r>
+        <w:rPr>
+          <w:rFonts w:ascii="Times New Roman" w:cs="Times New Roman" w:eastAsia="Microsoft YaHei" w:hAnsi="Times New Roman"/>
+          <w:b/>
+          <w:bCs/>
+          <w:i w:val="false"/>
+          <w:iCs w:val="false"/>
+          <w:color w:val="151515"/>
+          <w:sz w:val="19"/>
+          <w:szCs w:val="19"/>
+        </w:rPr>
+        <w:t xml:space="preserve">0.9760</w:t>
+      </w:r>
+      <w:r>
+        <w:rPr>
+          <w:rFonts w:ascii="Times New Roman" w:cs="Times New Roman" w:eastAsia="Microsoft YaHei" w:hAnsi="Times New Roman"/>
+          <w:b w:val="false"/>
+          <w:bCs w:val="false"/>
+          <w:i w:val="false"/>
+          <w:iCs w:val="false"/>
+          <w:color w:val="151515"/>
+          <w:sz w:val="19"/>
+          <w:szCs w:val="19"/>
+        </w:rPr>
+        <w:t xml:space="preserve">（基线 0.1067）。</w:t>
       </w:r>
     </w:p>
     <w:p>
@@ -4767,7 +4843,7 @@
         </w:numPr>
         <w:spacing w:line="240" w:lineRule="exact"/>
       </w:pPr>
-      <w:hyperlink w:history="1" r:id="rIdktz0m2lhn4yisc_7qsal2">
+      <w:hyperlink w:history="1" r:id="rIdau-ufdxnhmqkcq82s9y4l">
         <w:r>
           <w:rPr>
             <w:rFonts w:ascii="Times New Roman" w:cs="Times New Roman" w:eastAsia="Microsoft YaHei" w:hAnsi="Times New Roman"/>
@@ -4779,7 +4855,7 @@
             <w:sz w:val="19"/>
             <w:szCs w:val="19"/>
           </w:rPr>
-          <w:t xml:space="preserve">OpsSignal</w:t>
+          <w:t xml:space="preserve">WealthGuard</w:t>
         </w:r>
       </w:hyperlink>
       <w:r>
@@ -4793,33 +4869,78 @@
           <w:sz w:val="19"/>
           <w:szCs w:val="19"/>
         </w:rPr>
-        <w:t xml:space="preserve">：把混乱工单治理成统一分类、指标看板和 AI 分诊，</w:t>
-      </w:r>
-      <w:r>
-        <w:rPr>
-          <w:rFonts w:ascii="Times New Roman" w:cs="Times New Roman" w:eastAsia="Microsoft YaHei" w:hAnsi="Times New Roman"/>
-          <w:b/>
-          <w:bCs/>
-          <w:i w:val="false"/>
-          <w:iCs w:val="false"/>
-          <w:color w:val="151515"/>
-          <w:sz w:val="19"/>
-          <w:szCs w:val="19"/>
-        </w:rPr>
-        <w:t xml:space="preserve">84%</w:t>
-      </w:r>
-      <w:r>
-        <w:rPr>
-          <w:rFonts w:ascii="Times New Roman" w:cs="Times New Roman" w:eastAsia="Microsoft YaHei" w:hAnsi="Times New Roman"/>
-          <w:b w:val="false"/>
-          <w:bCs w:val="false"/>
-          <w:i w:val="false"/>
-          <w:iCs w:val="false"/>
-          <w:color w:val="151515"/>
-          <w:sz w:val="19"/>
-          <w:szCs w:val="19"/>
-        </w:rPr>
-        <w:t xml:space="preserve"> 自动分类，低置信转人工（一致率 92.3% vs 50.0%）。</w:t>
+        <w:t xml:space="preserve">：针对证券 App 的 AI 回答</w:t>
+      </w:r>
+      <w:r>
+        <w:rPr>
+          <w:rFonts w:ascii="Times New Roman" w:cs="Times New Roman" w:eastAsia="Times New Roman" w:hAnsi="Times New Roman"/>
+          <w:b w:val="false"/>
+          <w:bCs w:val="false"/>
+          <w:i w:val="false"/>
+          <w:iCs w:val="false"/>
+          <w:color w:val="151515"/>
+          <w:sz w:val="19"/>
+          <w:szCs w:val="19"/>
+        </w:rPr>
+        <w:t xml:space="preserve">“</w:t>
+      </w:r>
+      <w:r>
+        <w:rPr>
+          <w:rFonts w:ascii="Times New Roman" w:cs="Times New Roman" w:eastAsia="Microsoft YaHei" w:hAnsi="Times New Roman"/>
+          <w:b w:val="false"/>
+          <w:bCs w:val="false"/>
+          <w:i w:val="false"/>
+          <w:iCs w:val="false"/>
+          <w:color w:val="151515"/>
+          <w:sz w:val="19"/>
+          <w:szCs w:val="19"/>
+        </w:rPr>
+        <w:t xml:space="preserve">无出处</w:t>
+      </w:r>
+      <w:r>
+        <w:rPr>
+          <w:rFonts w:ascii="Times New Roman" w:cs="Times New Roman" w:eastAsia="Times New Roman" w:hAnsi="Times New Roman"/>
+          <w:b w:val="false"/>
+          <w:bCs w:val="false"/>
+          <w:i w:val="false"/>
+          <w:iCs w:val="false"/>
+          <w:color w:val="151515"/>
+          <w:sz w:val="19"/>
+          <w:szCs w:val="19"/>
+        </w:rPr>
+        <w:t xml:space="preserve">”</w:t>
+      </w:r>
+      <w:r>
+        <w:rPr>
+          <w:rFonts w:ascii="Times New Roman" w:cs="Times New Roman" w:eastAsia="Microsoft YaHei" w:hAnsi="Times New Roman"/>
+          <w:b w:val="false"/>
+          <w:bCs w:val="false"/>
+          <w:i w:val="false"/>
+          <w:iCs w:val="false"/>
+          <w:color w:val="151515"/>
+          <w:sz w:val="19"/>
+          <w:szCs w:val="19"/>
+        </w:rPr>
+        <w:t xml:space="preserve">，接入 13 份 SEC/港交所官方文件、1,714 个证据块，结论可回溯原文页码。</w:t>
+      </w:r>
+    </w:p>
+    <w:p>
+      <w:pPr>
+        <w:pBdr>
+          <w:bottom w:val="single" w:color="2458B8" w:sz="12" w:space="1"/>
+        </w:pBdr>
+        <w:spacing w:after="40" w:before="40" w:line="340" w:lineRule="exact"/>
+      </w:pPr>
+      <w:r>
+        <w:rPr>
+          <w:rFonts w:ascii="Arial" w:eastAsia="Microsoft YaHei" w:hAnsi="Arial"/>
+          <w:b/>
+          <w:bCs/>
+          <w:color w:val="2458B8"/>
+          <w:sz w:val="29"/>
+          <w:szCs w:val="29"/>
+        </w:rPr>
+        <w:t xml:space="preserve">专业技能与成果</w:t>
       </w:r>
     </w:p>
     <w:p>
@@ -4831,257 +4952,6 @@
         </w:numPr>
         <w:spacing w:line="240" w:lineRule="exact"/>
       </w:pPr>
-      <w:hyperlink w:history="1" r:id="rIdzbv87tbyxjw7aavkqdlv5">
-        <w:r>
-          <w:rPr>
-            <w:rFonts w:ascii="Times New Roman" w:cs="Times New Roman" w:eastAsia="Microsoft YaHei" w:hAnsi="Times New Roman"/>
-            <w:b/>
-            <w:bCs/>
-            <w:i w:val="false"/>
-            <w:iCs w:val="false"/>
-            <w:color w:val="151515"/>
-            <w:sz w:val="19"/>
-            <w:szCs w:val="19"/>
-          </w:rPr>
-          <w:t xml:space="preserve">Trade Recon</w:t>
-        </w:r>
-      </w:hyperlink>
-      <w:r>
-        <w:rPr>
-          <w:rFonts w:ascii="Times New Roman" w:cs="Times New Roman" w:eastAsia="Microsoft YaHei" w:hAnsi="Times New Roman"/>
-          <w:b w:val="false"/>
-          <w:bCs w:val="false"/>
-          <w:i w:val="false"/>
-          <w:iCs w:val="false"/>
-          <w:color w:val="151515"/>
-          <w:sz w:val="19"/>
-          <w:szCs w:val="19"/>
-        </w:rPr>
-        <w:t xml:space="preserve">：两套系统对账前先统一时区、结算日与拆单口径，待人工处理差异从 </w:t>
-      </w:r>
-      <w:r>
-        <w:rPr>
-          <w:rFonts w:ascii="Times New Roman" w:cs="Times New Roman" w:eastAsia="Microsoft YaHei" w:hAnsi="Times New Roman"/>
-          <w:b/>
-          <w:bCs/>
-          <w:i w:val="false"/>
-          <w:iCs w:val="false"/>
-          <w:color w:val="151515"/>
-          <w:sz w:val="19"/>
-          <w:szCs w:val="19"/>
-        </w:rPr>
-        <w:t xml:space="preserve">201 条降到 77 条</w:t>
-      </w:r>
-      <w:r>
-        <w:rPr>
-          <w:rFonts w:ascii="Times New Roman" w:cs="Times New Roman" w:eastAsia="Microsoft YaHei" w:hAnsi="Times New Roman"/>
-          <w:b w:val="false"/>
-          <w:bCs w:val="false"/>
-          <w:i w:val="false"/>
-          <w:iCs w:val="false"/>
-          <w:color w:val="151515"/>
-          <w:sz w:val="19"/>
-          <w:szCs w:val="19"/>
-        </w:rPr>
-        <w:t xml:space="preserve">，每条附责任方与时限。</w:t>
-      </w:r>
-    </w:p>
-    <w:p>
-      <w:pPr>
-        <w:pStyle w:val="ListParagraph"/>
-        <w:numPr>
-          <w:ilvl w:val="0"/>
-          <w:numId w:val="2"/>
-        </w:numPr>
-        <w:spacing w:line="240" w:lineRule="exact"/>
-      </w:pPr>
-      <w:hyperlink w:history="1" r:id="rIdyruesdojtzifc1fjsov_b">
-        <w:r>
-          <w:rPr>
-            <w:rFonts w:ascii="Times New Roman" w:cs="Times New Roman" w:eastAsia="Microsoft YaHei" w:hAnsi="Times New Roman"/>
-            <w:b/>
-            <w:bCs/>
-            <w:i w:val="false"/>
-            <w:iCs w:val="false"/>
-            <w:color w:val="151515"/>
-            <w:sz w:val="19"/>
-            <w:szCs w:val="19"/>
-          </w:rPr>
-          <w:t xml:space="preserve">DEBUG.CN</w:t>
-        </w:r>
-      </w:hyperlink>
-      <w:r>
-        <w:rPr>
-          <w:rFonts w:ascii="Times New Roman" w:cs="Times New Roman" w:eastAsia="Microsoft YaHei" w:hAnsi="Times New Roman"/>
-          <w:b w:val="false"/>
-          <w:bCs w:val="false"/>
-          <w:i w:val="false"/>
-          <w:iCs w:val="false"/>
-          <w:color w:val="151515"/>
-          <w:sz w:val="19"/>
-          <w:szCs w:val="19"/>
-        </w:rPr>
-        <w:t xml:space="preserve">：把 API/SDK 报错转成</w:t>
-      </w:r>
-      <w:r>
-        <w:rPr>
-          <w:rFonts w:ascii="Times New Roman" w:cs="Times New Roman" w:eastAsia="Times New Roman" w:hAnsi="Times New Roman"/>
-          <w:b w:val="false"/>
-          <w:bCs w:val="false"/>
-          <w:i w:val="false"/>
-          <w:iCs w:val="false"/>
-          <w:color w:val="151515"/>
-          <w:sz w:val="19"/>
-          <w:szCs w:val="19"/>
-        </w:rPr>
-        <w:t xml:space="preserve">“</w:t>
-      </w:r>
-      <w:r>
-        <w:rPr>
-          <w:rFonts w:ascii="Times New Roman" w:cs="Times New Roman" w:eastAsia="Microsoft YaHei" w:hAnsi="Times New Roman"/>
-          <w:b w:val="false"/>
-          <w:bCs w:val="false"/>
-          <w:i w:val="false"/>
-          <w:iCs w:val="false"/>
-          <w:color w:val="151515"/>
-          <w:sz w:val="19"/>
-          <w:szCs w:val="19"/>
-        </w:rPr>
-        <w:t xml:space="preserve">证据 </w:t>
-      </w:r>
-      <w:r>
-        <w:rPr>
-          <w:rFonts w:ascii="Times New Roman" w:cs="Times New Roman" w:eastAsia="Times New Roman" w:hAnsi="Times New Roman"/>
-          <w:b w:val="false"/>
-          <w:bCs w:val="false"/>
-          <w:i w:val="false"/>
-          <w:iCs w:val="false"/>
-          <w:color w:val="151515"/>
-          <w:sz w:val="19"/>
-          <w:szCs w:val="19"/>
-        </w:rPr>
-        <w:t xml:space="preserve">→</w:t>
-      </w:r>
-      <w:r>
-        <w:rPr>
-          <w:rFonts w:ascii="Times New Roman" w:cs="Times New Roman" w:eastAsia="Microsoft YaHei" w:hAnsi="Times New Roman"/>
-          <w:b w:val="false"/>
-          <w:bCs w:val="false"/>
-          <w:i w:val="false"/>
-          <w:iCs w:val="false"/>
-          <w:color w:val="151515"/>
-          <w:sz w:val="19"/>
-          <w:szCs w:val="19"/>
-        </w:rPr>
-        <w:t xml:space="preserve"> 根因 </w:t>
-      </w:r>
-      <w:r>
-        <w:rPr>
-          <w:rFonts w:ascii="Times New Roman" w:cs="Times New Roman" w:eastAsia="Times New Roman" w:hAnsi="Times New Roman"/>
-          <w:b w:val="false"/>
-          <w:bCs w:val="false"/>
-          <w:i w:val="false"/>
-          <w:iCs w:val="false"/>
-          <w:color w:val="151515"/>
-          <w:sz w:val="19"/>
-          <w:szCs w:val="19"/>
-        </w:rPr>
-        <w:t xml:space="preserve">→</w:t>
-      </w:r>
-      <w:r>
-        <w:rPr>
-          <w:rFonts w:ascii="Times New Roman" w:cs="Times New Roman" w:eastAsia="Microsoft YaHei" w:hAnsi="Times New Roman"/>
-          <w:b w:val="false"/>
-          <w:bCs w:val="false"/>
-          <w:i w:val="false"/>
-          <w:iCs w:val="false"/>
-          <w:color w:val="151515"/>
-          <w:sz w:val="19"/>
-          <w:szCs w:val="19"/>
-        </w:rPr>
-        <w:t xml:space="preserve"> 最小修复 </w:t>
-      </w:r>
-      <w:r>
-        <w:rPr>
-          <w:rFonts w:ascii="Times New Roman" w:cs="Times New Roman" w:eastAsia="Times New Roman" w:hAnsi="Times New Roman"/>
-          <w:b w:val="false"/>
-          <w:bCs w:val="false"/>
-          <w:i w:val="false"/>
-          <w:iCs w:val="false"/>
-          <w:color w:val="151515"/>
-          <w:sz w:val="19"/>
-          <w:szCs w:val="19"/>
-        </w:rPr>
-        <w:t xml:space="preserve">→</w:t>
-      </w:r>
-      <w:r>
-        <w:rPr>
-          <w:rFonts w:ascii="Times New Roman" w:cs="Times New Roman" w:eastAsia="Microsoft YaHei" w:hAnsi="Times New Roman"/>
-          <w:b w:val="false"/>
-          <w:bCs w:val="false"/>
-          <w:i w:val="false"/>
-          <w:iCs w:val="false"/>
-          <w:color w:val="151515"/>
-          <w:sz w:val="19"/>
-          <w:szCs w:val="19"/>
-        </w:rPr>
-        <w:t xml:space="preserve"> 验证步骤</w:t>
-      </w:r>
-      <w:r>
-        <w:rPr>
-          <w:rFonts w:ascii="Times New Roman" w:cs="Times New Roman" w:eastAsia="Times New Roman" w:hAnsi="Times New Roman"/>
-          <w:b w:val="false"/>
-          <w:bCs w:val="false"/>
-          <w:i w:val="false"/>
-          <w:iCs w:val="false"/>
-          <w:color w:val="151515"/>
-          <w:sz w:val="19"/>
-          <w:szCs w:val="19"/>
-        </w:rPr>
-        <w:t xml:space="preserve">”</w:t>
-      </w:r>
-      <w:r>
-        <w:rPr>
-          <w:rFonts w:ascii="Times New Roman" w:cs="Times New Roman" w:eastAsia="Microsoft YaHei" w:hAnsi="Times New Roman"/>
-          <w:b w:val="false"/>
-          <w:bCs w:val="false"/>
-          <w:i w:val="false"/>
-          <w:iCs w:val="false"/>
-          <w:color w:val="151515"/>
-          <w:sz w:val="19"/>
-          <w:szCs w:val="19"/>
-        </w:rPr>
-        <w:t xml:space="preserve">，先脱敏再调模型，无 Key 也能离线演示。</w:t>
-      </w:r>
-    </w:p>
-    <w:p>
-      <w:pPr>
-        <w:pBdr>
-          <w:bottom w:val="single" w:color="2458B8" w:sz="12" w:space="1"/>
-        </w:pBdr>
-        <w:spacing w:after="40" w:before="40" w:line="340" w:lineRule="exact"/>
-      </w:pPr>
-      <w:r>
-        <w:rPr>
-          <w:rFonts w:ascii="Arial" w:eastAsia="Microsoft YaHei" w:hAnsi="Arial"/>
-          <w:b/>
-          <w:bCs/>
-          <w:color w:val="2458B8"/>
-          <w:sz w:val="29"/>
-          <w:szCs w:val="29"/>
-        </w:rPr>
-        <w:t xml:space="preserve">专业技能与成果</w:t>
-      </w:r>
-    </w:p>
-    <w:p>
-      <w:pPr>
-        <w:pStyle w:val="ListParagraph"/>
-        <w:numPr>
-          <w:ilvl w:val="0"/>
-          <w:numId w:val="2"/>
-        </w:numPr>
-        <w:spacing w:line="240" w:lineRule="exact"/>
-      </w:pPr>
       <w:r>
         <w:rPr>
           <w:rFonts w:ascii="Times New Roman" w:cs="Times New Roman" w:eastAsia="Microsoft YaHei" w:hAnsi="Times New Roman"/>
@@ -5106,7 +4976,7 @@
           <w:sz w:val="19"/>
           <w:szCs w:val="19"/>
         </w:rPr>
-        <w:t xml:space="preserve">客户访谈与痛点诊断、流程与规则拆解、方案设计与验收口径、原型演示、用户测试与迭代路线图。</w:t>
+        <w:t xml:space="preserve">客户访谈与痛点诊断、流程与规则拆解、方案设计与验收口径、原型演示、现场落地与迭代。</w:t>
       </w:r>
     </w:p>
     <w:p>

</xml_diff>

<commit_message>
Replace GitHub projects with Hengqin asset revitalization project
Section retitled AI Startup & Field Projects. Hengqin written with
background / responsibilities / delivery; private details kept generic.

Co-Authored-By: Claude Opus 5.5 <noreply@anthropic.com>
Claude-Session: https://claude.ai/code/session_01Wy6QccTAXhM16qGGvDf8g9
</commit_message>
<xml_diff>
--- a/resume/fde/邹志华_FDE简历.docx
+++ b/resume/fde/邹志华_FDE简历.docx
@@ -323,7 +323,7 @@
         </w:rPr>
         <w:t xml:space="preserve"> </w:t>
       </w:r>
-      <w:hyperlink w:history="1" r:id="rId5xpfx1uyjbdjg3ufiw6if">
+      <w:hyperlink w:history="1" r:id="rIdxdwoqnmsgr4sf9fjhqn19">
         <w:r>
           <w:rPr>
             <w:rFonts w:ascii="Times New Roman" w:cs="Times New Roman" w:eastAsia="Microsoft YaHei" w:hAnsi="Times New Roman"/>
@@ -1380,7 +1380,7 @@
           <w:sz w:val="19"/>
           <w:szCs w:val="19"/>
         </w:rPr>
-        <w:t xml:space="preserve">，按根因回流需求、统一跨市场数据口径；按用户价值、合规风险与开发成本评估 AI 风控方案，给出自研/外采与分阶段落地建议。</w:t>
+        <w:t xml:space="preserve">并按根因回流需求；评估 AI 风控方案，给出自研/外采与分阶段落地建议。</w:t>
       </w:r>
     </w:p>
     <w:p>
@@ -1667,56 +1667,20 @@
           <w:sz w:val="19"/>
           <w:szCs w:val="19"/>
         </w:rPr>
-        <w:t xml:space="preserve">背景与目标：</w:t>
-      </w:r>
-      <w:r>
-        <w:rPr>
-          <w:rFonts w:ascii="Times New Roman" w:cs="Times New Roman" w:eastAsia="Microsoft YaHei" w:hAnsi="Times New Roman"/>
-          <w:b w:val="false"/>
-          <w:bCs w:val="false"/>
-          <w:i w:val="false"/>
-          <w:iCs w:val="false"/>
-          <w:color w:val="151515"/>
-          <w:sz w:val="19"/>
-          <w:szCs w:val="19"/>
-        </w:rPr>
-        <w:t xml:space="preserve">AI 应用公司同质化严重，难判断哪些能在客户侧落地并持续付费；目标是找出可交付、可定价的 AI 增量。</w:t>
-      </w:r>
-    </w:p>
-    <w:p>
-      <w:pPr>
-        <w:pStyle w:val="ListParagraph"/>
-        <w:numPr>
-          <w:ilvl w:val="0"/>
-          <w:numId w:val="2"/>
-        </w:numPr>
-        <w:spacing w:line="240" w:lineRule="exact"/>
-      </w:pPr>
-      <w:r>
-        <w:rPr>
-          <w:rFonts w:ascii="Times New Roman" w:cs="Times New Roman" w:eastAsia="Microsoft YaHei" w:hAnsi="Times New Roman"/>
-          <w:b/>
-          <w:bCs/>
-          <w:i w:val="false"/>
-          <w:iCs w:val="false"/>
-          <w:color w:val="151515"/>
-          <w:sz w:val="19"/>
-          <w:szCs w:val="19"/>
-        </w:rPr>
-        <w:t xml:space="preserve">我的职责：</w:t>
-      </w:r>
-      <w:r>
-        <w:rPr>
-          <w:rFonts w:ascii="Times New Roman" w:cs="Times New Roman" w:eastAsia="Microsoft YaHei" w:hAnsi="Times New Roman"/>
-          <w:b w:val="false"/>
-          <w:bCs w:val="false"/>
-          <w:i w:val="false"/>
-          <w:iCs w:val="false"/>
-          <w:color w:val="151515"/>
-          <w:sz w:val="19"/>
-          <w:szCs w:val="19"/>
-        </w:rPr>
-        <w:t xml:space="preserve">用</w:t>
+        <w:t xml:space="preserve">背景与职责：</w:t>
+      </w:r>
+      <w:r>
+        <w:rPr>
+          <w:rFonts w:ascii="Times New Roman" w:cs="Times New Roman" w:eastAsia="Microsoft YaHei" w:hAnsi="Times New Roman"/>
+          <w:b w:val="false"/>
+          <w:bCs w:val="false"/>
+          <w:i w:val="false"/>
+          <w:iCs w:val="false"/>
+          <w:color w:val="151515"/>
+          <w:sz w:val="19"/>
+          <w:szCs w:val="19"/>
+        </w:rPr>
+        <w:t xml:space="preserve">AI 应用同质化、难判断能否在客户侧落地，我用</w:t>
       </w:r>
       <w:r>
         <w:rPr>
@@ -1742,7 +1706,7 @@
           <w:sz w:val="19"/>
           <w:szCs w:val="19"/>
         </w:rPr>
-        <w:t xml:space="preserve">现有解法 </w:t>
+        <w:t xml:space="preserve">现有解法</w:t>
       </w:r>
       <w:r>
         <w:rPr>
@@ -1768,7 +1732,7 @@
           <w:sz w:val="19"/>
           <w:szCs w:val="19"/>
         </w:rPr>
-        <w:t xml:space="preserve"> AI 增量 </w:t>
+        <w:t xml:space="preserve">AI 增量</w:t>
       </w:r>
       <w:r>
         <w:rPr>
@@ -1794,7 +1758,7 @@
           <w:sz w:val="19"/>
           <w:szCs w:val="19"/>
         </w:rPr>
-        <w:t xml:space="preserve"> 可定价性</w:t>
+        <w:t xml:space="preserve">可定价性</w:t>
       </w:r>
       <w:r>
         <w:rPr>
@@ -1820,33 +1784,33 @@
           <w:sz w:val="19"/>
           <w:szCs w:val="19"/>
         </w:rPr>
-        <w:t xml:space="preserve">拆解客户场景，</w:t>
-      </w:r>
-      <w:r>
-        <w:rPr>
-          <w:rFonts w:ascii="Times New Roman" w:cs="Times New Roman" w:eastAsia="Microsoft YaHei" w:hAnsi="Times New Roman"/>
-          <w:b/>
-          <w:bCs/>
-          <w:i w:val="false"/>
-          <w:iCs w:val="false"/>
-          <w:color w:val="151515"/>
-          <w:sz w:val="19"/>
-          <w:szCs w:val="19"/>
-        </w:rPr>
-        <w:t xml:space="preserve">每周更新 AI 赛道地图</w:t>
-      </w:r>
-      <w:r>
-        <w:rPr>
-          <w:rFonts w:ascii="Times New Roman" w:cs="Times New Roman" w:eastAsia="Microsoft YaHei" w:hAnsi="Times New Roman"/>
-          <w:b w:val="false"/>
-          <w:bCs w:val="false"/>
-          <w:i w:val="false"/>
-          <w:iCs w:val="false"/>
-          <w:color w:val="151515"/>
-          <w:sz w:val="19"/>
-          <w:szCs w:val="19"/>
-        </w:rPr>
-        <w:t xml:space="preserve">；围绕功能边界、交付方式与定价建竞品矩阵，用客户结构与续费信号交叉验证。</w:t>
+        <w:t xml:space="preserve">拆解场景，</w:t>
+      </w:r>
+      <w:r>
+        <w:rPr>
+          <w:rFonts w:ascii="Times New Roman" w:cs="Times New Roman" w:eastAsia="Microsoft YaHei" w:hAnsi="Times New Roman"/>
+          <w:b/>
+          <w:bCs/>
+          <w:i w:val="false"/>
+          <w:iCs w:val="false"/>
+          <w:color w:val="151515"/>
+          <w:sz w:val="19"/>
+          <w:szCs w:val="19"/>
+        </w:rPr>
+        <w:t xml:space="preserve">每周更新赛道地图</w:t>
+      </w:r>
+      <w:r>
+        <w:rPr>
+          <w:rFonts w:ascii="Times New Roman" w:cs="Times New Roman" w:eastAsia="Microsoft YaHei" w:hAnsi="Times New Roman"/>
+          <w:b w:val="false"/>
+          <w:bCs w:val="false"/>
+          <w:i w:val="false"/>
+          <w:iCs w:val="false"/>
+          <w:color w:val="151515"/>
+          <w:sz w:val="19"/>
+          <w:szCs w:val="19"/>
+        </w:rPr>
+        <w:t xml:space="preserve">，按交付方式与定价建竞品矩阵，用续费信号交叉验证。</w:t>
       </w:r>
     </w:p>
     <w:p>
@@ -2784,7 +2748,7 @@
           <w:sz w:val="29"/>
           <w:szCs w:val="29"/>
         </w:rPr>
-        <w:t xml:space="preserve">AI Startup &amp; 真实场景项目</w:t>
+        <w:t xml:space="preserve">AI Startup &amp; Field Projects</w:t>
       </w:r>
     </w:p>
     <w:p>
@@ -2941,7 +2905,7 @@
         </w:rPr>
         <w:t xml:space="preserve">	</w:t>
       </w:r>
-      <w:hyperlink w:history="1" r:id="rId-guixz9rb2aoxpysrsw1l">
+      <w:hyperlink w:history="1" r:id="rIdws3covjqttu3irnyzc3ah">
         <w:r>
           <w:rPr>
             <w:rFonts w:ascii="Times New Roman" w:cs="Times New Roman" w:eastAsia="Microsoft YaHei" w:hAnsi="Times New Roman"/>
@@ -2982,7 +2946,7 @@
           <w:t xml:space="preserve">   </w:t>
         </w:r>
       </w:hyperlink>
-      <w:hyperlink w:history="1" r:id="rIddeptje4apptea32s4nszv">
+      <w:hyperlink w:history="1" r:id="rIdo70bvdud7pcj2pc42_kna">
         <w:r>
           <w:rPr>
             <w:rFonts w:ascii="Times New Roman" w:cs="Times New Roman" w:eastAsia="Microsoft YaHei" w:hAnsi="Times New Roman"/>
@@ -3537,7 +3501,7 @@
           <w:sz w:val="19"/>
           <w:szCs w:val="19"/>
         </w:rPr>
-        <w:t xml:space="preserve">（含 8 位企业安全负责人），满意度 4.2/5、4.5/5，</w:t>
+        <w:t xml:space="preserve">（含 8 位企业负责人），满意度 4.2/5、4.5/5，</w:t>
       </w:r>
       <w:r>
         <w:rPr>
@@ -3659,13 +3623,26 @@
           <w:sz w:val="20"/>
           <w:szCs w:val="20"/>
         </w:rPr>
-        <w:t xml:space="preserve">Chaoshan Deli Chain (Guangxi) </w:t>
-      </w:r>
-      <w:r>
-        <w:rPr>
-          <w:rFonts w:ascii="Times New Roman" w:cs="Times New Roman" w:eastAsia="Times New Roman" w:hAnsi="Times New Roman"/>
-          <w:b/>
-          <w:bCs/>
+        <w:t xml:space="preserve">Hengqin Industrial Asset Revitalization (Family Business)</w:t>
+      </w:r>
+      <w:r>
+        <w:rPr>
+          <w:rFonts w:ascii="Times New Roman" w:cs="Times New Roman" w:eastAsia="Microsoft YaHei" w:hAnsi="Times New Roman"/>
+          <w:b w:val="false"/>
+          <w:bCs w:val="false"/>
+          <w:i w:val="false"/>
+          <w:iCs w:val="false"/>
+          <w:color w:val="151515"/>
+          <w:sz w:val="20"/>
+          <w:szCs w:val="20"/>
+        </w:rPr>
+        <w:t xml:space="preserve">  </w:t>
+      </w:r>
+      <w:r>
+        <w:rPr>
+          <w:rFonts w:ascii="Times New Roman" w:cs="Times New Roman" w:eastAsia="Times New Roman" w:hAnsi="Times New Roman"/>
+          <w:b w:val="false"/>
+          <w:bCs w:val="false"/>
           <w:i w:val="false"/>
           <w:iCs w:val="false"/>
           <w:color w:val="151515"/>
@@ -3677,45 +3654,6 @@
       <w:r>
         <w:rPr>
           <w:rFonts w:ascii="Times New Roman" w:cs="Times New Roman" w:eastAsia="Microsoft YaHei" w:hAnsi="Times New Roman"/>
-          <w:b/>
-          <w:bCs/>
-          <w:i w:val="false"/>
-          <w:iCs w:val="false"/>
-          <w:color w:val="151515"/>
-          <w:sz w:val="20"/>
-          <w:szCs w:val="20"/>
-        </w:rPr>
-        <w:t xml:space="preserve"> 线下门店 0</w:t>
-      </w:r>
-      <w:r>
-        <w:rPr>
-          <w:rFonts w:ascii="Times New Roman" w:cs="Times New Roman" w:eastAsia="Times New Roman" w:hAnsi="Times New Roman"/>
-          <w:b/>
-          <w:bCs/>
-          <w:i w:val="false"/>
-          <w:iCs w:val="false"/>
-          <w:color w:val="151515"/>
-          <w:sz w:val="20"/>
-          <w:szCs w:val="20"/>
-        </w:rPr>
-        <w:t xml:space="preserve">→</w:t>
-      </w:r>
-      <w:r>
-        <w:rPr>
-          <w:rFonts w:ascii="Times New Roman" w:cs="Times New Roman" w:eastAsia="Microsoft YaHei" w:hAnsi="Times New Roman"/>
-          <w:b/>
-          <w:bCs/>
-          <w:i w:val="false"/>
-          <w:iCs w:val="false"/>
-          <w:color w:val="151515"/>
-          <w:sz w:val="20"/>
-          <w:szCs w:val="20"/>
-        </w:rPr>
-        <w:t xml:space="preserve">1 落地</w:t>
-      </w:r>
-      <w:r>
-        <w:rPr>
-          <w:rFonts w:ascii="Times New Roman" w:cs="Times New Roman" w:eastAsia="Microsoft YaHei" w:hAnsi="Times New Roman"/>
           <w:b w:val="false"/>
           <w:bCs w:val="false"/>
           <w:i w:val="false"/>
@@ -3728,42 +3666,16 @@
       </w:r>
       <w:r>
         <w:rPr>
-          <w:rFonts w:ascii="Times New Roman" w:cs="Times New Roman" w:eastAsia="Times New Roman" w:hAnsi="Times New Roman"/>
-          <w:b w:val="false"/>
-          <w:bCs w:val="false"/>
-          <w:i w:val="false"/>
-          <w:iCs w:val="false"/>
-          <w:color w:val="151515"/>
-          <w:sz w:val="20"/>
-          <w:szCs w:val="20"/>
-        </w:rPr>
-        <w:t xml:space="preserve">·</w:t>
-      </w:r>
-      <w:r>
-        <w:rPr>
-          <w:rFonts w:ascii="Times New Roman" w:cs="Times New Roman" w:eastAsia="Microsoft YaHei" w:hAnsi="Times New Roman"/>
-          <w:b w:val="false"/>
-          <w:bCs w:val="false"/>
-          <w:i w:val="false"/>
-          <w:iCs w:val="false"/>
-          <w:color w:val="151515"/>
-          <w:sz w:val="20"/>
-          <w:szCs w:val="20"/>
-        </w:rPr>
-        <w:t xml:space="preserve">  </w:t>
-      </w:r>
-      <w:r>
-        <w:rPr>
-          <w:rFonts w:ascii="Times New Roman" w:cs="Times New Roman" w:eastAsia="Microsoft YaHei" w:hAnsi="Times New Roman"/>
-          <w:b/>
-          <w:bCs/>
-          <w:i w:val="false"/>
-          <w:iCs w:val="false"/>
-          <w:color w:val="151515"/>
-          <w:sz w:val="20"/>
-          <w:szCs w:val="20"/>
-        </w:rPr>
-        <w:t xml:space="preserve">Project Lead</w:t>
+          <w:rFonts w:ascii="Times New Roman" w:cs="Times New Roman" w:eastAsia="Microsoft YaHei" w:hAnsi="Times New Roman"/>
+          <w:b/>
+          <w:bCs/>
+          <w:i w:val="false"/>
+          <w:iCs w:val="false"/>
+          <w:color w:val="151515"/>
+          <w:sz w:val="20"/>
+          <w:szCs w:val="20"/>
+        </w:rPr>
+        <w:t xml:space="preserve">Solution Lead</w:t>
       </w:r>
       <w:r>
         <w:rPr>
@@ -3783,7 +3695,7 @@
           <w:sz w:val="19"/>
           <w:szCs w:val="19"/>
         </w:rPr>
-        <w:t xml:space="preserve">2026 </w:t>
+        <w:t xml:space="preserve">2021 </w:t>
       </w:r>
       <w:r>
         <w:rPr>
@@ -3827,7 +3739,7 @@
           <w:sz w:val="20"/>
           <w:szCs w:val="20"/>
         </w:rPr>
-        <w:t xml:space="preserve">社区直营小店落地</w:t>
+        <w:t xml:space="preserve">产业资产尽调与盘活</w:t>
       </w:r>
       <w:r>
         <w:rPr>
@@ -3853,7 +3765,7 @@
           <w:sz w:val="20"/>
           <w:szCs w:val="20"/>
         </w:rPr>
-        <w:t xml:space="preserve">远程勘测 </w:t>
+        <w:t xml:space="preserve">需求发现 </w:t>
       </w:r>
       <w:r>
         <w:rPr>
@@ -3879,7 +3791,7 @@
           <w:sz w:val="20"/>
           <w:szCs w:val="20"/>
         </w:rPr>
-        <w:t xml:space="preserve"> 方案设计 </w:t>
+        <w:t xml:space="preserve"> 证据建模 </w:t>
       </w:r>
       <w:r>
         <w:rPr>
@@ -3905,7 +3817,7 @@
           <w:sz w:val="20"/>
           <w:szCs w:val="20"/>
         </w:rPr>
-        <w:t xml:space="preserve"> 采购施工 </w:t>
+        <w:t xml:space="preserve"> 方案比选 </w:t>
       </w:r>
       <w:r>
         <w:rPr>
@@ -3931,7 +3843,7 @@
           <w:sz w:val="20"/>
           <w:szCs w:val="20"/>
         </w:rPr>
-        <w:t xml:space="preserve"> 试营业数据复盘</w:t>
+        <w:t xml:space="preserve"> 落地推进</w:t>
       </w:r>
     </w:p>
     <w:p>
@@ -3954,72 +3866,150 @@
           <w:sz w:val="19"/>
           <w:szCs w:val="19"/>
         </w:rPr>
-        <w:t xml:space="preserve">现场诊断与方案：</w:t>
-      </w:r>
-      <w:r>
-        <w:rPr>
-          <w:rFonts w:ascii="Times New Roman" w:cs="Times New Roman" w:eastAsia="Microsoft YaHei" w:hAnsi="Times New Roman"/>
-          <w:b w:val="false"/>
-          <w:bCs w:val="false"/>
-          <w:i w:val="false"/>
-          <w:iCs w:val="false"/>
-          <w:color w:val="151515"/>
-          <w:sz w:val="19"/>
-          <w:szCs w:val="19"/>
-        </w:rPr>
-        <w:t xml:space="preserve">远程看现场视频、复尺定动线；开工前设许可、排风、电力、给排水 </w:t>
-      </w:r>
-      <w:r>
-        <w:rPr>
-          <w:rFonts w:ascii="Times New Roman" w:cs="Times New Roman" w:eastAsia="Microsoft YaHei" w:hAnsi="Times New Roman"/>
-          <w:b/>
-          <w:bCs/>
-          <w:i w:val="false"/>
-          <w:iCs w:val="false"/>
-          <w:color w:val="151515"/>
-          <w:sz w:val="19"/>
-          <w:szCs w:val="19"/>
-        </w:rPr>
-        <w:t xml:space="preserve">4 道核验门槛</w:t>
-      </w:r>
-      <w:r>
-        <w:rPr>
-          <w:rFonts w:ascii="Times New Roman" w:cs="Times New Roman" w:eastAsia="Microsoft YaHei" w:hAnsi="Times New Roman"/>
-          <w:b w:val="false"/>
-          <w:bCs w:val="false"/>
-          <w:i w:val="false"/>
-          <w:iCs w:val="false"/>
-          <w:color w:val="151515"/>
-          <w:sz w:val="19"/>
-          <w:szCs w:val="19"/>
-        </w:rPr>
-        <w:t xml:space="preserve">，导视按反馈迭代 </w:t>
-      </w:r>
-      <w:r>
-        <w:rPr>
-          <w:rFonts w:ascii="Times New Roman" w:cs="Times New Roman" w:eastAsia="Microsoft YaHei" w:hAnsi="Times New Roman"/>
-          <w:b/>
-          <w:bCs/>
-          <w:i w:val="false"/>
-          <w:iCs w:val="false"/>
-          <w:color w:val="151515"/>
-          <w:sz w:val="19"/>
-          <w:szCs w:val="19"/>
-        </w:rPr>
-        <w:t xml:space="preserve">6 版</w:t>
-      </w:r>
-      <w:r>
-        <w:rPr>
-          <w:rFonts w:ascii="Times New Roman" w:cs="Times New Roman" w:eastAsia="Microsoft YaHei" w:hAnsi="Times New Roman"/>
-          <w:b w:val="false"/>
-          <w:bCs w:val="false"/>
-          <w:i w:val="false"/>
-          <w:iCs w:val="false"/>
-          <w:color w:val="151515"/>
-          <w:sz w:val="19"/>
-          <w:szCs w:val="19"/>
-        </w:rPr>
-        <w:t xml:space="preserve">。</w:t>
+        <w:t xml:space="preserve">背景与目标：</w:t>
+      </w:r>
+      <w:r>
+        <w:rPr>
+          <w:rFonts w:ascii="Times New Roman" w:cs="Times New Roman" w:eastAsia="Microsoft YaHei" w:hAnsi="Times New Roman"/>
+          <w:b w:val="false"/>
+          <w:bCs w:val="false"/>
+          <w:i w:val="false"/>
+          <w:iCs w:val="false"/>
+          <w:color w:val="151515"/>
+          <w:sz w:val="19"/>
+          <w:szCs w:val="19"/>
+        </w:rPr>
+        <w:t xml:space="preserve">约 </w:t>
+      </w:r>
+      <w:r>
+        <w:rPr>
+          <w:rFonts w:ascii="Times New Roman" w:cs="Times New Roman" w:eastAsia="Microsoft YaHei" w:hAnsi="Times New Roman"/>
+          <w:b/>
+          <w:bCs/>
+          <w:i w:val="false"/>
+          <w:iCs w:val="false"/>
+          <w:color w:val="151515"/>
+          <w:sz w:val="19"/>
+          <w:szCs w:val="19"/>
+        </w:rPr>
+        <w:t xml:space="preserve">26,500㎡</w:t>
+      </w:r>
+      <w:r>
+        <w:rPr>
+          <w:rFonts w:ascii="Times New Roman" w:cs="Times New Roman" w:eastAsia="Microsoft YaHei" w:hAnsi="Times New Roman"/>
+          <w:b w:val="false"/>
+          <w:bCs w:val="false"/>
+          <w:i w:val="false"/>
+          <w:iCs w:val="false"/>
+          <w:color w:val="151515"/>
+          <w:sz w:val="19"/>
+          <w:szCs w:val="19"/>
+        </w:rPr>
+        <w:t xml:space="preserve"> 产业厂房年租金约 </w:t>
+      </w:r>
+      <w:r>
+        <w:rPr>
+          <w:rFonts w:ascii="Times New Roman" w:cs="Times New Roman" w:eastAsia="Microsoft YaHei" w:hAnsi="Times New Roman"/>
+          <w:b/>
+          <w:bCs/>
+          <w:i w:val="false"/>
+          <w:iCs w:val="false"/>
+          <w:color w:val="151515"/>
+          <w:sz w:val="19"/>
+          <w:szCs w:val="19"/>
+        </w:rPr>
+        <w:t xml:space="preserve">700</w:t>
+      </w:r>
+      <w:r>
+        <w:rPr>
+          <w:rFonts w:ascii="Times New Roman" w:cs="Times New Roman" w:eastAsia="Times New Roman" w:hAnsi="Times New Roman"/>
+          <w:b/>
+          <w:bCs/>
+          <w:i w:val="false"/>
+          <w:iCs w:val="false"/>
+          <w:color w:val="151515"/>
+          <w:sz w:val="19"/>
+          <w:szCs w:val="19"/>
+        </w:rPr>
+        <w:t xml:space="preserve">–</w:t>
+      </w:r>
+      <w:r>
+        <w:rPr>
+          <w:rFonts w:ascii="Times New Roman" w:cs="Times New Roman" w:eastAsia="Microsoft YaHei" w:hAnsi="Times New Roman"/>
+          <w:b/>
+          <w:bCs/>
+          <w:i w:val="false"/>
+          <w:iCs w:val="false"/>
+          <w:color w:val="151515"/>
+          <w:sz w:val="19"/>
+          <w:szCs w:val="19"/>
+        </w:rPr>
+        <w:t xml:space="preserve">800 万元</w:t>
+      </w:r>
+      <w:r>
+        <w:rPr>
+          <w:rFonts w:ascii="Times New Roman" w:cs="Times New Roman" w:eastAsia="Microsoft YaHei" w:hAnsi="Times New Roman"/>
+          <w:b w:val="false"/>
+          <w:bCs w:val="false"/>
+          <w:i w:val="false"/>
+          <w:iCs w:val="false"/>
+          <w:color w:val="151515"/>
+          <w:sz w:val="19"/>
+          <w:szCs w:val="19"/>
+        </w:rPr>
+        <w:t xml:space="preserve">，但权属材料分散、历史出资与名义签约主体不一致、盘活路径不清；目标是把</w:t>
+      </w:r>
+      <w:r>
+        <w:rPr>
+          <w:rFonts w:ascii="Times New Roman" w:cs="Times New Roman" w:eastAsia="Times New Roman" w:hAnsi="Times New Roman"/>
+          <w:b w:val="false"/>
+          <w:bCs w:val="false"/>
+          <w:i w:val="false"/>
+          <w:iCs w:val="false"/>
+          <w:color w:val="151515"/>
+          <w:sz w:val="19"/>
+          <w:szCs w:val="19"/>
+        </w:rPr>
+        <w:t xml:space="preserve">“</w:t>
+      </w:r>
+      <w:r>
+        <w:rPr>
+          <w:rFonts w:ascii="Times New Roman" w:cs="Times New Roman" w:eastAsia="Microsoft YaHei" w:hAnsi="Times New Roman"/>
+          <w:b w:val="false"/>
+          <w:bCs w:val="false"/>
+          <w:i w:val="false"/>
+          <w:iCs w:val="false"/>
+          <w:color w:val="151515"/>
+          <w:sz w:val="19"/>
+          <w:szCs w:val="19"/>
+        </w:rPr>
+        <w:t xml:space="preserve">盘活还是出售</w:t>
+      </w:r>
+      <w:r>
+        <w:rPr>
+          <w:rFonts w:ascii="Times New Roman" w:cs="Times New Roman" w:eastAsia="Times New Roman" w:hAnsi="Times New Roman"/>
+          <w:b w:val="false"/>
+          <w:bCs w:val="false"/>
+          <w:i w:val="false"/>
+          <w:iCs w:val="false"/>
+          <w:color w:val="151515"/>
+          <w:sz w:val="19"/>
+          <w:szCs w:val="19"/>
+        </w:rPr>
+        <w:t xml:space="preserve">”</w:t>
+      </w:r>
+      <w:r>
+        <w:rPr>
+          <w:rFonts w:ascii="Times New Roman" w:cs="Times New Roman" w:eastAsia="Microsoft YaHei" w:hAnsi="Times New Roman"/>
+          <w:b w:val="false"/>
+          <w:bCs w:val="false"/>
+          <w:i w:val="false"/>
+          <w:iCs w:val="false"/>
+          <w:color w:val="151515"/>
+          <w:sz w:val="19"/>
+          <w:szCs w:val="19"/>
+        </w:rPr>
+        <w:t xml:space="preserve">变成可执行方案。</w:t>
       </w:r>
     </w:p>
     <w:p>
@@ -4042,72 +4032,108 @@
           <w:sz w:val="19"/>
           <w:szCs w:val="19"/>
         </w:rPr>
-        <w:t xml:space="preserve">落地与运营：</w:t>
-      </w:r>
-      <w:r>
-        <w:rPr>
-          <w:rFonts w:ascii="Times New Roman" w:cs="Times New Roman" w:eastAsia="Microsoft YaHei" w:hAnsi="Times New Roman"/>
-          <w:b w:val="false"/>
-          <w:bCs w:val="false"/>
-          <w:i w:val="false"/>
-          <w:iCs w:val="false"/>
-          <w:color w:val="151515"/>
-          <w:sz w:val="19"/>
-          <w:szCs w:val="19"/>
-        </w:rPr>
-        <w:t xml:space="preserve">制定三家同规格比价与施工</w:t>
-      </w:r>
-      <w:r>
-        <w:rPr>
-          <w:rFonts w:ascii="Times New Roman" w:cs="Times New Roman" w:eastAsia="Times New Roman" w:hAnsi="Times New Roman"/>
-          <w:b w:val="false"/>
-          <w:bCs w:val="false"/>
-          <w:i w:val="false"/>
-          <w:iCs w:val="false"/>
-          <w:color w:val="151515"/>
-          <w:sz w:val="19"/>
-          <w:szCs w:val="19"/>
-        </w:rPr>
-        <w:t xml:space="preserve">—</w:t>
-      </w:r>
-      <w:r>
-        <w:rPr>
-          <w:rFonts w:ascii="Times New Roman" w:cs="Times New Roman" w:eastAsia="Microsoft YaHei" w:hAnsi="Times New Roman"/>
-          <w:b w:val="false"/>
-          <w:bCs w:val="false"/>
-          <w:i w:val="false"/>
-          <w:iCs w:val="false"/>
-          <w:color w:val="151515"/>
-          <w:sz w:val="19"/>
-          <w:szCs w:val="19"/>
-        </w:rPr>
-        <w:t xml:space="preserve">联调</w:t>
-      </w:r>
-      <w:r>
-        <w:rPr>
-          <w:rFonts w:ascii="Times New Roman" w:cs="Times New Roman" w:eastAsia="Times New Roman" w:hAnsi="Times New Roman"/>
-          <w:b w:val="false"/>
-          <w:bCs w:val="false"/>
-          <w:i w:val="false"/>
-          <w:iCs w:val="false"/>
-          <w:color w:val="151515"/>
-          <w:sz w:val="19"/>
-          <w:szCs w:val="19"/>
-        </w:rPr>
-        <w:t xml:space="preserve">—</w:t>
-      </w:r>
-      <w:r>
-        <w:rPr>
-          <w:rFonts w:ascii="Times New Roman" w:cs="Times New Roman" w:eastAsia="Microsoft YaHei" w:hAnsi="Times New Roman"/>
-          <w:b w:val="false"/>
-          <w:bCs w:val="false"/>
-          <w:i w:val="false"/>
-          <w:iCs w:val="false"/>
-          <w:color w:val="151515"/>
-          <w:sz w:val="19"/>
-          <w:szCs w:val="19"/>
-        </w:rPr>
-        <w:t xml:space="preserve">热态测试计划；设计门店日报口径（SKU 销量、成本、报损、现金差异）。</w:t>
+        <w:t xml:space="preserve">我的职责：</w:t>
+      </w:r>
+      <w:r>
+        <w:rPr>
+          <w:rFonts w:ascii="Times New Roman" w:cs="Times New Roman" w:eastAsia="Microsoft YaHei" w:hAnsi="Times New Roman"/>
+          <w:b w:val="false"/>
+          <w:bCs w:val="false"/>
+          <w:i w:val="false"/>
+          <w:iCs w:val="false"/>
+          <w:color w:val="151515"/>
+          <w:sz w:val="19"/>
+          <w:szCs w:val="19"/>
+        </w:rPr>
+        <w:t xml:space="preserve">访谈合作方、继承人、村集体、租户及律师/会计师，绘制相关方关系图；整合合作建房协议、出资流水与工程付款，建立</w:t>
+      </w:r>
+      <w:r>
+        <w:rPr>
+          <w:rFonts w:ascii="Times New Roman" w:cs="Times New Roman" w:eastAsia="Microsoft YaHei" w:hAnsi="Times New Roman"/>
+          <w:b/>
+          <w:bCs/>
+          <w:i w:val="false"/>
+          <w:iCs w:val="false"/>
+          <w:color w:val="151515"/>
+          <w:sz w:val="19"/>
+          <w:szCs w:val="19"/>
+        </w:rPr>
+        <w:t xml:space="preserve">证据台账</w:t>
+      </w:r>
+      <w:r>
+        <w:rPr>
+          <w:rFonts w:ascii="Times New Roman" w:cs="Times New Roman" w:eastAsia="Microsoft YaHei" w:hAnsi="Times New Roman"/>
+          <w:b w:val="false"/>
+          <w:bCs w:val="false"/>
+          <w:i w:val="false"/>
+          <w:iCs w:val="false"/>
+          <w:color w:val="151515"/>
+          <w:sz w:val="19"/>
+          <w:szCs w:val="19"/>
+        </w:rPr>
+        <w:t xml:space="preserve">与待核查责任清单。</w:t>
+      </w:r>
+    </w:p>
+    <w:p>
+      <w:pPr>
+        <w:pStyle w:val="ListParagraph"/>
+        <w:numPr>
+          <w:ilvl w:val="0"/>
+          <w:numId w:val="2"/>
+        </w:numPr>
+        <w:spacing w:line="240" w:lineRule="exact"/>
+      </w:pPr>
+      <w:r>
+        <w:rPr>
+          <w:rFonts w:ascii="Times New Roman" w:cs="Times New Roman" w:eastAsia="Microsoft YaHei" w:hAnsi="Times New Roman"/>
+          <w:b/>
+          <w:bCs/>
+          <w:i w:val="false"/>
+          <w:iCs w:val="false"/>
+          <w:color w:val="151515"/>
+          <w:sz w:val="19"/>
+          <w:szCs w:val="19"/>
+        </w:rPr>
+        <w:t xml:space="preserve">交付与结果：</w:t>
+      </w:r>
+      <w:r>
+        <w:rPr>
+          <w:rFonts w:ascii="Times New Roman" w:cs="Times New Roman" w:eastAsia="Microsoft YaHei" w:hAnsi="Times New Roman"/>
+          <w:b w:val="false"/>
+          <w:bCs w:val="false"/>
+          <w:i w:val="false"/>
+          <w:iCs w:val="false"/>
+          <w:color w:val="151515"/>
+          <w:sz w:val="19"/>
+          <w:szCs w:val="19"/>
+        </w:rPr>
+        <w:t xml:space="preserve">搭建继续持有、主体重组、整体出售的</w:t>
+      </w:r>
+      <w:r>
+        <w:rPr>
+          <w:rFonts w:ascii="Times New Roman" w:cs="Times New Roman" w:eastAsia="Microsoft YaHei" w:hAnsi="Times New Roman"/>
+          <w:b/>
+          <w:bCs/>
+          <w:i w:val="false"/>
+          <w:iCs w:val="false"/>
+          <w:color w:val="151515"/>
+          <w:sz w:val="19"/>
+          <w:szCs w:val="19"/>
+        </w:rPr>
+        <w:t xml:space="preserve">多路径决策模型</w:t>
+      </w:r>
+      <w:r>
+        <w:rPr>
+          <w:rFonts w:ascii="Times New Roman" w:cs="Times New Roman" w:eastAsia="Microsoft YaHei" w:hAnsi="Times New Roman"/>
+          <w:b w:val="false"/>
+          <w:bCs w:val="false"/>
+          <w:i w:val="false"/>
+          <w:iCs w:val="false"/>
+          <w:color w:val="151515"/>
+          <w:sz w:val="19"/>
+          <w:szCs w:val="19"/>
+        </w:rPr>
+        <w:t xml:space="preserve">（现金流、风险、周期），把法律与财务意见转成 30/60/90 天路线图，推动项目进入材料补全与交易准备。</w:t>
       </w:r>
     </w:p>
     <w:p>
@@ -4122,7 +4148,7 @@
       <w:r>
         <w:drawing>
           <wp:inline distT="0" distB="0" distL="0" distR="0">
-            <wp:extent cx="152400" cy="133350"/>
+            <wp:extent cx="152400" cy="152400"/>
             <wp:effectExtent t="0" r="0" b="0" l="0"/>
             <wp:docPr id="1" name="" descr="" title=""/>
             <wp:cNvGraphicFramePr>
@@ -4147,6 +4173,524 @@
                   <pic:spPr bwMode="auto">
                     <a:xfrm>
                       <a:off x="0" y="0"/>
+                      <a:ext cx="152400" cy="152400"/>
+                    </a:xfrm>
+                    <a:prstGeom prst="rect">
+                      <a:avLst/>
+                    </a:prstGeom>
+                  </pic:spPr>
+                </pic:pic>
+              </a:graphicData>
+            </a:graphic>
+          </wp:inline>
+        </w:drawing>
+      </w:r>
+      <w:r>
+        <w:rPr>
+          <w:sz w:val="20"/>
+          <w:szCs w:val="20"/>
+        </w:rPr>
+        <w:t xml:space="preserve">  </w:t>
+      </w:r>
+      <w:r>
+        <w:rPr>
+          <w:rFonts w:ascii="Times New Roman" w:cs="Times New Roman" w:eastAsia="Microsoft YaHei" w:hAnsi="Times New Roman"/>
+          <w:b/>
+          <w:bCs/>
+          <w:i w:val="false"/>
+          <w:iCs w:val="false"/>
+          <w:color w:val="151515"/>
+          <w:sz w:val="20"/>
+          <w:szCs w:val="20"/>
+        </w:rPr>
+        <w:t xml:space="preserve">Chaoshan Deli Chain (Guangxi) </w:t>
+      </w:r>
+      <w:r>
+        <w:rPr>
+          <w:rFonts w:ascii="Times New Roman" w:cs="Times New Roman" w:eastAsia="Times New Roman" w:hAnsi="Times New Roman"/>
+          <w:b/>
+          <w:bCs/>
+          <w:i w:val="false"/>
+          <w:iCs w:val="false"/>
+          <w:color w:val="151515"/>
+          <w:sz w:val="20"/>
+          <w:szCs w:val="20"/>
+        </w:rPr>
+        <w:t xml:space="preserve">·</w:t>
+      </w:r>
+      <w:r>
+        <w:rPr>
+          <w:rFonts w:ascii="Times New Roman" w:cs="Times New Roman" w:eastAsia="Microsoft YaHei" w:hAnsi="Times New Roman"/>
+          <w:b/>
+          <w:bCs/>
+          <w:i w:val="false"/>
+          <w:iCs w:val="false"/>
+          <w:color w:val="151515"/>
+          <w:sz w:val="20"/>
+          <w:szCs w:val="20"/>
+        </w:rPr>
+        <w:t xml:space="preserve"> 线下门店 0</w:t>
+      </w:r>
+      <w:r>
+        <w:rPr>
+          <w:rFonts w:ascii="Times New Roman" w:cs="Times New Roman" w:eastAsia="Times New Roman" w:hAnsi="Times New Roman"/>
+          <w:b/>
+          <w:bCs/>
+          <w:i w:val="false"/>
+          <w:iCs w:val="false"/>
+          <w:color w:val="151515"/>
+          <w:sz w:val="20"/>
+          <w:szCs w:val="20"/>
+        </w:rPr>
+        <w:t xml:space="preserve">→</w:t>
+      </w:r>
+      <w:r>
+        <w:rPr>
+          <w:rFonts w:ascii="Times New Roman" w:cs="Times New Roman" w:eastAsia="Microsoft YaHei" w:hAnsi="Times New Roman"/>
+          <w:b/>
+          <w:bCs/>
+          <w:i w:val="false"/>
+          <w:iCs w:val="false"/>
+          <w:color w:val="151515"/>
+          <w:sz w:val="20"/>
+          <w:szCs w:val="20"/>
+        </w:rPr>
+        <w:t xml:space="preserve">1 落地</w:t>
+      </w:r>
+      <w:r>
+        <w:rPr>
+          <w:rFonts w:ascii="Times New Roman" w:cs="Times New Roman" w:eastAsia="Microsoft YaHei" w:hAnsi="Times New Roman"/>
+          <w:b w:val="false"/>
+          <w:bCs w:val="false"/>
+          <w:i w:val="false"/>
+          <w:iCs w:val="false"/>
+          <w:color w:val="151515"/>
+          <w:sz w:val="20"/>
+          <w:szCs w:val="20"/>
+        </w:rPr>
+        <w:t xml:space="preserve">  </w:t>
+      </w:r>
+      <w:r>
+        <w:rPr>
+          <w:rFonts w:ascii="Times New Roman" w:cs="Times New Roman" w:eastAsia="Times New Roman" w:hAnsi="Times New Roman"/>
+          <w:b w:val="false"/>
+          <w:bCs w:val="false"/>
+          <w:i w:val="false"/>
+          <w:iCs w:val="false"/>
+          <w:color w:val="151515"/>
+          <w:sz w:val="20"/>
+          <w:szCs w:val="20"/>
+        </w:rPr>
+        <w:t xml:space="preserve">·</w:t>
+      </w:r>
+      <w:r>
+        <w:rPr>
+          <w:rFonts w:ascii="Times New Roman" w:cs="Times New Roman" w:eastAsia="Microsoft YaHei" w:hAnsi="Times New Roman"/>
+          <w:b w:val="false"/>
+          <w:bCs w:val="false"/>
+          <w:i w:val="false"/>
+          <w:iCs w:val="false"/>
+          <w:color w:val="151515"/>
+          <w:sz w:val="20"/>
+          <w:szCs w:val="20"/>
+        </w:rPr>
+        <w:t xml:space="preserve">  </w:t>
+      </w:r>
+      <w:r>
+        <w:rPr>
+          <w:rFonts w:ascii="Times New Roman" w:cs="Times New Roman" w:eastAsia="Microsoft YaHei" w:hAnsi="Times New Roman"/>
+          <w:b/>
+          <w:bCs/>
+          <w:i w:val="false"/>
+          <w:iCs w:val="false"/>
+          <w:color w:val="151515"/>
+          <w:sz w:val="20"/>
+          <w:szCs w:val="20"/>
+        </w:rPr>
+        <w:t xml:space="preserve">Project Lead</w:t>
+      </w:r>
+      <w:r>
+        <w:rPr>
+          <w:sz w:val="20"/>
+          <w:szCs w:val="20"/>
+        </w:rPr>
+        <w:t xml:space="preserve">	</w:t>
+      </w:r>
+      <w:r>
+        <w:rPr>
+          <w:rFonts w:ascii="Times New Roman" w:cs="Times New Roman" w:eastAsia="Microsoft YaHei" w:hAnsi="Times New Roman"/>
+          <w:b/>
+          <w:bCs/>
+          <w:i w:val="false"/>
+          <w:iCs w:val="false"/>
+          <w:color w:val="151515"/>
+          <w:sz w:val="19"/>
+          <w:szCs w:val="19"/>
+        </w:rPr>
+        <w:t xml:space="preserve">2026 </w:t>
+      </w:r>
+      <w:r>
+        <w:rPr>
+          <w:rFonts w:ascii="Times New Roman" w:cs="Times New Roman" w:eastAsia="Times New Roman" w:hAnsi="Times New Roman"/>
+          <w:b/>
+          <w:bCs/>
+          <w:i w:val="false"/>
+          <w:iCs w:val="false"/>
+          <w:color w:val="151515"/>
+          <w:sz w:val="19"/>
+          <w:szCs w:val="19"/>
+        </w:rPr>
+        <w:t xml:space="preserve">–</w:t>
+      </w:r>
+      <w:r>
+        <w:rPr>
+          <w:rFonts w:ascii="Times New Roman" w:cs="Times New Roman" w:eastAsia="Microsoft YaHei" w:hAnsi="Times New Roman"/>
+          <w:b/>
+          <w:bCs/>
+          <w:i w:val="false"/>
+          <w:iCs w:val="false"/>
+          <w:color w:val="151515"/>
+          <w:sz w:val="19"/>
+          <w:szCs w:val="19"/>
+        </w:rPr>
+        <w:t xml:space="preserve"> 至今</w:t>
+      </w:r>
+    </w:p>
+    <w:p>
+      <w:pPr>
+        <w:spacing w:before="20" w:line="252" w:lineRule="exact"/>
+      </w:pPr>
+      <w:r>
+        <w:rPr>
+          <w:rFonts w:ascii="Times New Roman" w:cs="Times New Roman" w:eastAsia="Microsoft YaHei" w:hAnsi="Times New Roman"/>
+          <w:b/>
+          <w:bCs/>
+          <w:i w:val="false"/>
+          <w:iCs w:val="false"/>
+          <w:color w:val="244B9B"/>
+          <w:sz w:val="20"/>
+          <w:szCs w:val="20"/>
+        </w:rPr>
+        <w:t xml:space="preserve">社区直营小店落地</w:t>
+      </w:r>
+      <w:r>
+        <w:rPr>
+          <w:rFonts w:ascii="Times New Roman" w:cs="Times New Roman" w:eastAsia="Microsoft YaHei" w:hAnsi="Times New Roman"/>
+          <w:b/>
+          <w:bCs/>
+          <w:i w:val="false"/>
+          <w:iCs w:val="false"/>
+          <w:color w:val="244B9B"/>
+          <w:sz w:val="20"/>
+          <w:szCs w:val="20"/>
+        </w:rPr>
+        <w:t xml:space="preserve">  |  </w:t>
+      </w:r>
+      <w:r>
+        <w:rPr>
+          <w:rFonts w:ascii="Times New Roman" w:cs="Times New Roman" w:eastAsia="Microsoft YaHei" w:hAnsi="Times New Roman"/>
+          <w:b/>
+          <w:bCs/>
+          <w:i w:val="false"/>
+          <w:iCs w:val="false"/>
+          <w:color w:val="244B9B"/>
+          <w:sz w:val="20"/>
+          <w:szCs w:val="20"/>
+        </w:rPr>
+        <w:t xml:space="preserve">远程勘测 </w:t>
+      </w:r>
+      <w:r>
+        <w:rPr>
+          <w:rFonts w:ascii="Times New Roman" w:cs="Times New Roman" w:eastAsia="Times New Roman" w:hAnsi="Times New Roman"/>
+          <w:b/>
+          <w:bCs/>
+          <w:i w:val="false"/>
+          <w:iCs w:val="false"/>
+          <w:color w:val="244B9B"/>
+          <w:sz w:val="20"/>
+          <w:szCs w:val="20"/>
+        </w:rPr>
+        <w:t xml:space="preserve">→</w:t>
+      </w:r>
+      <w:r>
+        <w:rPr>
+          <w:rFonts w:ascii="Times New Roman" w:cs="Times New Roman" w:eastAsia="Microsoft YaHei" w:hAnsi="Times New Roman"/>
+          <w:b/>
+          <w:bCs/>
+          <w:i w:val="false"/>
+          <w:iCs w:val="false"/>
+          <w:color w:val="244B9B"/>
+          <w:sz w:val="20"/>
+          <w:szCs w:val="20"/>
+        </w:rPr>
+        <w:t xml:space="preserve"> 方案设计 </w:t>
+      </w:r>
+      <w:r>
+        <w:rPr>
+          <w:rFonts w:ascii="Times New Roman" w:cs="Times New Roman" w:eastAsia="Times New Roman" w:hAnsi="Times New Roman"/>
+          <w:b/>
+          <w:bCs/>
+          <w:i w:val="false"/>
+          <w:iCs w:val="false"/>
+          <w:color w:val="244B9B"/>
+          <w:sz w:val="20"/>
+          <w:szCs w:val="20"/>
+        </w:rPr>
+        <w:t xml:space="preserve">→</w:t>
+      </w:r>
+      <w:r>
+        <w:rPr>
+          <w:rFonts w:ascii="Times New Roman" w:cs="Times New Roman" w:eastAsia="Microsoft YaHei" w:hAnsi="Times New Roman"/>
+          <w:b/>
+          <w:bCs/>
+          <w:i w:val="false"/>
+          <w:iCs w:val="false"/>
+          <w:color w:val="244B9B"/>
+          <w:sz w:val="20"/>
+          <w:szCs w:val="20"/>
+        </w:rPr>
+        <w:t xml:space="preserve"> 采购施工 </w:t>
+      </w:r>
+      <w:r>
+        <w:rPr>
+          <w:rFonts w:ascii="Times New Roman" w:cs="Times New Roman" w:eastAsia="Times New Roman" w:hAnsi="Times New Roman"/>
+          <w:b/>
+          <w:bCs/>
+          <w:i w:val="false"/>
+          <w:iCs w:val="false"/>
+          <w:color w:val="244B9B"/>
+          <w:sz w:val="20"/>
+          <w:szCs w:val="20"/>
+        </w:rPr>
+        <w:t xml:space="preserve">→</w:t>
+      </w:r>
+      <w:r>
+        <w:rPr>
+          <w:rFonts w:ascii="Times New Roman" w:cs="Times New Roman" w:eastAsia="Microsoft YaHei" w:hAnsi="Times New Roman"/>
+          <w:b/>
+          <w:bCs/>
+          <w:i w:val="false"/>
+          <w:iCs w:val="false"/>
+          <w:color w:val="244B9B"/>
+          <w:sz w:val="20"/>
+          <w:szCs w:val="20"/>
+        </w:rPr>
+        <w:t xml:space="preserve"> 试营业数据复盘</w:t>
+      </w:r>
+    </w:p>
+    <w:p>
+      <w:pPr>
+        <w:pStyle w:val="ListParagraph"/>
+        <w:numPr>
+          <w:ilvl w:val="0"/>
+          <w:numId w:val="2"/>
+        </w:numPr>
+        <w:spacing w:line="240" w:lineRule="exact"/>
+      </w:pPr>
+      <w:r>
+        <w:rPr>
+          <w:rFonts w:ascii="Times New Roman" w:cs="Times New Roman" w:eastAsia="Microsoft YaHei" w:hAnsi="Times New Roman"/>
+          <w:b/>
+          <w:bCs/>
+          <w:i w:val="false"/>
+          <w:iCs w:val="false"/>
+          <w:color w:val="151515"/>
+          <w:sz w:val="19"/>
+          <w:szCs w:val="19"/>
+        </w:rPr>
+        <w:t xml:space="preserve">现场诊断与方案：</w:t>
+      </w:r>
+      <w:r>
+        <w:rPr>
+          <w:rFonts w:ascii="Times New Roman" w:cs="Times New Roman" w:eastAsia="Microsoft YaHei" w:hAnsi="Times New Roman"/>
+          <w:b w:val="false"/>
+          <w:bCs w:val="false"/>
+          <w:i w:val="false"/>
+          <w:iCs w:val="false"/>
+          <w:color w:val="151515"/>
+          <w:sz w:val="19"/>
+          <w:szCs w:val="19"/>
+        </w:rPr>
+        <w:t xml:space="preserve">远程看现场视频、复尺定动线；开工前设许可、排风、电力、给排水 </w:t>
+      </w:r>
+      <w:r>
+        <w:rPr>
+          <w:rFonts w:ascii="Times New Roman" w:cs="Times New Roman" w:eastAsia="Microsoft YaHei" w:hAnsi="Times New Roman"/>
+          <w:b/>
+          <w:bCs/>
+          <w:i w:val="false"/>
+          <w:iCs w:val="false"/>
+          <w:color w:val="151515"/>
+          <w:sz w:val="19"/>
+          <w:szCs w:val="19"/>
+        </w:rPr>
+        <w:t xml:space="preserve">4 道核验门槛</w:t>
+      </w:r>
+      <w:r>
+        <w:rPr>
+          <w:rFonts w:ascii="Times New Roman" w:cs="Times New Roman" w:eastAsia="Microsoft YaHei" w:hAnsi="Times New Roman"/>
+          <w:b w:val="false"/>
+          <w:bCs w:val="false"/>
+          <w:i w:val="false"/>
+          <w:iCs w:val="false"/>
+          <w:color w:val="151515"/>
+          <w:sz w:val="19"/>
+          <w:szCs w:val="19"/>
+        </w:rPr>
+        <w:t xml:space="preserve">，导视按反馈迭代 </w:t>
+      </w:r>
+      <w:r>
+        <w:rPr>
+          <w:rFonts w:ascii="Times New Roman" w:cs="Times New Roman" w:eastAsia="Microsoft YaHei" w:hAnsi="Times New Roman"/>
+          <w:b/>
+          <w:bCs/>
+          <w:i w:val="false"/>
+          <w:iCs w:val="false"/>
+          <w:color w:val="151515"/>
+          <w:sz w:val="19"/>
+          <w:szCs w:val="19"/>
+        </w:rPr>
+        <w:t xml:space="preserve">6 版</w:t>
+      </w:r>
+      <w:r>
+        <w:rPr>
+          <w:rFonts w:ascii="Times New Roman" w:cs="Times New Roman" w:eastAsia="Microsoft YaHei" w:hAnsi="Times New Roman"/>
+          <w:b w:val="false"/>
+          <w:bCs w:val="false"/>
+          <w:i w:val="false"/>
+          <w:iCs w:val="false"/>
+          <w:color w:val="151515"/>
+          <w:sz w:val="19"/>
+          <w:szCs w:val="19"/>
+        </w:rPr>
+        <w:t xml:space="preserve">。</w:t>
+      </w:r>
+    </w:p>
+    <w:p>
+      <w:pPr>
+        <w:pStyle w:val="ListParagraph"/>
+        <w:numPr>
+          <w:ilvl w:val="0"/>
+          <w:numId w:val="2"/>
+        </w:numPr>
+        <w:spacing w:line="240" w:lineRule="exact"/>
+      </w:pPr>
+      <w:r>
+        <w:rPr>
+          <w:rFonts w:ascii="Times New Roman" w:cs="Times New Roman" w:eastAsia="Microsoft YaHei" w:hAnsi="Times New Roman"/>
+          <w:b/>
+          <w:bCs/>
+          <w:i w:val="false"/>
+          <w:iCs w:val="false"/>
+          <w:color w:val="151515"/>
+          <w:sz w:val="19"/>
+          <w:szCs w:val="19"/>
+        </w:rPr>
+        <w:t xml:space="preserve">落地与运营：</w:t>
+      </w:r>
+      <w:r>
+        <w:rPr>
+          <w:rFonts w:ascii="Times New Roman" w:cs="Times New Roman" w:eastAsia="Microsoft YaHei" w:hAnsi="Times New Roman"/>
+          <w:b w:val="false"/>
+          <w:bCs w:val="false"/>
+          <w:i w:val="false"/>
+          <w:iCs w:val="false"/>
+          <w:color w:val="151515"/>
+          <w:sz w:val="19"/>
+          <w:szCs w:val="19"/>
+        </w:rPr>
+        <w:t xml:space="preserve">制定三家同规格比价与施工</w:t>
+      </w:r>
+      <w:r>
+        <w:rPr>
+          <w:rFonts w:ascii="Times New Roman" w:cs="Times New Roman" w:eastAsia="Times New Roman" w:hAnsi="Times New Roman"/>
+          <w:b w:val="false"/>
+          <w:bCs w:val="false"/>
+          <w:i w:val="false"/>
+          <w:iCs w:val="false"/>
+          <w:color w:val="151515"/>
+          <w:sz w:val="19"/>
+          <w:szCs w:val="19"/>
+        </w:rPr>
+        <w:t xml:space="preserve">—</w:t>
+      </w:r>
+      <w:r>
+        <w:rPr>
+          <w:rFonts w:ascii="Times New Roman" w:cs="Times New Roman" w:eastAsia="Microsoft YaHei" w:hAnsi="Times New Roman"/>
+          <w:b w:val="false"/>
+          <w:bCs w:val="false"/>
+          <w:i w:val="false"/>
+          <w:iCs w:val="false"/>
+          <w:color w:val="151515"/>
+          <w:sz w:val="19"/>
+          <w:szCs w:val="19"/>
+        </w:rPr>
+        <w:t xml:space="preserve">联调</w:t>
+      </w:r>
+      <w:r>
+        <w:rPr>
+          <w:rFonts w:ascii="Times New Roman" w:cs="Times New Roman" w:eastAsia="Times New Roman" w:hAnsi="Times New Roman"/>
+          <w:b w:val="false"/>
+          <w:bCs w:val="false"/>
+          <w:i w:val="false"/>
+          <w:iCs w:val="false"/>
+          <w:color w:val="151515"/>
+          <w:sz w:val="19"/>
+          <w:szCs w:val="19"/>
+        </w:rPr>
+        <w:t xml:space="preserve">—</w:t>
+      </w:r>
+      <w:r>
+        <w:rPr>
+          <w:rFonts w:ascii="Times New Roman" w:cs="Times New Roman" w:eastAsia="Microsoft YaHei" w:hAnsi="Times New Roman"/>
+          <w:b w:val="false"/>
+          <w:bCs w:val="false"/>
+          <w:i w:val="false"/>
+          <w:iCs w:val="false"/>
+          <w:color w:val="151515"/>
+          <w:sz w:val="19"/>
+          <w:szCs w:val="19"/>
+        </w:rPr>
+        <w:t xml:space="preserve">热态测试计划；设计门店日报口径（SKU 销量、成本、报损、现金差异）。</w:t>
+      </w:r>
+    </w:p>
+    <w:p>
+      <w:pPr>
+        <w:shd w:fill="F2F3F5" w:color="auto" w:val="clear"/>
+        <w:tabs>
+          <w:tab w:val="right" w:pos="10652"/>
+        </w:tabs>
+        <w:spacing w:after="10" w:before="50" w:line="320" w:lineRule="exact"/>
+        <w:ind w:left="60" w:right="60"/>
+      </w:pPr>
+      <w:r>
+        <w:drawing>
+          <wp:inline distT="0" distB="0" distL="0" distR="0">
+            <wp:extent cx="152400" cy="133350"/>
+            <wp:effectExtent t="0" r="0" b="0" l="0"/>
+            <wp:docPr id="1" name="" descr="" title=""/>
+            <wp:cNvGraphicFramePr>
+              <a:graphicFrameLocks xmlns:a="http://schemas.openxmlformats.org/drawingml/2006/main" noChangeAspect="1"/>
+            </wp:cNvGraphicFramePr>
+            <a:graphic xmlns:a="http://schemas.openxmlformats.org/drawingml/2006/main">
+              <a:graphicData uri="http://schemas.openxmlformats.org/drawingml/2006/picture">
+                <pic:pic xmlns:pic="http://schemas.openxmlformats.org/drawingml/2006/picture">
+                  <pic:nvPicPr>
+                    <pic:cNvPr id="0" name="" descr=""/>
+                    <pic:cNvPicPr>
+                      <a:picLocks noChangeAspect="1" noChangeArrowheads="1"/>
+                    </pic:cNvPicPr>
+                  </pic:nvPicPr>
+                  <pic:blipFill>
+                    <a:blip r:embed="rId22" cstate="none"/>
+                    <a:srcRect/>
+                    <a:stretch>
+                      <a:fillRect/>
+                    </a:stretch>
+                  </pic:blipFill>
+                  <pic:spPr bwMode="auto">
+                    <a:xfrm>
+                      <a:off x="0" y="0"/>
                       <a:ext cx="152400" cy="133350"/>
                     </a:xfrm>
                     <a:prstGeom prst="rect">
@@ -4264,7 +4808,7 @@
         </w:rPr>
         <w:t xml:space="preserve">	</w:t>
       </w:r>
-      <w:hyperlink w:history="1" r:id="rIddetkn4lvdgofzi8dxetbv">
+      <w:hyperlink w:history="1" r:id="rIdk_yahqxhdy0t76b7xrwrq">
         <w:r>
           <w:rPr>
             <w:rFonts w:ascii="Times New Roman" w:cs="Times New Roman" w:eastAsia="Microsoft YaHei" w:hAnsi="Times New Roman"/>
@@ -4578,354 +5122,6 @@
     </w:p>
     <w:p>
       <w:pPr>
-        <w:shd w:fill="F2F3F5" w:color="auto" w:val="clear"/>
-        <w:tabs>
-          <w:tab w:val="right" w:pos="10652"/>
-        </w:tabs>
-        <w:spacing w:after="10" w:before="50" w:line="320" w:lineRule="exact"/>
-        <w:ind w:left="60" w:right="60"/>
-      </w:pPr>
-      <w:r>
-        <w:drawing>
-          <wp:inline distT="0" distB="0" distL="0" distR="0">
-            <wp:extent cx="152400" cy="142875"/>
-            <wp:effectExtent t="0" r="0" b="0" l="0"/>
-            <wp:docPr id="1" name="" descr="" title=""/>
-            <wp:cNvGraphicFramePr>
-              <a:graphicFrameLocks xmlns:a="http://schemas.openxmlformats.org/drawingml/2006/main" noChangeAspect="1"/>
-            </wp:cNvGraphicFramePr>
-            <a:graphic xmlns:a="http://schemas.openxmlformats.org/drawingml/2006/main">
-              <a:graphicData uri="http://schemas.openxmlformats.org/drawingml/2006/picture">
-                <pic:pic xmlns:pic="http://schemas.openxmlformats.org/drawingml/2006/picture">
-                  <pic:nvPicPr>
-                    <pic:cNvPr id="0" name="" descr=""/>
-                    <pic:cNvPicPr>
-                      <a:picLocks noChangeAspect="1" noChangeArrowheads="1"/>
-                    </pic:cNvPicPr>
-                  </pic:nvPicPr>
-                  <pic:blipFill>
-                    <a:blip r:embed="rId10" cstate="none"/>
-                    <a:srcRect/>
-                    <a:stretch>
-                      <a:fillRect/>
-                    </a:stretch>
-                  </pic:blipFill>
-                  <pic:spPr bwMode="auto">
-                    <a:xfrm>
-                      <a:off x="0" y="0"/>
-                      <a:ext cx="152400" cy="142875"/>
-                    </a:xfrm>
-                    <a:prstGeom prst="rect">
-                      <a:avLst/>
-                    </a:prstGeom>
-                  </pic:spPr>
-                </pic:pic>
-              </a:graphicData>
-            </a:graphic>
-          </wp:inline>
-        </w:drawing>
-      </w:r>
-      <w:r>
-        <w:rPr>
-          <w:sz w:val="20"/>
-          <w:szCs w:val="20"/>
-        </w:rPr>
-        <w:t xml:space="preserve">  </w:t>
-      </w:r>
-      <w:r>
-        <w:rPr>
-          <w:rFonts w:ascii="Times New Roman" w:cs="Times New Roman" w:eastAsia="Microsoft YaHei" w:hAnsi="Times New Roman"/>
-          <w:b/>
-          <w:bCs/>
-          <w:i w:val="false"/>
-          <w:iCs w:val="false"/>
-          <w:color w:val="151515"/>
-          <w:sz w:val="20"/>
-          <w:szCs w:val="20"/>
-        </w:rPr>
-        <w:t xml:space="preserve">Real-World AI Projects </w:t>
-      </w:r>
-      <w:r>
-        <w:rPr>
-          <w:rFonts w:ascii="Times New Roman" w:cs="Times New Roman" w:eastAsia="Times New Roman" w:hAnsi="Times New Roman"/>
-          <w:b/>
-          <w:bCs/>
-          <w:i w:val="false"/>
-          <w:iCs w:val="false"/>
-          <w:color w:val="151515"/>
-          <w:sz w:val="20"/>
-          <w:szCs w:val="20"/>
-        </w:rPr>
-        <w:t xml:space="preserve">·</w:t>
-      </w:r>
-      <w:r>
-        <w:rPr>
-          <w:rFonts w:ascii="Times New Roman" w:cs="Times New Roman" w:eastAsia="Microsoft YaHei" w:hAnsi="Times New Roman"/>
-          <w:b/>
-          <w:bCs/>
-          <w:i w:val="false"/>
-          <w:iCs w:val="false"/>
-          <w:color w:val="151515"/>
-          <w:sz w:val="20"/>
-          <w:szCs w:val="20"/>
-        </w:rPr>
-        <w:t xml:space="preserve"> github.com/joshuazou-web</w:t>
-      </w:r>
-      <w:r>
-        <w:rPr>
-          <w:rFonts w:ascii="Times New Roman" w:cs="Times New Roman" w:eastAsia="Microsoft YaHei" w:hAnsi="Times New Roman"/>
-          <w:b w:val="false"/>
-          <w:bCs w:val="false"/>
-          <w:i w:val="false"/>
-          <w:iCs w:val="false"/>
-          <w:color w:val="151515"/>
-          <w:sz w:val="20"/>
-          <w:szCs w:val="20"/>
-        </w:rPr>
-        <w:t xml:space="preserve">  </w:t>
-      </w:r>
-      <w:r>
-        <w:rPr>
-          <w:rFonts w:ascii="Times New Roman" w:cs="Times New Roman" w:eastAsia="Times New Roman" w:hAnsi="Times New Roman"/>
-          <w:b w:val="false"/>
-          <w:bCs w:val="false"/>
-          <w:i w:val="false"/>
-          <w:iCs w:val="false"/>
-          <w:color w:val="151515"/>
-          <w:sz w:val="20"/>
-          <w:szCs w:val="20"/>
-        </w:rPr>
-        <w:t xml:space="preserve">·</w:t>
-      </w:r>
-      <w:r>
-        <w:rPr>
-          <w:rFonts w:ascii="Times New Roman" w:cs="Times New Roman" w:eastAsia="Microsoft YaHei" w:hAnsi="Times New Roman"/>
-          <w:b w:val="false"/>
-          <w:bCs w:val="false"/>
-          <w:i w:val="false"/>
-          <w:iCs w:val="false"/>
-          <w:color w:val="151515"/>
-          <w:sz w:val="20"/>
-          <w:szCs w:val="20"/>
-        </w:rPr>
-        <w:t xml:space="preserve">  </w:t>
-      </w:r>
-      <w:r>
-        <w:rPr>
-          <w:rFonts w:ascii="Times New Roman" w:cs="Times New Roman" w:eastAsia="Microsoft YaHei" w:hAnsi="Times New Roman"/>
-          <w:b/>
-          <w:bCs/>
-          <w:i w:val="false"/>
-          <w:iCs w:val="false"/>
-          <w:color w:val="151515"/>
-          <w:sz w:val="20"/>
-          <w:szCs w:val="20"/>
-        </w:rPr>
-        <w:t xml:space="preserve">Independent Builder</w:t>
-      </w:r>
-      <w:r>
-        <w:rPr>
-          <w:sz w:val="20"/>
-          <w:szCs w:val="20"/>
-        </w:rPr>
-        <w:t xml:space="preserve">	</w:t>
-      </w:r>
-      <w:r>
-        <w:rPr>
-          <w:rFonts w:ascii="Times New Roman" w:cs="Times New Roman" w:eastAsia="Microsoft YaHei" w:hAnsi="Times New Roman"/>
-          <w:b/>
-          <w:bCs/>
-          <w:i w:val="false"/>
-          <w:iCs w:val="false"/>
-          <w:color w:val="151515"/>
-          <w:sz w:val="19"/>
-          <w:szCs w:val="19"/>
-        </w:rPr>
-        <w:t xml:space="preserve">2025 </w:t>
-      </w:r>
-      <w:r>
-        <w:rPr>
-          <w:rFonts w:ascii="Times New Roman" w:cs="Times New Roman" w:eastAsia="Times New Roman" w:hAnsi="Times New Roman"/>
-          <w:b/>
-          <w:bCs/>
-          <w:i w:val="false"/>
-          <w:iCs w:val="false"/>
-          <w:color w:val="151515"/>
-          <w:sz w:val="19"/>
-          <w:szCs w:val="19"/>
-        </w:rPr>
-        <w:t xml:space="preserve">–</w:t>
-      </w:r>
-      <w:r>
-        <w:rPr>
-          <w:rFonts w:ascii="Times New Roman" w:cs="Times New Roman" w:eastAsia="Microsoft YaHei" w:hAnsi="Times New Roman"/>
-          <w:b/>
-          <w:bCs/>
-          <w:i w:val="false"/>
-          <w:iCs w:val="false"/>
-          <w:color w:val="151515"/>
-          <w:sz w:val="19"/>
-          <w:szCs w:val="19"/>
-        </w:rPr>
-        <w:t xml:space="preserve"> 至今</w:t>
-      </w:r>
-    </w:p>
-    <w:p>
-      <w:pPr>
-        <w:pStyle w:val="ListParagraph"/>
-        <w:numPr>
-          <w:ilvl w:val="0"/>
-          <w:numId w:val="2"/>
-        </w:numPr>
-        <w:spacing w:line="240" w:lineRule="exact"/>
-      </w:pPr>
-      <w:hyperlink w:history="1" r:id="rId_ui2hly7dkensprg1j9bd">
-        <w:r>
-          <w:rPr>
-            <w:rFonts w:ascii="Times New Roman" w:cs="Times New Roman" w:eastAsia="Microsoft YaHei" w:hAnsi="Times New Roman"/>
-            <w:b/>
-            <w:bCs/>
-            <w:i w:val="false"/>
-            <w:iCs w:val="false"/>
-            <w:color w:val="151515"/>
-            <w:sz w:val="19"/>
-            <w:szCs w:val="19"/>
-          </w:rPr>
-          <w:t xml:space="preserve">Converge</w:t>
-        </w:r>
-      </w:hyperlink>
-      <w:r>
-        <w:rPr>
-          <w:rFonts w:ascii="Times New Roman" w:cs="Times New Roman" w:eastAsia="Microsoft YaHei" w:hAnsi="Times New Roman"/>
-          <w:b w:val="false"/>
-          <w:bCs w:val="false"/>
-          <w:i w:val="false"/>
-          <w:iCs w:val="false"/>
-          <w:color w:val="151515"/>
-          <w:sz w:val="19"/>
-          <w:szCs w:val="19"/>
-        </w:rPr>
-        <w:t xml:space="preserve">：TikTok TechJam 赛题，对 5 万件真实商品做对话导购，平均 1.96 轮命中，官方评分 </w:t>
-      </w:r>
-      <w:r>
-        <w:rPr>
-          <w:rFonts w:ascii="Times New Roman" w:cs="Times New Roman" w:eastAsia="Microsoft YaHei" w:hAnsi="Times New Roman"/>
-          <w:b/>
-          <w:bCs/>
-          <w:i w:val="false"/>
-          <w:iCs w:val="false"/>
-          <w:color w:val="151515"/>
-          <w:sz w:val="19"/>
-          <w:szCs w:val="19"/>
-        </w:rPr>
-        <w:t xml:space="preserve">0.9760</w:t>
-      </w:r>
-      <w:r>
-        <w:rPr>
-          <w:rFonts w:ascii="Times New Roman" w:cs="Times New Roman" w:eastAsia="Microsoft YaHei" w:hAnsi="Times New Roman"/>
-          <w:b w:val="false"/>
-          <w:bCs w:val="false"/>
-          <w:i w:val="false"/>
-          <w:iCs w:val="false"/>
-          <w:color w:val="151515"/>
-          <w:sz w:val="19"/>
-          <w:szCs w:val="19"/>
-        </w:rPr>
-        <w:t xml:space="preserve">（基线 0.1067）。</w:t>
-      </w:r>
-    </w:p>
-    <w:p>
-      <w:pPr>
-        <w:pStyle w:val="ListParagraph"/>
-        <w:numPr>
-          <w:ilvl w:val="0"/>
-          <w:numId w:val="2"/>
-        </w:numPr>
-        <w:spacing w:line="240" w:lineRule="exact"/>
-      </w:pPr>
-      <w:hyperlink w:history="1" r:id="rIdau-ufdxnhmqkcq82s9y4l">
-        <w:r>
-          <w:rPr>
-            <w:rFonts w:ascii="Times New Roman" w:cs="Times New Roman" w:eastAsia="Microsoft YaHei" w:hAnsi="Times New Roman"/>
-            <w:b/>
-            <w:bCs/>
-            <w:i w:val="false"/>
-            <w:iCs w:val="false"/>
-            <w:color w:val="151515"/>
-            <w:sz w:val="19"/>
-            <w:szCs w:val="19"/>
-          </w:rPr>
-          <w:t xml:space="preserve">WealthGuard</w:t>
-        </w:r>
-      </w:hyperlink>
-      <w:r>
-        <w:rPr>
-          <w:rFonts w:ascii="Times New Roman" w:cs="Times New Roman" w:eastAsia="Microsoft YaHei" w:hAnsi="Times New Roman"/>
-          <w:b w:val="false"/>
-          <w:bCs w:val="false"/>
-          <w:i w:val="false"/>
-          <w:iCs w:val="false"/>
-          <w:color w:val="151515"/>
-          <w:sz w:val="19"/>
-          <w:szCs w:val="19"/>
-        </w:rPr>
-        <w:t xml:space="preserve">：针对证券 App 的 AI 回答</w:t>
-      </w:r>
-      <w:r>
-        <w:rPr>
-          <w:rFonts w:ascii="Times New Roman" w:cs="Times New Roman" w:eastAsia="Times New Roman" w:hAnsi="Times New Roman"/>
-          <w:b w:val="false"/>
-          <w:bCs w:val="false"/>
-          <w:i w:val="false"/>
-          <w:iCs w:val="false"/>
-          <w:color w:val="151515"/>
-          <w:sz w:val="19"/>
-          <w:szCs w:val="19"/>
-        </w:rPr>
-        <w:t xml:space="preserve">“</w:t>
-      </w:r>
-      <w:r>
-        <w:rPr>
-          <w:rFonts w:ascii="Times New Roman" w:cs="Times New Roman" w:eastAsia="Microsoft YaHei" w:hAnsi="Times New Roman"/>
-          <w:b w:val="false"/>
-          <w:bCs w:val="false"/>
-          <w:i w:val="false"/>
-          <w:iCs w:val="false"/>
-          <w:color w:val="151515"/>
-          <w:sz w:val="19"/>
-          <w:szCs w:val="19"/>
-        </w:rPr>
-        <w:t xml:space="preserve">无出处</w:t>
-      </w:r>
-      <w:r>
-        <w:rPr>
-          <w:rFonts w:ascii="Times New Roman" w:cs="Times New Roman" w:eastAsia="Times New Roman" w:hAnsi="Times New Roman"/>
-          <w:b w:val="false"/>
-          <w:bCs w:val="false"/>
-          <w:i w:val="false"/>
-          <w:iCs w:val="false"/>
-          <w:color w:val="151515"/>
-          <w:sz w:val="19"/>
-          <w:szCs w:val="19"/>
-        </w:rPr>
-        <w:t xml:space="preserve">”</w:t>
-      </w:r>
-      <w:r>
-        <w:rPr>
-          <w:rFonts w:ascii="Times New Roman" w:cs="Times New Roman" w:eastAsia="Microsoft YaHei" w:hAnsi="Times New Roman"/>
-          <w:b w:val="false"/>
-          <w:bCs w:val="false"/>
-          <w:i w:val="false"/>
-          <w:iCs w:val="false"/>
-          <w:color w:val="151515"/>
-          <w:sz w:val="19"/>
-          <w:szCs w:val="19"/>
-        </w:rPr>
-        <w:t xml:space="preserve">，接入 13 份 SEC/港交所官方文件、1,714 个证据块，结论可回溯原文页码。</w:t>
-      </w:r>
-    </w:p>
-    <w:p>
-      <w:pPr>
         <w:pBdr>
           <w:bottom w:val="single" w:color="2458B8" w:sz="12" w:space="1"/>
         </w:pBdr>
@@ -4941,42 +5137,6 @@
           <w:szCs w:val="29"/>
         </w:rPr>
         <w:t xml:space="preserve">专业技能与成果</w:t>
-      </w:r>
-    </w:p>
-    <w:p>
-      <w:pPr>
-        <w:pStyle w:val="ListParagraph"/>
-        <w:numPr>
-          <w:ilvl w:val="0"/>
-          <w:numId w:val="2"/>
-        </w:numPr>
-        <w:spacing w:line="240" w:lineRule="exact"/>
-      </w:pPr>
-      <w:r>
-        <w:rPr>
-          <w:rFonts w:ascii="Times New Roman" w:cs="Times New Roman" w:eastAsia="Microsoft YaHei" w:hAnsi="Times New Roman"/>
-          <w:b/>
-          <w:bCs/>
-          <w:i w:val="false"/>
-          <w:iCs w:val="false"/>
-          <w:color w:val="151515"/>
-          <w:sz w:val="19"/>
-          <w:szCs w:val="19"/>
-        </w:rPr>
-        <w:t xml:space="preserve">方案交付：</w:t>
-      </w:r>
-      <w:r>
-        <w:rPr>
-          <w:rFonts w:ascii="Times New Roman" w:cs="Times New Roman" w:eastAsia="Microsoft YaHei" w:hAnsi="Times New Roman"/>
-          <w:b w:val="false"/>
-          <w:bCs w:val="false"/>
-          <w:i w:val="false"/>
-          <w:iCs w:val="false"/>
-          <w:color w:val="151515"/>
-          <w:sz w:val="19"/>
-          <w:szCs w:val="19"/>
-        </w:rPr>
-        <w:t xml:space="preserve">客户访谈与痛点诊断、流程与规则拆解、方案设计与验收口径、原型演示、现场落地与迭代。</w:t>
       </w:r>
     </w:p>
     <w:p>

</xml_diff>

<commit_message>
Chinese job target, refine Hengqin wording, order projects by date
Co-Authored-By: Claude Opus 5.5 <noreply@anthropic.com>
Claude-Session: https://claude.ai/code/session_01Wy6QccTAXhM16qGGvDf8g9
</commit_message>
<xml_diff>
--- a/resume/fde/邹志华_FDE简历.docx
+++ b/resume/fde/邹志华_FDE简历.docx
@@ -79,7 +79,7 @@
           <w:sz w:val="19"/>
           <w:szCs w:val="19"/>
         </w:rPr>
-        <w:t xml:space="preserve">Job Target: Forward Deployed Engineer (FDE)</w:t>
+        <w:t xml:space="preserve">求职意向：前线部署工程师（FDE）</w:t>
       </w:r>
       <w:r>
         <w:rPr>
@@ -105,7 +105,7 @@
           <w:sz w:val="19"/>
           <w:szCs w:val="19"/>
         </w:rPr>
-        <w:t xml:space="preserve">AI Solutions &amp; Delivery</w:t>
+        <w:t xml:space="preserve">AI 解决方案与交付</w:t>
       </w:r>
     </w:p>
     <w:p>
@@ -323,7 +323,7 @@
         </w:rPr>
         <w:t xml:space="preserve"> </w:t>
       </w:r>
-      <w:hyperlink w:history="1" r:id="rIdxdwoqnmsgr4sf9fjhqn19">
+      <w:hyperlink w:history="1" r:id="rIdk3brzoklcfpx_tjhepwgb">
         <w:r>
           <w:rPr>
             <w:rFonts w:ascii="Times New Roman" w:cs="Times New Roman" w:eastAsia="Microsoft YaHei" w:hAnsi="Times New Roman"/>
@@ -2818,6 +2818,524 @@
           <w:sz w:val="20"/>
           <w:szCs w:val="20"/>
         </w:rPr>
+        <w:t xml:space="preserve">Chaoshan Deli Chain (Guangxi) </w:t>
+      </w:r>
+      <w:r>
+        <w:rPr>
+          <w:rFonts w:ascii="Times New Roman" w:cs="Times New Roman" w:eastAsia="Times New Roman" w:hAnsi="Times New Roman"/>
+          <w:b/>
+          <w:bCs/>
+          <w:i w:val="false"/>
+          <w:iCs w:val="false"/>
+          <w:color w:val="151515"/>
+          <w:sz w:val="20"/>
+          <w:szCs w:val="20"/>
+        </w:rPr>
+        <w:t xml:space="preserve">·</w:t>
+      </w:r>
+      <w:r>
+        <w:rPr>
+          <w:rFonts w:ascii="Times New Roman" w:cs="Times New Roman" w:eastAsia="Microsoft YaHei" w:hAnsi="Times New Roman"/>
+          <w:b/>
+          <w:bCs/>
+          <w:i w:val="false"/>
+          <w:iCs w:val="false"/>
+          <w:color w:val="151515"/>
+          <w:sz w:val="20"/>
+          <w:szCs w:val="20"/>
+        </w:rPr>
+        <w:t xml:space="preserve"> 线下门店 0</w:t>
+      </w:r>
+      <w:r>
+        <w:rPr>
+          <w:rFonts w:ascii="Times New Roman" w:cs="Times New Roman" w:eastAsia="Times New Roman" w:hAnsi="Times New Roman"/>
+          <w:b/>
+          <w:bCs/>
+          <w:i w:val="false"/>
+          <w:iCs w:val="false"/>
+          <w:color w:val="151515"/>
+          <w:sz w:val="20"/>
+          <w:szCs w:val="20"/>
+        </w:rPr>
+        <w:t xml:space="preserve">→</w:t>
+      </w:r>
+      <w:r>
+        <w:rPr>
+          <w:rFonts w:ascii="Times New Roman" w:cs="Times New Roman" w:eastAsia="Microsoft YaHei" w:hAnsi="Times New Roman"/>
+          <w:b/>
+          <w:bCs/>
+          <w:i w:val="false"/>
+          <w:iCs w:val="false"/>
+          <w:color w:val="151515"/>
+          <w:sz w:val="20"/>
+          <w:szCs w:val="20"/>
+        </w:rPr>
+        <w:t xml:space="preserve">1 落地</w:t>
+      </w:r>
+      <w:r>
+        <w:rPr>
+          <w:rFonts w:ascii="Times New Roman" w:cs="Times New Roman" w:eastAsia="Microsoft YaHei" w:hAnsi="Times New Roman"/>
+          <w:b w:val="false"/>
+          <w:bCs w:val="false"/>
+          <w:i w:val="false"/>
+          <w:iCs w:val="false"/>
+          <w:color w:val="151515"/>
+          <w:sz w:val="20"/>
+          <w:szCs w:val="20"/>
+        </w:rPr>
+        <w:t xml:space="preserve">  </w:t>
+      </w:r>
+      <w:r>
+        <w:rPr>
+          <w:rFonts w:ascii="Times New Roman" w:cs="Times New Roman" w:eastAsia="Times New Roman" w:hAnsi="Times New Roman"/>
+          <w:b w:val="false"/>
+          <w:bCs w:val="false"/>
+          <w:i w:val="false"/>
+          <w:iCs w:val="false"/>
+          <w:color w:val="151515"/>
+          <w:sz w:val="20"/>
+          <w:szCs w:val="20"/>
+        </w:rPr>
+        <w:t xml:space="preserve">·</w:t>
+      </w:r>
+      <w:r>
+        <w:rPr>
+          <w:rFonts w:ascii="Times New Roman" w:cs="Times New Roman" w:eastAsia="Microsoft YaHei" w:hAnsi="Times New Roman"/>
+          <w:b w:val="false"/>
+          <w:bCs w:val="false"/>
+          <w:i w:val="false"/>
+          <w:iCs w:val="false"/>
+          <w:color w:val="151515"/>
+          <w:sz w:val="20"/>
+          <w:szCs w:val="20"/>
+        </w:rPr>
+        <w:t xml:space="preserve">  </w:t>
+      </w:r>
+      <w:r>
+        <w:rPr>
+          <w:rFonts w:ascii="Times New Roman" w:cs="Times New Roman" w:eastAsia="Microsoft YaHei" w:hAnsi="Times New Roman"/>
+          <w:b/>
+          <w:bCs/>
+          <w:i w:val="false"/>
+          <w:iCs w:val="false"/>
+          <w:color w:val="151515"/>
+          <w:sz w:val="20"/>
+          <w:szCs w:val="20"/>
+        </w:rPr>
+        <w:t xml:space="preserve">Project Lead</w:t>
+      </w:r>
+      <w:r>
+        <w:rPr>
+          <w:sz w:val="20"/>
+          <w:szCs w:val="20"/>
+        </w:rPr>
+        <w:t xml:space="preserve">	</w:t>
+      </w:r>
+      <w:r>
+        <w:rPr>
+          <w:rFonts w:ascii="Times New Roman" w:cs="Times New Roman" w:eastAsia="Microsoft YaHei" w:hAnsi="Times New Roman"/>
+          <w:b/>
+          <w:bCs/>
+          <w:i w:val="false"/>
+          <w:iCs w:val="false"/>
+          <w:color w:val="151515"/>
+          <w:sz w:val="19"/>
+          <w:szCs w:val="19"/>
+        </w:rPr>
+        <w:t xml:space="preserve">2026 </w:t>
+      </w:r>
+      <w:r>
+        <w:rPr>
+          <w:rFonts w:ascii="Times New Roman" w:cs="Times New Roman" w:eastAsia="Times New Roman" w:hAnsi="Times New Roman"/>
+          <w:b/>
+          <w:bCs/>
+          <w:i w:val="false"/>
+          <w:iCs w:val="false"/>
+          <w:color w:val="151515"/>
+          <w:sz w:val="19"/>
+          <w:szCs w:val="19"/>
+        </w:rPr>
+        <w:t xml:space="preserve">–</w:t>
+      </w:r>
+      <w:r>
+        <w:rPr>
+          <w:rFonts w:ascii="Times New Roman" w:cs="Times New Roman" w:eastAsia="Microsoft YaHei" w:hAnsi="Times New Roman"/>
+          <w:b/>
+          <w:bCs/>
+          <w:i w:val="false"/>
+          <w:iCs w:val="false"/>
+          <w:color w:val="151515"/>
+          <w:sz w:val="19"/>
+          <w:szCs w:val="19"/>
+        </w:rPr>
+        <w:t xml:space="preserve"> 至今</w:t>
+      </w:r>
+    </w:p>
+    <w:p>
+      <w:pPr>
+        <w:spacing w:before="20" w:line="252" w:lineRule="exact"/>
+      </w:pPr>
+      <w:r>
+        <w:rPr>
+          <w:rFonts w:ascii="Times New Roman" w:cs="Times New Roman" w:eastAsia="Microsoft YaHei" w:hAnsi="Times New Roman"/>
+          <w:b/>
+          <w:bCs/>
+          <w:i w:val="false"/>
+          <w:iCs w:val="false"/>
+          <w:color w:val="244B9B"/>
+          <w:sz w:val="20"/>
+          <w:szCs w:val="20"/>
+        </w:rPr>
+        <w:t xml:space="preserve">社区直营小店落地</w:t>
+      </w:r>
+      <w:r>
+        <w:rPr>
+          <w:rFonts w:ascii="Times New Roman" w:cs="Times New Roman" w:eastAsia="Microsoft YaHei" w:hAnsi="Times New Roman"/>
+          <w:b/>
+          <w:bCs/>
+          <w:i w:val="false"/>
+          <w:iCs w:val="false"/>
+          <w:color w:val="244B9B"/>
+          <w:sz w:val="20"/>
+          <w:szCs w:val="20"/>
+        </w:rPr>
+        <w:t xml:space="preserve">  |  </w:t>
+      </w:r>
+      <w:r>
+        <w:rPr>
+          <w:rFonts w:ascii="Times New Roman" w:cs="Times New Roman" w:eastAsia="Microsoft YaHei" w:hAnsi="Times New Roman"/>
+          <w:b/>
+          <w:bCs/>
+          <w:i w:val="false"/>
+          <w:iCs w:val="false"/>
+          <w:color w:val="244B9B"/>
+          <w:sz w:val="20"/>
+          <w:szCs w:val="20"/>
+        </w:rPr>
+        <w:t xml:space="preserve">远程勘测 </w:t>
+      </w:r>
+      <w:r>
+        <w:rPr>
+          <w:rFonts w:ascii="Times New Roman" w:cs="Times New Roman" w:eastAsia="Times New Roman" w:hAnsi="Times New Roman"/>
+          <w:b/>
+          <w:bCs/>
+          <w:i w:val="false"/>
+          <w:iCs w:val="false"/>
+          <w:color w:val="244B9B"/>
+          <w:sz w:val="20"/>
+          <w:szCs w:val="20"/>
+        </w:rPr>
+        <w:t xml:space="preserve">→</w:t>
+      </w:r>
+      <w:r>
+        <w:rPr>
+          <w:rFonts w:ascii="Times New Roman" w:cs="Times New Roman" w:eastAsia="Microsoft YaHei" w:hAnsi="Times New Roman"/>
+          <w:b/>
+          <w:bCs/>
+          <w:i w:val="false"/>
+          <w:iCs w:val="false"/>
+          <w:color w:val="244B9B"/>
+          <w:sz w:val="20"/>
+          <w:szCs w:val="20"/>
+        </w:rPr>
+        <w:t xml:space="preserve"> 方案设计 </w:t>
+      </w:r>
+      <w:r>
+        <w:rPr>
+          <w:rFonts w:ascii="Times New Roman" w:cs="Times New Roman" w:eastAsia="Times New Roman" w:hAnsi="Times New Roman"/>
+          <w:b/>
+          <w:bCs/>
+          <w:i w:val="false"/>
+          <w:iCs w:val="false"/>
+          <w:color w:val="244B9B"/>
+          <w:sz w:val="20"/>
+          <w:szCs w:val="20"/>
+        </w:rPr>
+        <w:t xml:space="preserve">→</w:t>
+      </w:r>
+      <w:r>
+        <w:rPr>
+          <w:rFonts w:ascii="Times New Roman" w:cs="Times New Roman" w:eastAsia="Microsoft YaHei" w:hAnsi="Times New Roman"/>
+          <w:b/>
+          <w:bCs/>
+          <w:i w:val="false"/>
+          <w:iCs w:val="false"/>
+          <w:color w:val="244B9B"/>
+          <w:sz w:val="20"/>
+          <w:szCs w:val="20"/>
+        </w:rPr>
+        <w:t xml:space="preserve"> 采购施工 </w:t>
+      </w:r>
+      <w:r>
+        <w:rPr>
+          <w:rFonts w:ascii="Times New Roman" w:cs="Times New Roman" w:eastAsia="Times New Roman" w:hAnsi="Times New Roman"/>
+          <w:b/>
+          <w:bCs/>
+          <w:i w:val="false"/>
+          <w:iCs w:val="false"/>
+          <w:color w:val="244B9B"/>
+          <w:sz w:val="20"/>
+          <w:szCs w:val="20"/>
+        </w:rPr>
+        <w:t xml:space="preserve">→</w:t>
+      </w:r>
+      <w:r>
+        <w:rPr>
+          <w:rFonts w:ascii="Times New Roman" w:cs="Times New Roman" w:eastAsia="Microsoft YaHei" w:hAnsi="Times New Roman"/>
+          <w:b/>
+          <w:bCs/>
+          <w:i w:val="false"/>
+          <w:iCs w:val="false"/>
+          <w:color w:val="244B9B"/>
+          <w:sz w:val="20"/>
+          <w:szCs w:val="20"/>
+        </w:rPr>
+        <w:t xml:space="preserve"> 试营业数据复盘</w:t>
+      </w:r>
+    </w:p>
+    <w:p>
+      <w:pPr>
+        <w:pStyle w:val="ListParagraph"/>
+        <w:numPr>
+          <w:ilvl w:val="0"/>
+          <w:numId w:val="2"/>
+        </w:numPr>
+        <w:spacing w:line="240" w:lineRule="exact"/>
+      </w:pPr>
+      <w:r>
+        <w:rPr>
+          <w:rFonts w:ascii="Times New Roman" w:cs="Times New Roman" w:eastAsia="Microsoft YaHei" w:hAnsi="Times New Roman"/>
+          <w:b/>
+          <w:bCs/>
+          <w:i w:val="false"/>
+          <w:iCs w:val="false"/>
+          <w:color w:val="151515"/>
+          <w:sz w:val="19"/>
+          <w:szCs w:val="19"/>
+        </w:rPr>
+        <w:t xml:space="preserve">现场诊断与方案：</w:t>
+      </w:r>
+      <w:r>
+        <w:rPr>
+          <w:rFonts w:ascii="Times New Roman" w:cs="Times New Roman" w:eastAsia="Microsoft YaHei" w:hAnsi="Times New Roman"/>
+          <w:b w:val="false"/>
+          <w:bCs w:val="false"/>
+          <w:i w:val="false"/>
+          <w:iCs w:val="false"/>
+          <w:color w:val="151515"/>
+          <w:sz w:val="19"/>
+          <w:szCs w:val="19"/>
+        </w:rPr>
+        <w:t xml:space="preserve">远程看现场视频、复尺定动线；开工前设许可、排风、电力、给排水 </w:t>
+      </w:r>
+      <w:r>
+        <w:rPr>
+          <w:rFonts w:ascii="Times New Roman" w:cs="Times New Roman" w:eastAsia="Microsoft YaHei" w:hAnsi="Times New Roman"/>
+          <w:b/>
+          <w:bCs/>
+          <w:i w:val="false"/>
+          <w:iCs w:val="false"/>
+          <w:color w:val="151515"/>
+          <w:sz w:val="19"/>
+          <w:szCs w:val="19"/>
+        </w:rPr>
+        <w:t xml:space="preserve">4 道核验门槛</w:t>
+      </w:r>
+      <w:r>
+        <w:rPr>
+          <w:rFonts w:ascii="Times New Roman" w:cs="Times New Roman" w:eastAsia="Microsoft YaHei" w:hAnsi="Times New Roman"/>
+          <w:b w:val="false"/>
+          <w:bCs w:val="false"/>
+          <w:i w:val="false"/>
+          <w:iCs w:val="false"/>
+          <w:color w:val="151515"/>
+          <w:sz w:val="19"/>
+          <w:szCs w:val="19"/>
+        </w:rPr>
+        <w:t xml:space="preserve">，导视按反馈迭代 </w:t>
+      </w:r>
+      <w:r>
+        <w:rPr>
+          <w:rFonts w:ascii="Times New Roman" w:cs="Times New Roman" w:eastAsia="Microsoft YaHei" w:hAnsi="Times New Roman"/>
+          <w:b/>
+          <w:bCs/>
+          <w:i w:val="false"/>
+          <w:iCs w:val="false"/>
+          <w:color w:val="151515"/>
+          <w:sz w:val="19"/>
+          <w:szCs w:val="19"/>
+        </w:rPr>
+        <w:t xml:space="preserve">6 版</w:t>
+      </w:r>
+      <w:r>
+        <w:rPr>
+          <w:rFonts w:ascii="Times New Roman" w:cs="Times New Roman" w:eastAsia="Microsoft YaHei" w:hAnsi="Times New Roman"/>
+          <w:b w:val="false"/>
+          <w:bCs w:val="false"/>
+          <w:i w:val="false"/>
+          <w:iCs w:val="false"/>
+          <w:color w:val="151515"/>
+          <w:sz w:val="19"/>
+          <w:szCs w:val="19"/>
+        </w:rPr>
+        <w:t xml:space="preserve">。</w:t>
+      </w:r>
+    </w:p>
+    <w:p>
+      <w:pPr>
+        <w:pStyle w:val="ListParagraph"/>
+        <w:numPr>
+          <w:ilvl w:val="0"/>
+          <w:numId w:val="2"/>
+        </w:numPr>
+        <w:spacing w:line="240" w:lineRule="exact"/>
+      </w:pPr>
+      <w:r>
+        <w:rPr>
+          <w:rFonts w:ascii="Times New Roman" w:cs="Times New Roman" w:eastAsia="Microsoft YaHei" w:hAnsi="Times New Roman"/>
+          <w:b/>
+          <w:bCs/>
+          <w:i w:val="false"/>
+          <w:iCs w:val="false"/>
+          <w:color w:val="151515"/>
+          <w:sz w:val="19"/>
+          <w:szCs w:val="19"/>
+        </w:rPr>
+        <w:t xml:space="preserve">落地与运营：</w:t>
+      </w:r>
+      <w:r>
+        <w:rPr>
+          <w:rFonts w:ascii="Times New Roman" w:cs="Times New Roman" w:eastAsia="Microsoft YaHei" w:hAnsi="Times New Roman"/>
+          <w:b w:val="false"/>
+          <w:bCs w:val="false"/>
+          <w:i w:val="false"/>
+          <w:iCs w:val="false"/>
+          <w:color w:val="151515"/>
+          <w:sz w:val="19"/>
+          <w:szCs w:val="19"/>
+        </w:rPr>
+        <w:t xml:space="preserve">制定三家同规格比价与施工</w:t>
+      </w:r>
+      <w:r>
+        <w:rPr>
+          <w:rFonts w:ascii="Times New Roman" w:cs="Times New Roman" w:eastAsia="Times New Roman" w:hAnsi="Times New Roman"/>
+          <w:b w:val="false"/>
+          <w:bCs w:val="false"/>
+          <w:i w:val="false"/>
+          <w:iCs w:val="false"/>
+          <w:color w:val="151515"/>
+          <w:sz w:val="19"/>
+          <w:szCs w:val="19"/>
+        </w:rPr>
+        <w:t xml:space="preserve">—</w:t>
+      </w:r>
+      <w:r>
+        <w:rPr>
+          <w:rFonts w:ascii="Times New Roman" w:cs="Times New Roman" w:eastAsia="Microsoft YaHei" w:hAnsi="Times New Roman"/>
+          <w:b w:val="false"/>
+          <w:bCs w:val="false"/>
+          <w:i w:val="false"/>
+          <w:iCs w:val="false"/>
+          <w:color w:val="151515"/>
+          <w:sz w:val="19"/>
+          <w:szCs w:val="19"/>
+        </w:rPr>
+        <w:t xml:space="preserve">联调</w:t>
+      </w:r>
+      <w:r>
+        <w:rPr>
+          <w:rFonts w:ascii="Times New Roman" w:cs="Times New Roman" w:eastAsia="Times New Roman" w:hAnsi="Times New Roman"/>
+          <w:b w:val="false"/>
+          <w:bCs w:val="false"/>
+          <w:i w:val="false"/>
+          <w:iCs w:val="false"/>
+          <w:color w:val="151515"/>
+          <w:sz w:val="19"/>
+          <w:szCs w:val="19"/>
+        </w:rPr>
+        <w:t xml:space="preserve">—</w:t>
+      </w:r>
+      <w:r>
+        <w:rPr>
+          <w:rFonts w:ascii="Times New Roman" w:cs="Times New Roman" w:eastAsia="Microsoft YaHei" w:hAnsi="Times New Roman"/>
+          <w:b w:val="false"/>
+          <w:bCs w:val="false"/>
+          <w:i w:val="false"/>
+          <w:iCs w:val="false"/>
+          <w:color w:val="151515"/>
+          <w:sz w:val="19"/>
+          <w:szCs w:val="19"/>
+        </w:rPr>
+        <w:t xml:space="preserve">热态测试计划；设计门店日报口径（SKU 销量、成本、报损、现金差异）。</w:t>
+      </w:r>
+    </w:p>
+    <w:p>
+      <w:pPr>
+        <w:shd w:fill="F2F3F5" w:color="auto" w:val="clear"/>
+        <w:tabs>
+          <w:tab w:val="right" w:pos="10652"/>
+        </w:tabs>
+        <w:spacing w:after="10" w:before="50" w:line="320" w:lineRule="exact"/>
+        <w:ind w:left="60" w:right="60"/>
+      </w:pPr>
+      <w:r>
+        <w:drawing>
+          <wp:inline distT="0" distB="0" distL="0" distR="0">
+            <wp:extent cx="152400" cy="152400"/>
+            <wp:effectExtent t="0" r="0" b="0" l="0"/>
+            <wp:docPr id="1" name="" descr="" title=""/>
+            <wp:cNvGraphicFramePr>
+              <a:graphicFrameLocks xmlns:a="http://schemas.openxmlformats.org/drawingml/2006/main" noChangeAspect="1"/>
+            </wp:cNvGraphicFramePr>
+            <a:graphic xmlns:a="http://schemas.openxmlformats.org/drawingml/2006/main">
+              <a:graphicData uri="http://schemas.openxmlformats.org/drawingml/2006/picture">
+                <pic:pic xmlns:pic="http://schemas.openxmlformats.org/drawingml/2006/picture">
+                  <pic:nvPicPr>
+                    <pic:cNvPr id="0" name="" descr=""/>
+                    <pic:cNvPicPr>
+                      <a:picLocks noChangeAspect="1" noChangeArrowheads="1"/>
+                    </pic:cNvPicPr>
+                  </pic:nvPicPr>
+                  <pic:blipFill>
+                    <a:blip r:embed="rId20" cstate="none"/>
+                    <a:srcRect/>
+                    <a:stretch>
+                      <a:fillRect/>
+                    </a:stretch>
+                  </pic:blipFill>
+                  <pic:spPr bwMode="auto">
+                    <a:xfrm>
+                      <a:off x="0" y="0"/>
+                      <a:ext cx="152400" cy="152400"/>
+                    </a:xfrm>
+                    <a:prstGeom prst="rect">
+                      <a:avLst/>
+                    </a:prstGeom>
+                  </pic:spPr>
+                </pic:pic>
+              </a:graphicData>
+            </a:graphic>
+          </wp:inline>
+        </w:drawing>
+      </w:r>
+      <w:r>
+        <w:rPr>
+          <w:sz w:val="20"/>
+          <w:szCs w:val="20"/>
+        </w:rPr>
+        <w:t xml:space="preserve">  </w:t>
+      </w:r>
+      <w:r>
+        <w:rPr>
+          <w:rFonts w:ascii="Times New Roman" w:cs="Times New Roman" w:eastAsia="Microsoft YaHei" w:hAnsi="Times New Roman"/>
+          <w:b/>
+          <w:bCs/>
+          <w:i w:val="false"/>
+          <w:iCs w:val="false"/>
+          <w:color w:val="151515"/>
+          <w:sz w:val="20"/>
+          <w:szCs w:val="20"/>
+        </w:rPr>
         <w:t xml:space="preserve">ThinkBeforeClick </w:t>
       </w:r>
       <w:r>
@@ -2905,7 +3423,7 @@
         </w:rPr>
         <w:t xml:space="preserve">	</w:t>
       </w:r>
-      <w:hyperlink w:history="1" r:id="rIdws3covjqttu3irnyzc3ah">
+      <w:hyperlink w:history="1" r:id="rId4v7f1kput42wjyjdc-sl-">
         <w:r>
           <w:rPr>
             <w:rFonts w:ascii="Times New Roman" w:cs="Times New Roman" w:eastAsia="Microsoft YaHei" w:hAnsi="Times New Roman"/>
@@ -2946,7 +3464,7 @@
           <w:t xml:space="preserve">   </w:t>
         </w:r>
       </w:hyperlink>
-      <w:hyperlink w:history="1" r:id="rIdo70bvdud7pcj2pc42_kna">
+      <w:hyperlink w:history="1" r:id="rId2gd3suyiizlupv0pfwg1k">
         <w:r>
           <w:rPr>
             <w:rFonts w:ascii="Times New Roman" w:cs="Times New Roman" w:eastAsia="Microsoft YaHei" w:hAnsi="Times New Roman"/>
@@ -3568,587 +4086,7 @@
       <w:r>
         <w:drawing>
           <wp:inline distT="0" distB="0" distL="0" distR="0">
-            <wp:extent cx="152400" cy="152400"/>
-            <wp:effectExtent t="0" r="0" b="0" l="0"/>
-            <wp:docPr id="1" name="" descr="" title=""/>
-            <wp:cNvGraphicFramePr>
-              <a:graphicFrameLocks xmlns:a="http://schemas.openxmlformats.org/drawingml/2006/main" noChangeAspect="1"/>
-            </wp:cNvGraphicFramePr>
-            <a:graphic xmlns:a="http://schemas.openxmlformats.org/drawingml/2006/main">
-              <a:graphicData uri="http://schemas.openxmlformats.org/drawingml/2006/picture">
-                <pic:pic xmlns:pic="http://schemas.openxmlformats.org/drawingml/2006/picture">
-                  <pic:nvPicPr>
-                    <pic:cNvPr id="0" name="" descr=""/>
-                    <pic:cNvPicPr>
-                      <a:picLocks noChangeAspect="1" noChangeArrowheads="1"/>
-                    </pic:cNvPicPr>
-                  </pic:nvPicPr>
-                  <pic:blipFill>
-                    <a:blip r:embed="rId20" cstate="none"/>
-                    <a:srcRect/>
-                    <a:stretch>
-                      <a:fillRect/>
-                    </a:stretch>
-                  </pic:blipFill>
-                  <pic:spPr bwMode="auto">
-                    <a:xfrm>
-                      <a:off x="0" y="0"/>
-                      <a:ext cx="152400" cy="152400"/>
-                    </a:xfrm>
-                    <a:prstGeom prst="rect">
-                      <a:avLst/>
-                    </a:prstGeom>
-                  </pic:spPr>
-                </pic:pic>
-              </a:graphicData>
-            </a:graphic>
-          </wp:inline>
-        </w:drawing>
-      </w:r>
-      <w:r>
-        <w:rPr>
-          <w:sz w:val="20"/>
-          <w:szCs w:val="20"/>
-        </w:rPr>
-        <w:t xml:space="preserve">  </w:t>
-      </w:r>
-      <w:r>
-        <w:rPr>
-          <w:rFonts w:ascii="Times New Roman" w:cs="Times New Roman" w:eastAsia="Microsoft YaHei" w:hAnsi="Times New Roman"/>
-          <w:b/>
-          <w:bCs/>
-          <w:i w:val="false"/>
-          <w:iCs w:val="false"/>
-          <w:color w:val="151515"/>
-          <w:sz w:val="20"/>
-          <w:szCs w:val="20"/>
-        </w:rPr>
-        <w:t xml:space="preserve">Hengqin Industrial Asset Revitalization (Family Business)</w:t>
-      </w:r>
-      <w:r>
-        <w:rPr>
-          <w:rFonts w:ascii="Times New Roman" w:cs="Times New Roman" w:eastAsia="Microsoft YaHei" w:hAnsi="Times New Roman"/>
-          <w:b w:val="false"/>
-          <w:bCs w:val="false"/>
-          <w:i w:val="false"/>
-          <w:iCs w:val="false"/>
-          <w:color w:val="151515"/>
-          <w:sz w:val="20"/>
-          <w:szCs w:val="20"/>
-        </w:rPr>
-        <w:t xml:space="preserve">  </w:t>
-      </w:r>
-      <w:r>
-        <w:rPr>
-          <w:rFonts w:ascii="Times New Roman" w:cs="Times New Roman" w:eastAsia="Times New Roman" w:hAnsi="Times New Roman"/>
-          <w:b w:val="false"/>
-          <w:bCs w:val="false"/>
-          <w:i w:val="false"/>
-          <w:iCs w:val="false"/>
-          <w:color w:val="151515"/>
-          <w:sz w:val="20"/>
-          <w:szCs w:val="20"/>
-        </w:rPr>
-        <w:t xml:space="preserve">·</w:t>
-      </w:r>
-      <w:r>
-        <w:rPr>
-          <w:rFonts w:ascii="Times New Roman" w:cs="Times New Roman" w:eastAsia="Microsoft YaHei" w:hAnsi="Times New Roman"/>
-          <w:b w:val="false"/>
-          <w:bCs w:val="false"/>
-          <w:i w:val="false"/>
-          <w:iCs w:val="false"/>
-          <w:color w:val="151515"/>
-          <w:sz w:val="20"/>
-          <w:szCs w:val="20"/>
-        </w:rPr>
-        <w:t xml:space="preserve">  </w:t>
-      </w:r>
-      <w:r>
-        <w:rPr>
-          <w:rFonts w:ascii="Times New Roman" w:cs="Times New Roman" w:eastAsia="Microsoft YaHei" w:hAnsi="Times New Roman"/>
-          <w:b/>
-          <w:bCs/>
-          <w:i w:val="false"/>
-          <w:iCs w:val="false"/>
-          <w:color w:val="151515"/>
-          <w:sz w:val="20"/>
-          <w:szCs w:val="20"/>
-        </w:rPr>
-        <w:t xml:space="preserve">Solution Lead</w:t>
-      </w:r>
-      <w:r>
-        <w:rPr>
-          <w:sz w:val="20"/>
-          <w:szCs w:val="20"/>
-        </w:rPr>
-        <w:t xml:space="preserve">	</w:t>
-      </w:r>
-      <w:r>
-        <w:rPr>
-          <w:rFonts w:ascii="Times New Roman" w:cs="Times New Roman" w:eastAsia="Microsoft YaHei" w:hAnsi="Times New Roman"/>
-          <w:b/>
-          <w:bCs/>
-          <w:i w:val="false"/>
-          <w:iCs w:val="false"/>
-          <w:color w:val="151515"/>
-          <w:sz w:val="19"/>
-          <w:szCs w:val="19"/>
-        </w:rPr>
-        <w:t xml:space="preserve">2021 </w:t>
-      </w:r>
-      <w:r>
-        <w:rPr>
-          <w:rFonts w:ascii="Times New Roman" w:cs="Times New Roman" w:eastAsia="Times New Roman" w:hAnsi="Times New Roman"/>
-          <w:b/>
-          <w:bCs/>
-          <w:i w:val="false"/>
-          <w:iCs w:val="false"/>
-          <w:color w:val="151515"/>
-          <w:sz w:val="19"/>
-          <w:szCs w:val="19"/>
-        </w:rPr>
-        <w:t xml:space="preserve">–</w:t>
-      </w:r>
-      <w:r>
-        <w:rPr>
-          <w:rFonts w:ascii="Times New Roman" w:cs="Times New Roman" w:eastAsia="Microsoft YaHei" w:hAnsi="Times New Roman"/>
-          <w:b/>
-          <w:bCs/>
-          <w:i w:val="false"/>
-          <w:iCs w:val="false"/>
-          <w:color w:val="151515"/>
-          <w:sz w:val="19"/>
-          <w:szCs w:val="19"/>
-        </w:rPr>
-        <w:t xml:space="preserve"> 至今</w:t>
-      </w:r>
-    </w:p>
-    <w:p>
-      <w:pPr>
-        <w:spacing w:before="20" w:line="252" w:lineRule="exact"/>
-      </w:pPr>
-      <w:r>
-        <w:rPr>
-          <w:rFonts w:ascii="Times New Roman" w:cs="Times New Roman" w:eastAsia="Microsoft YaHei" w:hAnsi="Times New Roman"/>
-          <w:b/>
-          <w:bCs/>
-          <w:i w:val="false"/>
-          <w:iCs w:val="false"/>
-          <w:color w:val="244B9B"/>
-          <w:sz w:val="20"/>
-          <w:szCs w:val="20"/>
-        </w:rPr>
-        <w:t xml:space="preserve">产业资产尽调与盘活</w:t>
-      </w:r>
-      <w:r>
-        <w:rPr>
-          <w:rFonts w:ascii="Times New Roman" w:cs="Times New Roman" w:eastAsia="Microsoft YaHei" w:hAnsi="Times New Roman"/>
-          <w:b/>
-          <w:bCs/>
-          <w:i w:val="false"/>
-          <w:iCs w:val="false"/>
-          <w:color w:val="244B9B"/>
-          <w:sz w:val="20"/>
-          <w:szCs w:val="20"/>
-        </w:rPr>
-        <w:t xml:space="preserve">  |  </w:t>
-      </w:r>
-      <w:r>
-        <w:rPr>
-          <w:rFonts w:ascii="Times New Roman" w:cs="Times New Roman" w:eastAsia="Microsoft YaHei" w:hAnsi="Times New Roman"/>
-          <w:b/>
-          <w:bCs/>
-          <w:i w:val="false"/>
-          <w:iCs w:val="false"/>
-          <w:color w:val="244B9B"/>
-          <w:sz w:val="20"/>
-          <w:szCs w:val="20"/>
-        </w:rPr>
-        <w:t xml:space="preserve">需求发现 </w:t>
-      </w:r>
-      <w:r>
-        <w:rPr>
-          <w:rFonts w:ascii="Times New Roman" w:cs="Times New Roman" w:eastAsia="Times New Roman" w:hAnsi="Times New Roman"/>
-          <w:b/>
-          <w:bCs/>
-          <w:i w:val="false"/>
-          <w:iCs w:val="false"/>
-          <w:color w:val="244B9B"/>
-          <w:sz w:val="20"/>
-          <w:szCs w:val="20"/>
-        </w:rPr>
-        <w:t xml:space="preserve">→</w:t>
-      </w:r>
-      <w:r>
-        <w:rPr>
-          <w:rFonts w:ascii="Times New Roman" w:cs="Times New Roman" w:eastAsia="Microsoft YaHei" w:hAnsi="Times New Roman"/>
-          <w:b/>
-          <w:bCs/>
-          <w:i w:val="false"/>
-          <w:iCs w:val="false"/>
-          <w:color w:val="244B9B"/>
-          <w:sz w:val="20"/>
-          <w:szCs w:val="20"/>
-        </w:rPr>
-        <w:t xml:space="preserve"> 证据建模 </w:t>
-      </w:r>
-      <w:r>
-        <w:rPr>
-          <w:rFonts w:ascii="Times New Roman" w:cs="Times New Roman" w:eastAsia="Times New Roman" w:hAnsi="Times New Roman"/>
-          <w:b/>
-          <w:bCs/>
-          <w:i w:val="false"/>
-          <w:iCs w:val="false"/>
-          <w:color w:val="244B9B"/>
-          <w:sz w:val="20"/>
-          <w:szCs w:val="20"/>
-        </w:rPr>
-        <w:t xml:space="preserve">→</w:t>
-      </w:r>
-      <w:r>
-        <w:rPr>
-          <w:rFonts w:ascii="Times New Roman" w:cs="Times New Roman" w:eastAsia="Microsoft YaHei" w:hAnsi="Times New Roman"/>
-          <w:b/>
-          <w:bCs/>
-          <w:i w:val="false"/>
-          <w:iCs w:val="false"/>
-          <w:color w:val="244B9B"/>
-          <w:sz w:val="20"/>
-          <w:szCs w:val="20"/>
-        </w:rPr>
-        <w:t xml:space="preserve"> 方案比选 </w:t>
-      </w:r>
-      <w:r>
-        <w:rPr>
-          <w:rFonts w:ascii="Times New Roman" w:cs="Times New Roman" w:eastAsia="Times New Roman" w:hAnsi="Times New Roman"/>
-          <w:b/>
-          <w:bCs/>
-          <w:i w:val="false"/>
-          <w:iCs w:val="false"/>
-          <w:color w:val="244B9B"/>
-          <w:sz w:val="20"/>
-          <w:szCs w:val="20"/>
-        </w:rPr>
-        <w:t xml:space="preserve">→</w:t>
-      </w:r>
-      <w:r>
-        <w:rPr>
-          <w:rFonts w:ascii="Times New Roman" w:cs="Times New Roman" w:eastAsia="Microsoft YaHei" w:hAnsi="Times New Roman"/>
-          <w:b/>
-          <w:bCs/>
-          <w:i w:val="false"/>
-          <w:iCs w:val="false"/>
-          <w:color w:val="244B9B"/>
-          <w:sz w:val="20"/>
-          <w:szCs w:val="20"/>
-        </w:rPr>
-        <w:t xml:space="preserve"> 落地推进</w:t>
-      </w:r>
-    </w:p>
-    <w:p>
-      <w:pPr>
-        <w:pStyle w:val="ListParagraph"/>
-        <w:numPr>
-          <w:ilvl w:val="0"/>
-          <w:numId w:val="2"/>
-        </w:numPr>
-        <w:spacing w:line="240" w:lineRule="exact"/>
-      </w:pPr>
-      <w:r>
-        <w:rPr>
-          <w:rFonts w:ascii="Times New Roman" w:cs="Times New Roman" w:eastAsia="Microsoft YaHei" w:hAnsi="Times New Roman"/>
-          <w:b/>
-          <w:bCs/>
-          <w:i w:val="false"/>
-          <w:iCs w:val="false"/>
-          <w:color w:val="151515"/>
-          <w:sz w:val="19"/>
-          <w:szCs w:val="19"/>
-        </w:rPr>
-        <w:t xml:space="preserve">背景与目标：</w:t>
-      </w:r>
-      <w:r>
-        <w:rPr>
-          <w:rFonts w:ascii="Times New Roman" w:cs="Times New Roman" w:eastAsia="Microsoft YaHei" w:hAnsi="Times New Roman"/>
-          <w:b w:val="false"/>
-          <w:bCs w:val="false"/>
-          <w:i w:val="false"/>
-          <w:iCs w:val="false"/>
-          <w:color w:val="151515"/>
-          <w:sz w:val="19"/>
-          <w:szCs w:val="19"/>
-        </w:rPr>
-        <w:t xml:space="preserve">约 </w:t>
-      </w:r>
-      <w:r>
-        <w:rPr>
-          <w:rFonts w:ascii="Times New Roman" w:cs="Times New Roman" w:eastAsia="Microsoft YaHei" w:hAnsi="Times New Roman"/>
-          <w:b/>
-          <w:bCs/>
-          <w:i w:val="false"/>
-          <w:iCs w:val="false"/>
-          <w:color w:val="151515"/>
-          <w:sz w:val="19"/>
-          <w:szCs w:val="19"/>
-        </w:rPr>
-        <w:t xml:space="preserve">26,500㎡</w:t>
-      </w:r>
-      <w:r>
-        <w:rPr>
-          <w:rFonts w:ascii="Times New Roman" w:cs="Times New Roman" w:eastAsia="Microsoft YaHei" w:hAnsi="Times New Roman"/>
-          <w:b w:val="false"/>
-          <w:bCs w:val="false"/>
-          <w:i w:val="false"/>
-          <w:iCs w:val="false"/>
-          <w:color w:val="151515"/>
-          <w:sz w:val="19"/>
-          <w:szCs w:val="19"/>
-        </w:rPr>
-        <w:t xml:space="preserve"> 产业厂房年租金约 </w:t>
-      </w:r>
-      <w:r>
-        <w:rPr>
-          <w:rFonts w:ascii="Times New Roman" w:cs="Times New Roman" w:eastAsia="Microsoft YaHei" w:hAnsi="Times New Roman"/>
-          <w:b/>
-          <w:bCs/>
-          <w:i w:val="false"/>
-          <w:iCs w:val="false"/>
-          <w:color w:val="151515"/>
-          <w:sz w:val="19"/>
-          <w:szCs w:val="19"/>
-        </w:rPr>
-        <w:t xml:space="preserve">700</w:t>
-      </w:r>
-      <w:r>
-        <w:rPr>
-          <w:rFonts w:ascii="Times New Roman" w:cs="Times New Roman" w:eastAsia="Times New Roman" w:hAnsi="Times New Roman"/>
-          <w:b/>
-          <w:bCs/>
-          <w:i w:val="false"/>
-          <w:iCs w:val="false"/>
-          <w:color w:val="151515"/>
-          <w:sz w:val="19"/>
-          <w:szCs w:val="19"/>
-        </w:rPr>
-        <w:t xml:space="preserve">–</w:t>
-      </w:r>
-      <w:r>
-        <w:rPr>
-          <w:rFonts w:ascii="Times New Roman" w:cs="Times New Roman" w:eastAsia="Microsoft YaHei" w:hAnsi="Times New Roman"/>
-          <w:b/>
-          <w:bCs/>
-          <w:i w:val="false"/>
-          <w:iCs w:val="false"/>
-          <w:color w:val="151515"/>
-          <w:sz w:val="19"/>
-          <w:szCs w:val="19"/>
-        </w:rPr>
-        <w:t xml:space="preserve">800 万元</w:t>
-      </w:r>
-      <w:r>
-        <w:rPr>
-          <w:rFonts w:ascii="Times New Roman" w:cs="Times New Roman" w:eastAsia="Microsoft YaHei" w:hAnsi="Times New Roman"/>
-          <w:b w:val="false"/>
-          <w:bCs w:val="false"/>
-          <w:i w:val="false"/>
-          <w:iCs w:val="false"/>
-          <w:color w:val="151515"/>
-          <w:sz w:val="19"/>
-          <w:szCs w:val="19"/>
-        </w:rPr>
-        <w:t xml:space="preserve">，但权属材料分散、历史出资与名义签约主体不一致、盘活路径不清；目标是把</w:t>
-      </w:r>
-      <w:r>
-        <w:rPr>
-          <w:rFonts w:ascii="Times New Roman" w:cs="Times New Roman" w:eastAsia="Times New Roman" w:hAnsi="Times New Roman"/>
-          <w:b w:val="false"/>
-          <w:bCs w:val="false"/>
-          <w:i w:val="false"/>
-          <w:iCs w:val="false"/>
-          <w:color w:val="151515"/>
-          <w:sz w:val="19"/>
-          <w:szCs w:val="19"/>
-        </w:rPr>
-        <w:t xml:space="preserve">“</w:t>
-      </w:r>
-      <w:r>
-        <w:rPr>
-          <w:rFonts w:ascii="Times New Roman" w:cs="Times New Roman" w:eastAsia="Microsoft YaHei" w:hAnsi="Times New Roman"/>
-          <w:b w:val="false"/>
-          <w:bCs w:val="false"/>
-          <w:i w:val="false"/>
-          <w:iCs w:val="false"/>
-          <w:color w:val="151515"/>
-          <w:sz w:val="19"/>
-          <w:szCs w:val="19"/>
-        </w:rPr>
-        <w:t xml:space="preserve">盘活还是出售</w:t>
-      </w:r>
-      <w:r>
-        <w:rPr>
-          <w:rFonts w:ascii="Times New Roman" w:cs="Times New Roman" w:eastAsia="Times New Roman" w:hAnsi="Times New Roman"/>
-          <w:b w:val="false"/>
-          <w:bCs w:val="false"/>
-          <w:i w:val="false"/>
-          <w:iCs w:val="false"/>
-          <w:color w:val="151515"/>
-          <w:sz w:val="19"/>
-          <w:szCs w:val="19"/>
-        </w:rPr>
-        <w:t xml:space="preserve">”</w:t>
-      </w:r>
-      <w:r>
-        <w:rPr>
-          <w:rFonts w:ascii="Times New Roman" w:cs="Times New Roman" w:eastAsia="Microsoft YaHei" w:hAnsi="Times New Roman"/>
-          <w:b w:val="false"/>
-          <w:bCs w:val="false"/>
-          <w:i w:val="false"/>
-          <w:iCs w:val="false"/>
-          <w:color w:val="151515"/>
-          <w:sz w:val="19"/>
-          <w:szCs w:val="19"/>
-        </w:rPr>
-        <w:t xml:space="preserve">变成可执行方案。</w:t>
-      </w:r>
-    </w:p>
-    <w:p>
-      <w:pPr>
-        <w:pStyle w:val="ListParagraph"/>
-        <w:numPr>
-          <w:ilvl w:val="0"/>
-          <w:numId w:val="2"/>
-        </w:numPr>
-        <w:spacing w:line="240" w:lineRule="exact"/>
-      </w:pPr>
-      <w:r>
-        <w:rPr>
-          <w:rFonts w:ascii="Times New Roman" w:cs="Times New Roman" w:eastAsia="Microsoft YaHei" w:hAnsi="Times New Roman"/>
-          <w:b/>
-          <w:bCs/>
-          <w:i w:val="false"/>
-          <w:iCs w:val="false"/>
-          <w:color w:val="151515"/>
-          <w:sz w:val="19"/>
-          <w:szCs w:val="19"/>
-        </w:rPr>
-        <w:t xml:space="preserve">我的职责：</w:t>
-      </w:r>
-      <w:r>
-        <w:rPr>
-          <w:rFonts w:ascii="Times New Roman" w:cs="Times New Roman" w:eastAsia="Microsoft YaHei" w:hAnsi="Times New Roman"/>
-          <w:b w:val="false"/>
-          <w:bCs w:val="false"/>
-          <w:i w:val="false"/>
-          <w:iCs w:val="false"/>
-          <w:color w:val="151515"/>
-          <w:sz w:val="19"/>
-          <w:szCs w:val="19"/>
-        </w:rPr>
-        <w:t xml:space="preserve">访谈合作方、继承人、村集体、租户及律师/会计师，绘制相关方关系图；整合合作建房协议、出资流水与工程付款，建立</w:t>
-      </w:r>
-      <w:r>
-        <w:rPr>
-          <w:rFonts w:ascii="Times New Roman" w:cs="Times New Roman" w:eastAsia="Microsoft YaHei" w:hAnsi="Times New Roman"/>
-          <w:b/>
-          <w:bCs/>
-          <w:i w:val="false"/>
-          <w:iCs w:val="false"/>
-          <w:color w:val="151515"/>
-          <w:sz w:val="19"/>
-          <w:szCs w:val="19"/>
-        </w:rPr>
-        <w:t xml:space="preserve">证据台账</w:t>
-      </w:r>
-      <w:r>
-        <w:rPr>
-          <w:rFonts w:ascii="Times New Roman" w:cs="Times New Roman" w:eastAsia="Microsoft YaHei" w:hAnsi="Times New Roman"/>
-          <w:b w:val="false"/>
-          <w:bCs w:val="false"/>
-          <w:i w:val="false"/>
-          <w:iCs w:val="false"/>
-          <w:color w:val="151515"/>
-          <w:sz w:val="19"/>
-          <w:szCs w:val="19"/>
-        </w:rPr>
-        <w:t xml:space="preserve">与待核查责任清单。</w:t>
-      </w:r>
-    </w:p>
-    <w:p>
-      <w:pPr>
-        <w:pStyle w:val="ListParagraph"/>
-        <w:numPr>
-          <w:ilvl w:val="0"/>
-          <w:numId w:val="2"/>
-        </w:numPr>
-        <w:spacing w:line="240" w:lineRule="exact"/>
-      </w:pPr>
-      <w:r>
-        <w:rPr>
-          <w:rFonts w:ascii="Times New Roman" w:cs="Times New Roman" w:eastAsia="Microsoft YaHei" w:hAnsi="Times New Roman"/>
-          <w:b/>
-          <w:bCs/>
-          <w:i w:val="false"/>
-          <w:iCs w:val="false"/>
-          <w:color w:val="151515"/>
-          <w:sz w:val="19"/>
-          <w:szCs w:val="19"/>
-        </w:rPr>
-        <w:t xml:space="preserve">交付与结果：</w:t>
-      </w:r>
-      <w:r>
-        <w:rPr>
-          <w:rFonts w:ascii="Times New Roman" w:cs="Times New Roman" w:eastAsia="Microsoft YaHei" w:hAnsi="Times New Roman"/>
-          <w:b w:val="false"/>
-          <w:bCs w:val="false"/>
-          <w:i w:val="false"/>
-          <w:iCs w:val="false"/>
-          <w:color w:val="151515"/>
-          <w:sz w:val="19"/>
-          <w:szCs w:val="19"/>
-        </w:rPr>
-        <w:t xml:space="preserve">搭建继续持有、主体重组、整体出售的</w:t>
-      </w:r>
-      <w:r>
-        <w:rPr>
-          <w:rFonts w:ascii="Times New Roman" w:cs="Times New Roman" w:eastAsia="Microsoft YaHei" w:hAnsi="Times New Roman"/>
-          <w:b/>
-          <w:bCs/>
-          <w:i w:val="false"/>
-          <w:iCs w:val="false"/>
-          <w:color w:val="151515"/>
-          <w:sz w:val="19"/>
-          <w:szCs w:val="19"/>
-        </w:rPr>
-        <w:t xml:space="preserve">多路径决策模型</w:t>
-      </w:r>
-      <w:r>
-        <w:rPr>
-          <w:rFonts w:ascii="Times New Roman" w:cs="Times New Roman" w:eastAsia="Microsoft YaHei" w:hAnsi="Times New Roman"/>
-          <w:b w:val="false"/>
-          <w:bCs w:val="false"/>
-          <w:i w:val="false"/>
-          <w:iCs w:val="false"/>
-          <w:color w:val="151515"/>
-          <w:sz w:val="19"/>
-          <w:szCs w:val="19"/>
-        </w:rPr>
-        <w:t xml:space="preserve">（现金流、风险、周期），把法律与财务意见转成 30/60/90 天路线图，推动项目进入材料补全与交易准备。</w:t>
-      </w:r>
-    </w:p>
-    <w:p>
-      <w:pPr>
-        <w:shd w:fill="F2F3F5" w:color="auto" w:val="clear"/>
-        <w:tabs>
-          <w:tab w:val="right" w:pos="10652"/>
-        </w:tabs>
-        <w:spacing w:after="10" w:before="50" w:line="320" w:lineRule="exact"/>
-        <w:ind w:left="60" w:right="60"/>
-      </w:pPr>
-      <w:r>
-        <w:drawing>
-          <wp:inline distT="0" distB="0" distL="0" distR="0">
-            <wp:extent cx="152400" cy="152400"/>
+            <wp:extent cx="152400" cy="133350"/>
             <wp:effectExtent t="0" r="0" b="0" l="0"/>
             <wp:docPr id="1" name="" descr="" title=""/>
             <wp:cNvGraphicFramePr>
@@ -4173,524 +4111,6 @@
                   <pic:spPr bwMode="auto">
                     <a:xfrm>
                       <a:off x="0" y="0"/>
-                      <a:ext cx="152400" cy="152400"/>
-                    </a:xfrm>
-                    <a:prstGeom prst="rect">
-                      <a:avLst/>
-                    </a:prstGeom>
-                  </pic:spPr>
-                </pic:pic>
-              </a:graphicData>
-            </a:graphic>
-          </wp:inline>
-        </w:drawing>
-      </w:r>
-      <w:r>
-        <w:rPr>
-          <w:sz w:val="20"/>
-          <w:szCs w:val="20"/>
-        </w:rPr>
-        <w:t xml:space="preserve">  </w:t>
-      </w:r>
-      <w:r>
-        <w:rPr>
-          <w:rFonts w:ascii="Times New Roman" w:cs="Times New Roman" w:eastAsia="Microsoft YaHei" w:hAnsi="Times New Roman"/>
-          <w:b/>
-          <w:bCs/>
-          <w:i w:val="false"/>
-          <w:iCs w:val="false"/>
-          <w:color w:val="151515"/>
-          <w:sz w:val="20"/>
-          <w:szCs w:val="20"/>
-        </w:rPr>
-        <w:t xml:space="preserve">Chaoshan Deli Chain (Guangxi) </w:t>
-      </w:r>
-      <w:r>
-        <w:rPr>
-          <w:rFonts w:ascii="Times New Roman" w:cs="Times New Roman" w:eastAsia="Times New Roman" w:hAnsi="Times New Roman"/>
-          <w:b/>
-          <w:bCs/>
-          <w:i w:val="false"/>
-          <w:iCs w:val="false"/>
-          <w:color w:val="151515"/>
-          <w:sz w:val="20"/>
-          <w:szCs w:val="20"/>
-        </w:rPr>
-        <w:t xml:space="preserve">·</w:t>
-      </w:r>
-      <w:r>
-        <w:rPr>
-          <w:rFonts w:ascii="Times New Roman" w:cs="Times New Roman" w:eastAsia="Microsoft YaHei" w:hAnsi="Times New Roman"/>
-          <w:b/>
-          <w:bCs/>
-          <w:i w:val="false"/>
-          <w:iCs w:val="false"/>
-          <w:color w:val="151515"/>
-          <w:sz w:val="20"/>
-          <w:szCs w:val="20"/>
-        </w:rPr>
-        <w:t xml:space="preserve"> 线下门店 0</w:t>
-      </w:r>
-      <w:r>
-        <w:rPr>
-          <w:rFonts w:ascii="Times New Roman" w:cs="Times New Roman" w:eastAsia="Times New Roman" w:hAnsi="Times New Roman"/>
-          <w:b/>
-          <w:bCs/>
-          <w:i w:val="false"/>
-          <w:iCs w:val="false"/>
-          <w:color w:val="151515"/>
-          <w:sz w:val="20"/>
-          <w:szCs w:val="20"/>
-        </w:rPr>
-        <w:t xml:space="preserve">→</w:t>
-      </w:r>
-      <w:r>
-        <w:rPr>
-          <w:rFonts w:ascii="Times New Roman" w:cs="Times New Roman" w:eastAsia="Microsoft YaHei" w:hAnsi="Times New Roman"/>
-          <w:b/>
-          <w:bCs/>
-          <w:i w:val="false"/>
-          <w:iCs w:val="false"/>
-          <w:color w:val="151515"/>
-          <w:sz w:val="20"/>
-          <w:szCs w:val="20"/>
-        </w:rPr>
-        <w:t xml:space="preserve">1 落地</w:t>
-      </w:r>
-      <w:r>
-        <w:rPr>
-          <w:rFonts w:ascii="Times New Roman" w:cs="Times New Roman" w:eastAsia="Microsoft YaHei" w:hAnsi="Times New Roman"/>
-          <w:b w:val="false"/>
-          <w:bCs w:val="false"/>
-          <w:i w:val="false"/>
-          <w:iCs w:val="false"/>
-          <w:color w:val="151515"/>
-          <w:sz w:val="20"/>
-          <w:szCs w:val="20"/>
-        </w:rPr>
-        <w:t xml:space="preserve">  </w:t>
-      </w:r>
-      <w:r>
-        <w:rPr>
-          <w:rFonts w:ascii="Times New Roman" w:cs="Times New Roman" w:eastAsia="Times New Roman" w:hAnsi="Times New Roman"/>
-          <w:b w:val="false"/>
-          <w:bCs w:val="false"/>
-          <w:i w:val="false"/>
-          <w:iCs w:val="false"/>
-          <w:color w:val="151515"/>
-          <w:sz w:val="20"/>
-          <w:szCs w:val="20"/>
-        </w:rPr>
-        <w:t xml:space="preserve">·</w:t>
-      </w:r>
-      <w:r>
-        <w:rPr>
-          <w:rFonts w:ascii="Times New Roman" w:cs="Times New Roman" w:eastAsia="Microsoft YaHei" w:hAnsi="Times New Roman"/>
-          <w:b w:val="false"/>
-          <w:bCs w:val="false"/>
-          <w:i w:val="false"/>
-          <w:iCs w:val="false"/>
-          <w:color w:val="151515"/>
-          <w:sz w:val="20"/>
-          <w:szCs w:val="20"/>
-        </w:rPr>
-        <w:t xml:space="preserve">  </w:t>
-      </w:r>
-      <w:r>
-        <w:rPr>
-          <w:rFonts w:ascii="Times New Roman" w:cs="Times New Roman" w:eastAsia="Microsoft YaHei" w:hAnsi="Times New Roman"/>
-          <w:b/>
-          <w:bCs/>
-          <w:i w:val="false"/>
-          <w:iCs w:val="false"/>
-          <w:color w:val="151515"/>
-          <w:sz w:val="20"/>
-          <w:szCs w:val="20"/>
-        </w:rPr>
-        <w:t xml:space="preserve">Project Lead</w:t>
-      </w:r>
-      <w:r>
-        <w:rPr>
-          <w:sz w:val="20"/>
-          <w:szCs w:val="20"/>
-        </w:rPr>
-        <w:t xml:space="preserve">	</w:t>
-      </w:r>
-      <w:r>
-        <w:rPr>
-          <w:rFonts w:ascii="Times New Roman" w:cs="Times New Roman" w:eastAsia="Microsoft YaHei" w:hAnsi="Times New Roman"/>
-          <w:b/>
-          <w:bCs/>
-          <w:i w:val="false"/>
-          <w:iCs w:val="false"/>
-          <w:color w:val="151515"/>
-          <w:sz w:val="19"/>
-          <w:szCs w:val="19"/>
-        </w:rPr>
-        <w:t xml:space="preserve">2026 </w:t>
-      </w:r>
-      <w:r>
-        <w:rPr>
-          <w:rFonts w:ascii="Times New Roman" w:cs="Times New Roman" w:eastAsia="Times New Roman" w:hAnsi="Times New Roman"/>
-          <w:b/>
-          <w:bCs/>
-          <w:i w:val="false"/>
-          <w:iCs w:val="false"/>
-          <w:color w:val="151515"/>
-          <w:sz w:val="19"/>
-          <w:szCs w:val="19"/>
-        </w:rPr>
-        <w:t xml:space="preserve">–</w:t>
-      </w:r>
-      <w:r>
-        <w:rPr>
-          <w:rFonts w:ascii="Times New Roman" w:cs="Times New Roman" w:eastAsia="Microsoft YaHei" w:hAnsi="Times New Roman"/>
-          <w:b/>
-          <w:bCs/>
-          <w:i w:val="false"/>
-          <w:iCs w:val="false"/>
-          <w:color w:val="151515"/>
-          <w:sz w:val="19"/>
-          <w:szCs w:val="19"/>
-        </w:rPr>
-        <w:t xml:space="preserve"> 至今</w:t>
-      </w:r>
-    </w:p>
-    <w:p>
-      <w:pPr>
-        <w:spacing w:before="20" w:line="252" w:lineRule="exact"/>
-      </w:pPr>
-      <w:r>
-        <w:rPr>
-          <w:rFonts w:ascii="Times New Roman" w:cs="Times New Roman" w:eastAsia="Microsoft YaHei" w:hAnsi="Times New Roman"/>
-          <w:b/>
-          <w:bCs/>
-          <w:i w:val="false"/>
-          <w:iCs w:val="false"/>
-          <w:color w:val="244B9B"/>
-          <w:sz w:val="20"/>
-          <w:szCs w:val="20"/>
-        </w:rPr>
-        <w:t xml:space="preserve">社区直营小店落地</w:t>
-      </w:r>
-      <w:r>
-        <w:rPr>
-          <w:rFonts w:ascii="Times New Roman" w:cs="Times New Roman" w:eastAsia="Microsoft YaHei" w:hAnsi="Times New Roman"/>
-          <w:b/>
-          <w:bCs/>
-          <w:i w:val="false"/>
-          <w:iCs w:val="false"/>
-          <w:color w:val="244B9B"/>
-          <w:sz w:val="20"/>
-          <w:szCs w:val="20"/>
-        </w:rPr>
-        <w:t xml:space="preserve">  |  </w:t>
-      </w:r>
-      <w:r>
-        <w:rPr>
-          <w:rFonts w:ascii="Times New Roman" w:cs="Times New Roman" w:eastAsia="Microsoft YaHei" w:hAnsi="Times New Roman"/>
-          <w:b/>
-          <w:bCs/>
-          <w:i w:val="false"/>
-          <w:iCs w:val="false"/>
-          <w:color w:val="244B9B"/>
-          <w:sz w:val="20"/>
-          <w:szCs w:val="20"/>
-        </w:rPr>
-        <w:t xml:space="preserve">远程勘测 </w:t>
-      </w:r>
-      <w:r>
-        <w:rPr>
-          <w:rFonts w:ascii="Times New Roman" w:cs="Times New Roman" w:eastAsia="Times New Roman" w:hAnsi="Times New Roman"/>
-          <w:b/>
-          <w:bCs/>
-          <w:i w:val="false"/>
-          <w:iCs w:val="false"/>
-          <w:color w:val="244B9B"/>
-          <w:sz w:val="20"/>
-          <w:szCs w:val="20"/>
-        </w:rPr>
-        <w:t xml:space="preserve">→</w:t>
-      </w:r>
-      <w:r>
-        <w:rPr>
-          <w:rFonts w:ascii="Times New Roman" w:cs="Times New Roman" w:eastAsia="Microsoft YaHei" w:hAnsi="Times New Roman"/>
-          <w:b/>
-          <w:bCs/>
-          <w:i w:val="false"/>
-          <w:iCs w:val="false"/>
-          <w:color w:val="244B9B"/>
-          <w:sz w:val="20"/>
-          <w:szCs w:val="20"/>
-        </w:rPr>
-        <w:t xml:space="preserve"> 方案设计 </w:t>
-      </w:r>
-      <w:r>
-        <w:rPr>
-          <w:rFonts w:ascii="Times New Roman" w:cs="Times New Roman" w:eastAsia="Times New Roman" w:hAnsi="Times New Roman"/>
-          <w:b/>
-          <w:bCs/>
-          <w:i w:val="false"/>
-          <w:iCs w:val="false"/>
-          <w:color w:val="244B9B"/>
-          <w:sz w:val="20"/>
-          <w:szCs w:val="20"/>
-        </w:rPr>
-        <w:t xml:space="preserve">→</w:t>
-      </w:r>
-      <w:r>
-        <w:rPr>
-          <w:rFonts w:ascii="Times New Roman" w:cs="Times New Roman" w:eastAsia="Microsoft YaHei" w:hAnsi="Times New Roman"/>
-          <w:b/>
-          <w:bCs/>
-          <w:i w:val="false"/>
-          <w:iCs w:val="false"/>
-          <w:color w:val="244B9B"/>
-          <w:sz w:val="20"/>
-          <w:szCs w:val="20"/>
-        </w:rPr>
-        <w:t xml:space="preserve"> 采购施工 </w:t>
-      </w:r>
-      <w:r>
-        <w:rPr>
-          <w:rFonts w:ascii="Times New Roman" w:cs="Times New Roman" w:eastAsia="Times New Roman" w:hAnsi="Times New Roman"/>
-          <w:b/>
-          <w:bCs/>
-          <w:i w:val="false"/>
-          <w:iCs w:val="false"/>
-          <w:color w:val="244B9B"/>
-          <w:sz w:val="20"/>
-          <w:szCs w:val="20"/>
-        </w:rPr>
-        <w:t xml:space="preserve">→</w:t>
-      </w:r>
-      <w:r>
-        <w:rPr>
-          <w:rFonts w:ascii="Times New Roman" w:cs="Times New Roman" w:eastAsia="Microsoft YaHei" w:hAnsi="Times New Roman"/>
-          <w:b/>
-          <w:bCs/>
-          <w:i w:val="false"/>
-          <w:iCs w:val="false"/>
-          <w:color w:val="244B9B"/>
-          <w:sz w:val="20"/>
-          <w:szCs w:val="20"/>
-        </w:rPr>
-        <w:t xml:space="preserve"> 试营业数据复盘</w:t>
-      </w:r>
-    </w:p>
-    <w:p>
-      <w:pPr>
-        <w:pStyle w:val="ListParagraph"/>
-        <w:numPr>
-          <w:ilvl w:val="0"/>
-          <w:numId w:val="2"/>
-        </w:numPr>
-        <w:spacing w:line="240" w:lineRule="exact"/>
-      </w:pPr>
-      <w:r>
-        <w:rPr>
-          <w:rFonts w:ascii="Times New Roman" w:cs="Times New Roman" w:eastAsia="Microsoft YaHei" w:hAnsi="Times New Roman"/>
-          <w:b/>
-          <w:bCs/>
-          <w:i w:val="false"/>
-          <w:iCs w:val="false"/>
-          <w:color w:val="151515"/>
-          <w:sz w:val="19"/>
-          <w:szCs w:val="19"/>
-        </w:rPr>
-        <w:t xml:space="preserve">现场诊断与方案：</w:t>
-      </w:r>
-      <w:r>
-        <w:rPr>
-          <w:rFonts w:ascii="Times New Roman" w:cs="Times New Roman" w:eastAsia="Microsoft YaHei" w:hAnsi="Times New Roman"/>
-          <w:b w:val="false"/>
-          <w:bCs w:val="false"/>
-          <w:i w:val="false"/>
-          <w:iCs w:val="false"/>
-          <w:color w:val="151515"/>
-          <w:sz w:val="19"/>
-          <w:szCs w:val="19"/>
-        </w:rPr>
-        <w:t xml:space="preserve">远程看现场视频、复尺定动线；开工前设许可、排风、电力、给排水 </w:t>
-      </w:r>
-      <w:r>
-        <w:rPr>
-          <w:rFonts w:ascii="Times New Roman" w:cs="Times New Roman" w:eastAsia="Microsoft YaHei" w:hAnsi="Times New Roman"/>
-          <w:b/>
-          <w:bCs/>
-          <w:i w:val="false"/>
-          <w:iCs w:val="false"/>
-          <w:color w:val="151515"/>
-          <w:sz w:val="19"/>
-          <w:szCs w:val="19"/>
-        </w:rPr>
-        <w:t xml:space="preserve">4 道核验门槛</w:t>
-      </w:r>
-      <w:r>
-        <w:rPr>
-          <w:rFonts w:ascii="Times New Roman" w:cs="Times New Roman" w:eastAsia="Microsoft YaHei" w:hAnsi="Times New Roman"/>
-          <w:b w:val="false"/>
-          <w:bCs w:val="false"/>
-          <w:i w:val="false"/>
-          <w:iCs w:val="false"/>
-          <w:color w:val="151515"/>
-          <w:sz w:val="19"/>
-          <w:szCs w:val="19"/>
-        </w:rPr>
-        <w:t xml:space="preserve">，导视按反馈迭代 </w:t>
-      </w:r>
-      <w:r>
-        <w:rPr>
-          <w:rFonts w:ascii="Times New Roman" w:cs="Times New Roman" w:eastAsia="Microsoft YaHei" w:hAnsi="Times New Roman"/>
-          <w:b/>
-          <w:bCs/>
-          <w:i w:val="false"/>
-          <w:iCs w:val="false"/>
-          <w:color w:val="151515"/>
-          <w:sz w:val="19"/>
-          <w:szCs w:val="19"/>
-        </w:rPr>
-        <w:t xml:space="preserve">6 版</w:t>
-      </w:r>
-      <w:r>
-        <w:rPr>
-          <w:rFonts w:ascii="Times New Roman" w:cs="Times New Roman" w:eastAsia="Microsoft YaHei" w:hAnsi="Times New Roman"/>
-          <w:b w:val="false"/>
-          <w:bCs w:val="false"/>
-          <w:i w:val="false"/>
-          <w:iCs w:val="false"/>
-          <w:color w:val="151515"/>
-          <w:sz w:val="19"/>
-          <w:szCs w:val="19"/>
-        </w:rPr>
-        <w:t xml:space="preserve">。</w:t>
-      </w:r>
-    </w:p>
-    <w:p>
-      <w:pPr>
-        <w:pStyle w:val="ListParagraph"/>
-        <w:numPr>
-          <w:ilvl w:val="0"/>
-          <w:numId w:val="2"/>
-        </w:numPr>
-        <w:spacing w:line="240" w:lineRule="exact"/>
-      </w:pPr>
-      <w:r>
-        <w:rPr>
-          <w:rFonts w:ascii="Times New Roman" w:cs="Times New Roman" w:eastAsia="Microsoft YaHei" w:hAnsi="Times New Roman"/>
-          <w:b/>
-          <w:bCs/>
-          <w:i w:val="false"/>
-          <w:iCs w:val="false"/>
-          <w:color w:val="151515"/>
-          <w:sz w:val="19"/>
-          <w:szCs w:val="19"/>
-        </w:rPr>
-        <w:t xml:space="preserve">落地与运营：</w:t>
-      </w:r>
-      <w:r>
-        <w:rPr>
-          <w:rFonts w:ascii="Times New Roman" w:cs="Times New Roman" w:eastAsia="Microsoft YaHei" w:hAnsi="Times New Roman"/>
-          <w:b w:val="false"/>
-          <w:bCs w:val="false"/>
-          <w:i w:val="false"/>
-          <w:iCs w:val="false"/>
-          <w:color w:val="151515"/>
-          <w:sz w:val="19"/>
-          <w:szCs w:val="19"/>
-        </w:rPr>
-        <w:t xml:space="preserve">制定三家同规格比价与施工</w:t>
-      </w:r>
-      <w:r>
-        <w:rPr>
-          <w:rFonts w:ascii="Times New Roman" w:cs="Times New Roman" w:eastAsia="Times New Roman" w:hAnsi="Times New Roman"/>
-          <w:b w:val="false"/>
-          <w:bCs w:val="false"/>
-          <w:i w:val="false"/>
-          <w:iCs w:val="false"/>
-          <w:color w:val="151515"/>
-          <w:sz w:val="19"/>
-          <w:szCs w:val="19"/>
-        </w:rPr>
-        <w:t xml:space="preserve">—</w:t>
-      </w:r>
-      <w:r>
-        <w:rPr>
-          <w:rFonts w:ascii="Times New Roman" w:cs="Times New Roman" w:eastAsia="Microsoft YaHei" w:hAnsi="Times New Roman"/>
-          <w:b w:val="false"/>
-          <w:bCs w:val="false"/>
-          <w:i w:val="false"/>
-          <w:iCs w:val="false"/>
-          <w:color w:val="151515"/>
-          <w:sz w:val="19"/>
-          <w:szCs w:val="19"/>
-        </w:rPr>
-        <w:t xml:space="preserve">联调</w:t>
-      </w:r>
-      <w:r>
-        <w:rPr>
-          <w:rFonts w:ascii="Times New Roman" w:cs="Times New Roman" w:eastAsia="Times New Roman" w:hAnsi="Times New Roman"/>
-          <w:b w:val="false"/>
-          <w:bCs w:val="false"/>
-          <w:i w:val="false"/>
-          <w:iCs w:val="false"/>
-          <w:color w:val="151515"/>
-          <w:sz w:val="19"/>
-          <w:szCs w:val="19"/>
-        </w:rPr>
-        <w:t xml:space="preserve">—</w:t>
-      </w:r>
-      <w:r>
-        <w:rPr>
-          <w:rFonts w:ascii="Times New Roman" w:cs="Times New Roman" w:eastAsia="Microsoft YaHei" w:hAnsi="Times New Roman"/>
-          <w:b w:val="false"/>
-          <w:bCs w:val="false"/>
-          <w:i w:val="false"/>
-          <w:iCs w:val="false"/>
-          <w:color w:val="151515"/>
-          <w:sz w:val="19"/>
-          <w:szCs w:val="19"/>
-        </w:rPr>
-        <w:t xml:space="preserve">热态测试计划；设计门店日报口径（SKU 销量、成本、报损、现金差异）。</w:t>
-      </w:r>
-    </w:p>
-    <w:p>
-      <w:pPr>
-        <w:shd w:fill="F2F3F5" w:color="auto" w:val="clear"/>
-        <w:tabs>
-          <w:tab w:val="right" w:pos="10652"/>
-        </w:tabs>
-        <w:spacing w:after="10" w:before="50" w:line="320" w:lineRule="exact"/>
-        <w:ind w:left="60" w:right="60"/>
-      </w:pPr>
-      <w:r>
-        <w:drawing>
-          <wp:inline distT="0" distB="0" distL="0" distR="0">
-            <wp:extent cx="152400" cy="133350"/>
-            <wp:effectExtent t="0" r="0" b="0" l="0"/>
-            <wp:docPr id="1" name="" descr="" title=""/>
-            <wp:cNvGraphicFramePr>
-              <a:graphicFrameLocks xmlns:a="http://schemas.openxmlformats.org/drawingml/2006/main" noChangeAspect="1"/>
-            </wp:cNvGraphicFramePr>
-            <a:graphic xmlns:a="http://schemas.openxmlformats.org/drawingml/2006/main">
-              <a:graphicData uri="http://schemas.openxmlformats.org/drawingml/2006/picture">
-                <pic:pic xmlns:pic="http://schemas.openxmlformats.org/drawingml/2006/picture">
-                  <pic:nvPicPr>
-                    <pic:cNvPr id="0" name="" descr=""/>
-                    <pic:cNvPicPr>
-                      <a:picLocks noChangeAspect="1" noChangeArrowheads="1"/>
-                    </pic:cNvPicPr>
-                  </pic:nvPicPr>
-                  <pic:blipFill>
-                    <a:blip r:embed="rId22" cstate="none"/>
-                    <a:srcRect/>
-                    <a:stretch>
-                      <a:fillRect/>
-                    </a:stretch>
-                  </pic:blipFill>
-                  <pic:spPr bwMode="auto">
-                    <a:xfrm>
-                      <a:off x="0" y="0"/>
                       <a:ext cx="152400" cy="133350"/>
                     </a:xfrm>
                     <a:prstGeom prst="rect">
@@ -4808,7 +4228,7 @@
         </w:rPr>
         <w:t xml:space="preserve">	</w:t>
       </w:r>
-      <w:hyperlink w:history="1" r:id="rIdk_yahqxhdy0t76b7xrwrq">
+      <w:hyperlink w:history="1" r:id="rIdoutkcddgers6ue78nfydu">
         <w:r>
           <w:rPr>
             <w:rFonts w:ascii="Times New Roman" w:cs="Times New Roman" w:eastAsia="Microsoft YaHei" w:hAnsi="Times New Roman"/>
@@ -5118,6 +4538,586 @@
           <w:szCs w:val="19"/>
         </w:rPr>
         <w:t xml:space="preserve">，客户含安踏、李宁。</w:t>
+      </w:r>
+    </w:p>
+    <w:p>
+      <w:pPr>
+        <w:shd w:fill="F2F3F5" w:color="auto" w:val="clear"/>
+        <w:tabs>
+          <w:tab w:val="right" w:pos="10652"/>
+        </w:tabs>
+        <w:spacing w:after="10" w:before="50" w:line="320" w:lineRule="exact"/>
+        <w:ind w:left="60" w:right="60"/>
+      </w:pPr>
+      <w:r>
+        <w:drawing>
+          <wp:inline distT="0" distB="0" distL="0" distR="0">
+            <wp:extent cx="152400" cy="152400"/>
+            <wp:effectExtent t="0" r="0" b="0" l="0"/>
+            <wp:docPr id="1" name="" descr="" title=""/>
+            <wp:cNvGraphicFramePr>
+              <a:graphicFrameLocks xmlns:a="http://schemas.openxmlformats.org/drawingml/2006/main" noChangeAspect="1"/>
+            </wp:cNvGraphicFramePr>
+            <a:graphic xmlns:a="http://schemas.openxmlformats.org/drawingml/2006/main">
+              <a:graphicData uri="http://schemas.openxmlformats.org/drawingml/2006/picture">
+                <pic:pic xmlns:pic="http://schemas.openxmlformats.org/drawingml/2006/picture">
+                  <pic:nvPicPr>
+                    <pic:cNvPr id="0" name="" descr=""/>
+                    <pic:cNvPicPr>
+                      <a:picLocks noChangeAspect="1" noChangeArrowheads="1"/>
+                    </pic:cNvPicPr>
+                  </pic:nvPicPr>
+                  <pic:blipFill>
+                    <a:blip r:embed="rId22" cstate="none"/>
+                    <a:srcRect/>
+                    <a:stretch>
+                      <a:fillRect/>
+                    </a:stretch>
+                  </pic:blipFill>
+                  <pic:spPr bwMode="auto">
+                    <a:xfrm>
+                      <a:off x="0" y="0"/>
+                      <a:ext cx="152400" cy="152400"/>
+                    </a:xfrm>
+                    <a:prstGeom prst="rect">
+                      <a:avLst/>
+                    </a:prstGeom>
+                  </pic:spPr>
+                </pic:pic>
+              </a:graphicData>
+            </a:graphic>
+          </wp:inline>
+        </w:drawing>
+      </w:r>
+      <w:r>
+        <w:rPr>
+          <w:sz w:val="20"/>
+          <w:szCs w:val="20"/>
+        </w:rPr>
+        <w:t xml:space="preserve">  </w:t>
+      </w:r>
+      <w:r>
+        <w:rPr>
+          <w:rFonts w:ascii="Times New Roman" w:cs="Times New Roman" w:eastAsia="Microsoft YaHei" w:hAnsi="Times New Roman"/>
+          <w:b/>
+          <w:bCs/>
+          <w:i w:val="false"/>
+          <w:iCs w:val="false"/>
+          <w:color w:val="151515"/>
+          <w:sz w:val="20"/>
+          <w:szCs w:val="20"/>
+        </w:rPr>
+        <w:t xml:space="preserve">Hengqin Industrial Asset Revitalization</w:t>
+      </w:r>
+      <w:r>
+        <w:rPr>
+          <w:rFonts w:ascii="Times New Roman" w:cs="Times New Roman" w:eastAsia="Microsoft YaHei" w:hAnsi="Times New Roman"/>
+          <w:b w:val="false"/>
+          <w:bCs w:val="false"/>
+          <w:i w:val="false"/>
+          <w:iCs w:val="false"/>
+          <w:color w:val="151515"/>
+          <w:sz w:val="20"/>
+          <w:szCs w:val="20"/>
+        </w:rPr>
+        <w:t xml:space="preserve">  </w:t>
+      </w:r>
+      <w:r>
+        <w:rPr>
+          <w:rFonts w:ascii="Times New Roman" w:cs="Times New Roman" w:eastAsia="Times New Roman" w:hAnsi="Times New Roman"/>
+          <w:b w:val="false"/>
+          <w:bCs w:val="false"/>
+          <w:i w:val="false"/>
+          <w:iCs w:val="false"/>
+          <w:color w:val="151515"/>
+          <w:sz w:val="20"/>
+          <w:szCs w:val="20"/>
+        </w:rPr>
+        <w:t xml:space="preserve">·</w:t>
+      </w:r>
+      <w:r>
+        <w:rPr>
+          <w:rFonts w:ascii="Times New Roman" w:cs="Times New Roman" w:eastAsia="Microsoft YaHei" w:hAnsi="Times New Roman"/>
+          <w:b w:val="false"/>
+          <w:bCs w:val="false"/>
+          <w:i w:val="false"/>
+          <w:iCs w:val="false"/>
+          <w:color w:val="151515"/>
+          <w:sz w:val="20"/>
+          <w:szCs w:val="20"/>
+        </w:rPr>
+        <w:t xml:space="preserve">  </w:t>
+      </w:r>
+      <w:r>
+        <w:rPr>
+          <w:rFonts w:ascii="Times New Roman" w:cs="Times New Roman" w:eastAsia="Microsoft YaHei" w:hAnsi="Times New Roman"/>
+          <w:b/>
+          <w:bCs/>
+          <w:i w:val="false"/>
+          <w:iCs w:val="false"/>
+          <w:color w:val="151515"/>
+          <w:sz w:val="20"/>
+          <w:szCs w:val="20"/>
+        </w:rPr>
+        <w:t xml:space="preserve">Solution Lead</w:t>
+      </w:r>
+      <w:r>
+        <w:rPr>
+          <w:sz w:val="20"/>
+          <w:szCs w:val="20"/>
+        </w:rPr>
+        <w:t xml:space="preserve">	</w:t>
+      </w:r>
+      <w:r>
+        <w:rPr>
+          <w:rFonts w:ascii="Times New Roman" w:cs="Times New Roman" w:eastAsia="Microsoft YaHei" w:hAnsi="Times New Roman"/>
+          <w:b/>
+          <w:bCs/>
+          <w:i w:val="false"/>
+          <w:iCs w:val="false"/>
+          <w:color w:val="151515"/>
+          <w:sz w:val="19"/>
+          <w:szCs w:val="19"/>
+        </w:rPr>
+        <w:t xml:space="preserve">2021 </w:t>
+      </w:r>
+      <w:r>
+        <w:rPr>
+          <w:rFonts w:ascii="Times New Roman" w:cs="Times New Roman" w:eastAsia="Times New Roman" w:hAnsi="Times New Roman"/>
+          <w:b/>
+          <w:bCs/>
+          <w:i w:val="false"/>
+          <w:iCs w:val="false"/>
+          <w:color w:val="151515"/>
+          <w:sz w:val="19"/>
+          <w:szCs w:val="19"/>
+        </w:rPr>
+        <w:t xml:space="preserve">–</w:t>
+      </w:r>
+      <w:r>
+        <w:rPr>
+          <w:rFonts w:ascii="Times New Roman" w:cs="Times New Roman" w:eastAsia="Microsoft YaHei" w:hAnsi="Times New Roman"/>
+          <w:b/>
+          <w:bCs/>
+          <w:i w:val="false"/>
+          <w:iCs w:val="false"/>
+          <w:color w:val="151515"/>
+          <w:sz w:val="19"/>
+          <w:szCs w:val="19"/>
+        </w:rPr>
+        <w:t xml:space="preserve"> 至今</w:t>
+      </w:r>
+    </w:p>
+    <w:p>
+      <w:pPr>
+        <w:spacing w:before="20" w:line="252" w:lineRule="exact"/>
+      </w:pPr>
+      <w:r>
+        <w:rPr>
+          <w:rFonts w:ascii="Times New Roman" w:cs="Times New Roman" w:eastAsia="Microsoft YaHei" w:hAnsi="Times New Roman"/>
+          <w:b/>
+          <w:bCs/>
+          <w:i w:val="false"/>
+          <w:iCs w:val="false"/>
+          <w:color w:val="244B9B"/>
+          <w:sz w:val="20"/>
+          <w:szCs w:val="20"/>
+        </w:rPr>
+        <w:t xml:space="preserve">产业资产盘活方案</w:t>
+      </w:r>
+      <w:r>
+        <w:rPr>
+          <w:rFonts w:ascii="Times New Roman" w:cs="Times New Roman" w:eastAsia="Microsoft YaHei" w:hAnsi="Times New Roman"/>
+          <w:b/>
+          <w:bCs/>
+          <w:i w:val="false"/>
+          <w:iCs w:val="false"/>
+          <w:color w:val="244B9B"/>
+          <w:sz w:val="20"/>
+          <w:szCs w:val="20"/>
+        </w:rPr>
+        <w:t xml:space="preserve">  |  </w:t>
+      </w:r>
+      <w:r>
+        <w:rPr>
+          <w:rFonts w:ascii="Times New Roman" w:cs="Times New Roman" w:eastAsia="Microsoft YaHei" w:hAnsi="Times New Roman"/>
+          <w:b/>
+          <w:bCs/>
+          <w:i w:val="false"/>
+          <w:iCs w:val="false"/>
+          <w:color w:val="244B9B"/>
+          <w:sz w:val="20"/>
+          <w:szCs w:val="20"/>
+        </w:rPr>
+        <w:t xml:space="preserve">需求澄清 </w:t>
+      </w:r>
+      <w:r>
+        <w:rPr>
+          <w:rFonts w:ascii="Times New Roman" w:cs="Times New Roman" w:eastAsia="Times New Roman" w:hAnsi="Times New Roman"/>
+          <w:b/>
+          <w:bCs/>
+          <w:i w:val="false"/>
+          <w:iCs w:val="false"/>
+          <w:color w:val="244B9B"/>
+          <w:sz w:val="20"/>
+          <w:szCs w:val="20"/>
+        </w:rPr>
+        <w:t xml:space="preserve">→</w:t>
+      </w:r>
+      <w:r>
+        <w:rPr>
+          <w:rFonts w:ascii="Times New Roman" w:cs="Times New Roman" w:eastAsia="Microsoft YaHei" w:hAnsi="Times New Roman"/>
+          <w:b/>
+          <w:bCs/>
+          <w:i w:val="false"/>
+          <w:iCs w:val="false"/>
+          <w:color w:val="244B9B"/>
+          <w:sz w:val="20"/>
+          <w:szCs w:val="20"/>
+        </w:rPr>
+        <w:t xml:space="preserve"> 证据建模 </w:t>
+      </w:r>
+      <w:r>
+        <w:rPr>
+          <w:rFonts w:ascii="Times New Roman" w:cs="Times New Roman" w:eastAsia="Times New Roman" w:hAnsi="Times New Roman"/>
+          <w:b/>
+          <w:bCs/>
+          <w:i w:val="false"/>
+          <w:iCs w:val="false"/>
+          <w:color w:val="244B9B"/>
+          <w:sz w:val="20"/>
+          <w:szCs w:val="20"/>
+        </w:rPr>
+        <w:t xml:space="preserve">→</w:t>
+      </w:r>
+      <w:r>
+        <w:rPr>
+          <w:rFonts w:ascii="Times New Roman" w:cs="Times New Roman" w:eastAsia="Microsoft YaHei" w:hAnsi="Times New Roman"/>
+          <w:b/>
+          <w:bCs/>
+          <w:i w:val="false"/>
+          <w:iCs w:val="false"/>
+          <w:color w:val="244B9B"/>
+          <w:sz w:val="20"/>
+          <w:szCs w:val="20"/>
+        </w:rPr>
+        <w:t xml:space="preserve"> 路径比选 </w:t>
+      </w:r>
+      <w:r>
+        <w:rPr>
+          <w:rFonts w:ascii="Times New Roman" w:cs="Times New Roman" w:eastAsia="Times New Roman" w:hAnsi="Times New Roman"/>
+          <w:b/>
+          <w:bCs/>
+          <w:i w:val="false"/>
+          <w:iCs w:val="false"/>
+          <w:color w:val="244B9B"/>
+          <w:sz w:val="20"/>
+          <w:szCs w:val="20"/>
+        </w:rPr>
+        <w:t xml:space="preserve">→</w:t>
+      </w:r>
+      <w:r>
+        <w:rPr>
+          <w:rFonts w:ascii="Times New Roman" w:cs="Times New Roman" w:eastAsia="Microsoft YaHei" w:hAnsi="Times New Roman"/>
+          <w:b/>
+          <w:bCs/>
+          <w:i w:val="false"/>
+          <w:iCs w:val="false"/>
+          <w:color w:val="244B9B"/>
+          <w:sz w:val="20"/>
+          <w:szCs w:val="20"/>
+        </w:rPr>
+        <w:t xml:space="preserve"> 推进落地</w:t>
+      </w:r>
+    </w:p>
+    <w:p>
+      <w:pPr>
+        <w:pStyle w:val="ListParagraph"/>
+        <w:numPr>
+          <w:ilvl w:val="0"/>
+          <w:numId w:val="2"/>
+        </w:numPr>
+        <w:spacing w:line="240" w:lineRule="exact"/>
+      </w:pPr>
+      <w:r>
+        <w:rPr>
+          <w:rFonts w:ascii="Times New Roman" w:cs="Times New Roman" w:eastAsia="Microsoft YaHei" w:hAnsi="Times New Roman"/>
+          <w:b/>
+          <w:bCs/>
+          <w:i w:val="false"/>
+          <w:iCs w:val="false"/>
+          <w:color w:val="151515"/>
+          <w:sz w:val="19"/>
+          <w:szCs w:val="19"/>
+        </w:rPr>
+        <w:t xml:space="preserve">背景与目标：</w:t>
+      </w:r>
+      <w:r>
+        <w:rPr>
+          <w:rFonts w:ascii="Times New Roman" w:cs="Times New Roman" w:eastAsia="Microsoft YaHei" w:hAnsi="Times New Roman"/>
+          <w:b w:val="false"/>
+          <w:bCs w:val="false"/>
+          <w:i w:val="false"/>
+          <w:iCs w:val="false"/>
+          <w:color w:val="151515"/>
+          <w:sz w:val="19"/>
+          <w:szCs w:val="19"/>
+        </w:rPr>
+        <w:t xml:space="preserve">约 </w:t>
+      </w:r>
+      <w:r>
+        <w:rPr>
+          <w:rFonts w:ascii="Times New Roman" w:cs="Times New Roman" w:eastAsia="Microsoft YaHei" w:hAnsi="Times New Roman"/>
+          <w:b/>
+          <w:bCs/>
+          <w:i w:val="false"/>
+          <w:iCs w:val="false"/>
+          <w:color w:val="151515"/>
+          <w:sz w:val="19"/>
+          <w:szCs w:val="19"/>
+        </w:rPr>
+        <w:t xml:space="preserve">26,500㎡</w:t>
+      </w:r>
+      <w:r>
+        <w:rPr>
+          <w:rFonts w:ascii="Times New Roman" w:cs="Times New Roman" w:eastAsia="Microsoft YaHei" w:hAnsi="Times New Roman"/>
+          <w:b w:val="false"/>
+          <w:bCs w:val="false"/>
+          <w:i w:val="false"/>
+          <w:iCs w:val="false"/>
+          <w:color w:val="151515"/>
+          <w:sz w:val="19"/>
+          <w:szCs w:val="19"/>
+        </w:rPr>
+        <w:t xml:space="preserve"> 产业厂房年租金约 </w:t>
+      </w:r>
+      <w:r>
+        <w:rPr>
+          <w:rFonts w:ascii="Times New Roman" w:cs="Times New Roman" w:eastAsia="Microsoft YaHei" w:hAnsi="Times New Roman"/>
+          <w:b/>
+          <w:bCs/>
+          <w:i w:val="false"/>
+          <w:iCs w:val="false"/>
+          <w:color w:val="151515"/>
+          <w:sz w:val="19"/>
+          <w:szCs w:val="19"/>
+        </w:rPr>
+        <w:t xml:space="preserve">700</w:t>
+      </w:r>
+      <w:r>
+        <w:rPr>
+          <w:rFonts w:ascii="Times New Roman" w:cs="Times New Roman" w:eastAsia="Times New Roman" w:hAnsi="Times New Roman"/>
+          <w:b/>
+          <w:bCs/>
+          <w:i w:val="false"/>
+          <w:iCs w:val="false"/>
+          <w:color w:val="151515"/>
+          <w:sz w:val="19"/>
+          <w:szCs w:val="19"/>
+        </w:rPr>
+        <w:t xml:space="preserve">–</w:t>
+      </w:r>
+      <w:r>
+        <w:rPr>
+          <w:rFonts w:ascii="Times New Roman" w:cs="Times New Roman" w:eastAsia="Microsoft YaHei" w:hAnsi="Times New Roman"/>
+          <w:b/>
+          <w:bCs/>
+          <w:i w:val="false"/>
+          <w:iCs w:val="false"/>
+          <w:color w:val="151515"/>
+          <w:sz w:val="19"/>
+          <w:szCs w:val="19"/>
+        </w:rPr>
+        <w:t xml:space="preserve">800 万元</w:t>
+      </w:r>
+      <w:r>
+        <w:rPr>
+          <w:rFonts w:ascii="Times New Roman" w:cs="Times New Roman" w:eastAsia="Microsoft YaHei" w:hAnsi="Times New Roman"/>
+          <w:b w:val="false"/>
+          <w:bCs w:val="false"/>
+          <w:i w:val="false"/>
+          <w:iCs w:val="false"/>
+          <w:color w:val="151515"/>
+          <w:sz w:val="19"/>
+          <w:szCs w:val="19"/>
+        </w:rPr>
+        <w:t xml:space="preserve">，但权属材料分散、历史出资与签约主体不一致，</w:t>
+      </w:r>
+      <w:r>
+        <w:rPr>
+          <w:rFonts w:ascii="Times New Roman" w:cs="Times New Roman" w:eastAsia="Times New Roman" w:hAnsi="Times New Roman"/>
+          <w:b w:val="false"/>
+          <w:bCs w:val="false"/>
+          <w:i w:val="false"/>
+          <w:iCs w:val="false"/>
+          <w:color w:val="151515"/>
+          <w:sz w:val="19"/>
+          <w:szCs w:val="19"/>
+        </w:rPr>
+        <w:t xml:space="preserve">“</w:t>
+      </w:r>
+      <w:r>
+        <w:rPr>
+          <w:rFonts w:ascii="Times New Roman" w:cs="Times New Roman" w:eastAsia="Microsoft YaHei" w:hAnsi="Times New Roman"/>
+          <w:b w:val="false"/>
+          <w:bCs w:val="false"/>
+          <w:i w:val="false"/>
+          <w:iCs w:val="false"/>
+          <w:color w:val="151515"/>
+          <w:sz w:val="19"/>
+          <w:szCs w:val="19"/>
+        </w:rPr>
+        <w:t xml:space="preserve">继续运营还是出售</w:t>
+      </w:r>
+      <w:r>
+        <w:rPr>
+          <w:rFonts w:ascii="Times New Roman" w:cs="Times New Roman" w:eastAsia="Times New Roman" w:hAnsi="Times New Roman"/>
+          <w:b w:val="false"/>
+          <w:bCs w:val="false"/>
+          <w:i w:val="false"/>
+          <w:iCs w:val="false"/>
+          <w:color w:val="151515"/>
+          <w:sz w:val="19"/>
+          <w:szCs w:val="19"/>
+        </w:rPr>
+        <w:t xml:space="preserve">”</w:t>
+      </w:r>
+      <w:r>
+        <w:rPr>
+          <w:rFonts w:ascii="Times New Roman" w:cs="Times New Roman" w:eastAsia="Microsoft YaHei" w:hAnsi="Times New Roman"/>
+          <w:b w:val="false"/>
+          <w:bCs w:val="false"/>
+          <w:i w:val="false"/>
+          <w:iCs w:val="false"/>
+          <w:color w:val="151515"/>
+          <w:sz w:val="19"/>
+          <w:szCs w:val="19"/>
+        </w:rPr>
+        <w:t xml:space="preserve">长期悬而未决；目标是形成可执行的盘活方案。</w:t>
+      </w:r>
+    </w:p>
+    <w:p>
+      <w:pPr>
+        <w:pStyle w:val="ListParagraph"/>
+        <w:numPr>
+          <w:ilvl w:val="0"/>
+          <w:numId w:val="2"/>
+        </w:numPr>
+        <w:spacing w:line="240" w:lineRule="exact"/>
+      </w:pPr>
+      <w:r>
+        <w:rPr>
+          <w:rFonts w:ascii="Times New Roman" w:cs="Times New Roman" w:eastAsia="Microsoft YaHei" w:hAnsi="Times New Roman"/>
+          <w:b/>
+          <w:bCs/>
+          <w:i w:val="false"/>
+          <w:iCs w:val="false"/>
+          <w:color w:val="151515"/>
+          <w:sz w:val="19"/>
+          <w:szCs w:val="19"/>
+        </w:rPr>
+        <w:t xml:space="preserve">我的职责：</w:t>
+      </w:r>
+      <w:r>
+        <w:rPr>
+          <w:rFonts w:ascii="Times New Roman" w:cs="Times New Roman" w:eastAsia="Microsoft YaHei" w:hAnsi="Times New Roman"/>
+          <w:b w:val="false"/>
+          <w:bCs w:val="false"/>
+          <w:i w:val="false"/>
+          <w:iCs w:val="false"/>
+          <w:color w:val="151515"/>
+          <w:sz w:val="19"/>
+          <w:szCs w:val="19"/>
+        </w:rPr>
+        <w:t xml:space="preserve">对接合作方、村集体、租户及律师/会计师，梳理运营与决策流程、绘制相关方关系图；整合合作建房协议、出资流水与工程付款，建立</w:t>
+      </w:r>
+      <w:r>
+        <w:rPr>
+          <w:rFonts w:ascii="Times New Roman" w:cs="Times New Roman" w:eastAsia="Microsoft YaHei" w:hAnsi="Times New Roman"/>
+          <w:b/>
+          <w:bCs/>
+          <w:i w:val="false"/>
+          <w:iCs w:val="false"/>
+          <w:color w:val="151515"/>
+          <w:sz w:val="19"/>
+          <w:szCs w:val="19"/>
+        </w:rPr>
+        <w:t xml:space="preserve">证据台账与缺口清单</w:t>
+      </w:r>
+      <w:r>
+        <w:rPr>
+          <w:rFonts w:ascii="Times New Roman" w:cs="Times New Roman" w:eastAsia="Microsoft YaHei" w:hAnsi="Times New Roman"/>
+          <w:b w:val="false"/>
+          <w:bCs w:val="false"/>
+          <w:i w:val="false"/>
+          <w:iCs w:val="false"/>
+          <w:color w:val="151515"/>
+          <w:sz w:val="19"/>
+          <w:szCs w:val="19"/>
+        </w:rPr>
+        <w:t xml:space="preserve">。</w:t>
+      </w:r>
+    </w:p>
+    <w:p>
+      <w:pPr>
+        <w:pStyle w:val="ListParagraph"/>
+        <w:numPr>
+          <w:ilvl w:val="0"/>
+          <w:numId w:val="2"/>
+        </w:numPr>
+        <w:spacing w:line="240" w:lineRule="exact"/>
+      </w:pPr>
+      <w:r>
+        <w:rPr>
+          <w:rFonts w:ascii="Times New Roman" w:cs="Times New Roman" w:eastAsia="Microsoft YaHei" w:hAnsi="Times New Roman"/>
+          <w:b/>
+          <w:bCs/>
+          <w:i w:val="false"/>
+          <w:iCs w:val="false"/>
+          <w:color w:val="151515"/>
+          <w:sz w:val="19"/>
+          <w:szCs w:val="19"/>
+        </w:rPr>
+        <w:t xml:space="preserve">交付与结果：</w:t>
+      </w:r>
+      <w:r>
+        <w:rPr>
+          <w:rFonts w:ascii="Times New Roman" w:cs="Times New Roman" w:eastAsia="Microsoft YaHei" w:hAnsi="Times New Roman"/>
+          <w:b w:val="false"/>
+          <w:bCs w:val="false"/>
+          <w:i w:val="false"/>
+          <w:iCs w:val="false"/>
+          <w:color w:val="151515"/>
+          <w:sz w:val="19"/>
+          <w:szCs w:val="19"/>
+        </w:rPr>
+        <w:t xml:space="preserve">搭建持有运营、主体重组、整体出售三条路径的</w:t>
+      </w:r>
+      <w:r>
+        <w:rPr>
+          <w:rFonts w:ascii="Times New Roman" w:cs="Times New Roman" w:eastAsia="Microsoft YaHei" w:hAnsi="Times New Roman"/>
+          <w:b/>
+          <w:bCs/>
+          <w:i w:val="false"/>
+          <w:iCs w:val="false"/>
+          <w:color w:val="151515"/>
+          <w:sz w:val="19"/>
+          <w:szCs w:val="19"/>
+        </w:rPr>
+        <w:t xml:space="preserve">决策模型</w:t>
+      </w:r>
+      <w:r>
+        <w:rPr>
+          <w:rFonts w:ascii="Times New Roman" w:cs="Times New Roman" w:eastAsia="Microsoft YaHei" w:hAnsi="Times New Roman"/>
+          <w:b w:val="false"/>
+          <w:bCs w:val="false"/>
+          <w:i w:val="false"/>
+          <w:iCs w:val="false"/>
+          <w:color w:val="151515"/>
+          <w:sz w:val="19"/>
+          <w:szCs w:val="19"/>
+        </w:rPr>
+        <w:t xml:space="preserve">（现金流、风险、周期），把法律与财务意见拆成 30/60/90 天任务路线，推动项目从停滞进入材料补全与交易准备。</w:t>
       </w:r>
     </w:p>
     <w:p>

</xml_diff>